<commit_message>
feat: add Activity 2 compilation assets and output documents, and update build script to sync auxiliary files
</commit_message>
<xml_diff>
--- a/Entregas/Actividad 2/TP2_Ayarachi_Fuentes.docx
+++ b/Entregas/Actividad 2/TP2_Ayarachi_Fuentes.docx
@@ -870,6 +870,33 @@
       </w:r>
     </w:p>
     <w:p>
+      <w:pPr>
+        <w:pStyle w:val="TOC1"/>
+        <w:tabs>
+          <w:tab w:val="right" w:leader="dot" w:pos="9026"/>
+        </w:tabs>
+        <w:ind w:left="0"/>
+        <w:spacing w:after="60"/>
+      </w:pPr>
+      <w:r>
+        <w:rPr>
+          <w:rFonts w:ascii="Arial" w:hAnsi="Arial"/>
+          <w:sz w:val="22"/>
+        </w:rPr>
+        <w:t>Bibliografía</w:t>
+      </w:r>
+      <w:r>
+        <w:tab/>
+      </w:r>
+      <w:r>
+        <w:rPr>
+          <w:rFonts w:ascii="Arial" w:hAnsi="Arial"/>
+          <w:sz w:val="22"/>
+        </w:rPr>
+        <w:t>10</w:t>
+      </w:r>
+    </w:p>
+    <w:p>
       <w:r>
         <w:fldChar w:fldCharType="end"/>
       </w:r>
@@ -962,7 +989,25 @@
         <w:t xml:space="preserve">Gestión de Recursos Humanos</w:t>
       </w:r>
       <w:r>
-        <w:t xml:space="preserve">. Su abordaje responde a los desafíos actuales de modernización institucional y desarrollo de capacidades estatales en el sector público (Oszlak, 2020). Conforme a las pautas del Seminario de Integración y Aplicación (SIA) y a los criterios del Reglamento de Trabajo Final de Graduación (Universidad Nacional del Comahue - CURZAS, 2023), el tema se delimita mediante el criterio de</w:t>
+        <w:t xml:space="preserve">. Su abordaje responde a los desafíos actuales de modernización institucional y desarrollo de capacidades estatales en el sector público</w:t>
+      </w:r>
+      <w:r>
+        <w:t xml:space="preserve"> </w:t>
+      </w:r>
+      <w:r>
+        <w:t xml:space="preserve">(Oszlak, 2020)</w:t>
+      </w:r>
+      <w:r>
+        <w:t xml:space="preserve">. Conforme a las pautas del Seminario de Integración y Aplicación (SIA) y a los criterios del Reglamento de Trabajo Final de Graduación</w:t>
+      </w:r>
+      <w:r>
+        <w:t xml:space="preserve"> </w:t>
+      </w:r>
+      <w:r>
+        <w:t xml:space="preserve">(Universidad Nacional del Comahue - CURZAS, 2023)</w:t>
+      </w:r>
+      <w:r>
+        <w:t xml:space="preserve">, el tema se delimita mediante el criterio de</w:t>
       </w:r>
       <w:r>
         <w:t xml:space="preserve"> </w:t>
@@ -974,7 +1019,10 @@
         <w:t xml:space="preserve"> </w:t>
       </w:r>
       <w:r>
-        <w:t xml:space="preserve">(Sautu, 2005), transitando desde el macrosistema de gestión pública hasta el análisis empírico de un problema situado en el ámbito universitario regional.</w:t>
+        <w:t xml:space="preserve">(Sautu, 2005)</w:t>
+      </w:r>
+      <w:r>
+        <w:t xml:space="preserve">, transitando desde el macrosistema de gestión pública hasta el análisis empírico de un problema situado en el ámbito universitario regional.</w:t>
       </w:r>
     </w:p>
     <w:p>
@@ -1008,7 +1056,21 @@
           <w:b/>
           <w:bCs/>
         </w:rPr>
-        <w:t xml:space="preserve">Francisco Longo (2006)</w:t>
+        <w:t xml:space="preserve">Francisco</w:t>
+      </w:r>
+      <w:r>
+        <w:rPr>
+          <w:b/>
+          <w:bCs/>
+        </w:rPr>
+        <w:t xml:space="preserve"> </w:t>
+      </w:r>
+      <w:r>
+        <w:rPr>
+          <w:b/>
+          <w:bCs/>
+        </w:rPr>
+        <w:t xml:space="preserve">Longo (2006)</w:t>
       </w:r>
       <w:r>
         <w:t xml:space="preserve">. Este modelo concibe la administración de personas como un sistema articulado con la estrategia institucional y compuesto por subsistemas interdependientes:</w:t>
@@ -1079,7 +1141,28 @@
           <w:i/>
           <w:iCs/>
         </w:rPr>
-        <w:t xml:space="preserve">Subsistemas de la Gestión de Recursos Humanos en el Sector Público (Longo, 2006).</w:t>
+        <w:t xml:space="preserve">Subsistemas de la Gestión de Recursos Humanos en el Sector Público</w:t>
+      </w:r>
+      <w:r>
+        <w:rPr>
+          <w:i/>
+          <w:iCs/>
+        </w:rPr>
+        <w:t xml:space="preserve"> </w:t>
+      </w:r>
+      <w:r>
+        <w:rPr>
+          <w:i/>
+          <w:iCs/>
+        </w:rPr>
+        <w:t xml:space="preserve">(Longo, 2006)</w:t>
+      </w:r>
+      <w:r>
+        <w:rPr>
+          <w:i/>
+          <w:iCs/>
+        </w:rPr>
+        <w:t xml:space="preserve">.</w:t>
       </w:r>
     </w:p>
     <w:p>
@@ -1156,7 +1239,19 @@
         <w:pStyle w:val="BodyText"/>
       </w:pPr>
       <w:r>
-        <w:t xml:space="preserve">El propósito central es indagar si la evaluación docente puede superar la lógica tradicional de control formal o punitivo (Chiavenato, 2020) para orientarse hacia un enfoque formativo de aprendizaje continuo. Para ello, se analiza la factibilidad de un modelo de</w:t>
+        <w:t xml:space="preserve">El propósito central es indagar si la evaluación docente puede superar la lógica tradicional de control formal o punitivo</w:t>
+      </w:r>
+      <w:r>
+        <w:t xml:space="preserve"> </w:t>
+      </w:r>
+      <w:r>
+        <w:t xml:space="preserve">(Chiavenato, 2020)</w:t>
+      </w:r>
+      <w:r>
+        <w:t xml:space="preserve"> </w:t>
+      </w:r>
+      <w:r>
+        <w:t xml:space="preserve">para orientarse hacia un enfoque formativo de aprendizaje continuo. Para ello, se analiza la factibilidad de un modelo de</w:t>
       </w:r>
       <w:r>
         <w:t xml:space="preserve"> </w:t>
@@ -1169,7 +1264,16 @@
         <w:t xml:space="preserve">retroalimentación 360 grados</w:t>
       </w:r>
       <w:r>
-        <w:t xml:space="preserve">, que articula diversas miradas sobre la labor docente: autoevaluación, valoración de pares disciplinares, apreciación de los estudiantes y seguimiento de directores departamentales (Dalmau et al., 2017; Lepsinger &amp; Lucia, 2009).</w:t>
+        <w:t xml:space="preserve">, que articula diversas miradas sobre la labor docente: autoevaluación, valoración de pares disciplinares, apreciación de los estudiantes y seguimiento de directores departamentales</w:t>
+      </w:r>
+      <w:r>
+        <w:t xml:space="preserve"> </w:t>
+      </w:r>
+      <w:r>
+        <w:t xml:space="preserve">(Dalmau et al., 2017; Lepsinger &amp; Lucia, 2009)</w:t>
+      </w:r>
+      <w:r>
+        <w:t xml:space="preserve">.</w:t>
       </w:r>
     </w:p>
     <w:bookmarkEnd w:id="16"/>
@@ -1216,7 +1320,19 @@
         <w:t xml:space="preserve"> </w:t>
       </w:r>
       <w:r>
-        <w:t xml:space="preserve">en la ciudad de Viedma, capital de Río Negro. A nivel histórico y regulatorio, la Ley N° 24.521 de Educación Superior (Ministerio de Educación, 1995) fijó el mandato de que las universidades nacionales incorporen mecanismos periódicos de autoevaluación y aseguramiento de la calidad en sus tareas de docencia, investigación y extensión.</w:t>
+        <w:t xml:space="preserve">en la ciudad de Viedma, capital de Río Negro. A nivel histórico y regulatorio, la Ley N° 24.521 de Educación Superior</w:t>
+      </w:r>
+      <w:r>
+        <w:t xml:space="preserve"> </w:t>
+      </w:r>
+      <w:r>
+        <w:t xml:space="preserve">(Ley N° 24.521 de Educación Superior, 1995)</w:t>
+      </w:r>
+      <w:r>
+        <w:t xml:space="preserve"> </w:t>
+      </w:r>
+      <w:r>
+        <w:t xml:space="preserve">fijó el mandato de que las universidades nacionales incorporen mecanismos periódicos de autoevaluación y aseguramiento de la calidad en sus tareas de docencia, investigación y extensión.</w:t>
       </w:r>
     </w:p>
     <w:p>
@@ -1272,7 +1388,37 @@
         <w:pStyle w:val="BodyText"/>
       </w:pPr>
       <w:r>
-        <w:t xml:space="preserve">En el plano normativo, la actividad docente en el CURZAS se encuentra reglada por el Estatuto de la UNCo (Ordenanza N° 470/2009 y sus modificatorias), el Reglamento de Carrera Docente (Ordenanza N° 0920/2019 y sus normas complementarias) y el Convenio Colectivo de Trabajo Docente homologado por Decreto N° 1246/2015 (Poder Ejecutivo Nacional, 2015). Estos instrumentos fijan mecanismos periódicos de evaluación con fines de permanencia y promoción, que incluyen informes de labor académica, dictámenes de pares y encuestas estudiantiles de fin de cuatrimestre.</w:t>
+        <w:t xml:space="preserve">En el plano normativo, la actividad docente en el CURZAS se encuentra reglada por el Estatuto de la UNCo</w:t>
+      </w:r>
+      <w:r>
+        <w:t xml:space="preserve"> </w:t>
+      </w:r>
+      <w:r>
+        <w:t xml:space="preserve">(Ordenanza N° 470/2009 y sus modificatorias, Universidad Nacional del Comahue, 2009)</w:t>
+      </w:r>
+      <w:r>
+        <w:t xml:space="preserve">, el Reglamento de Carrera Docente</w:t>
+      </w:r>
+      <w:r>
+        <w:t xml:space="preserve"> </w:t>
+      </w:r>
+      <w:r>
+        <w:t xml:space="preserve">(Ordenanza N° 0920/2019 y sus normas complementarias, Universidad Nacional del Comahue, 2019)</w:t>
+      </w:r>
+      <w:r>
+        <w:t xml:space="preserve"> </w:t>
+      </w:r>
+      <w:r>
+        <w:t xml:space="preserve">y el Convenio Colectivo de Trabajo Docente homologado por Decreto N° 1246/2015</w:t>
+      </w:r>
+      <w:r>
+        <w:t xml:space="preserve"> </w:t>
+      </w:r>
+      <w:r>
+        <w:t xml:space="preserve">(Decreto N° 1246/2015. Convenio Colectivo de Trabajo para los Docentes de las Instituciones Universitarias Nacionales, 2015)</w:t>
+      </w:r>
+      <w:r>
+        <w:t xml:space="preserve">. Estos instrumentos fijan mecanismos periódicos de evaluación con fines de permanencia y promoción, que incluyen informes de labor académica, dictámenes de pares y encuestas estudiantiles de fin de cuatrimestre.</w:t>
       </w:r>
     </w:p>
     <w:p>
@@ -1353,7 +1499,25 @@
         <w:pStyle w:val="FirstParagraph"/>
       </w:pPr>
       <w:r>
-        <w:t xml:space="preserve">Construir un problema científico exige desnaturalizar las rutinas cotidianas de la organización para reflexionar sobre sus supuestos teórico-metodológicos (Wainerman &amp; Sautu, 2011). En la educación pública, la evaluación docente suele debatirse entre dos lógicas: el control formal-estatutario y el acompañamiento formativo enfocado en el desarrollo continuo (Longo, 2006).</w:t>
+        <w:t xml:space="preserve">Construir un problema científico exige desnaturalizar las rutinas cotidianas de la organización para reflexionar sobre sus supuestos teórico-metodológicos</w:t>
+      </w:r>
+      <w:r>
+        <w:t xml:space="preserve"> </w:t>
+      </w:r>
+      <w:r>
+        <w:t xml:space="preserve">(Wainerman &amp; Sautu, 2011)</w:t>
+      </w:r>
+      <w:r>
+        <w:t xml:space="preserve">. En la educación pública, la evaluación docente suele debatirse entre dos lógicas: el control formal-estatutario y el acompañamiento formativo enfocado en el desarrollo continuo</w:t>
+      </w:r>
+      <w:r>
+        <w:t xml:space="preserve"> </w:t>
+      </w:r>
+      <w:r>
+        <w:t xml:space="preserve">(Longo, 2006)</w:t>
+      </w:r>
+      <w:r>
+        <w:t xml:space="preserve">.</w:t>
       </w:r>
     </w:p>
     <w:p>
@@ -1411,7 +1575,13 @@
         <w:t xml:space="preserve"> </w:t>
       </w:r>
       <w:r>
-        <w:t xml:space="preserve">(Dalmau et al., 2017; Lepsinger &amp; Lucia, 2009) como una herramienta idónea para articular distintas fuentes de retroalimentación: la reflexión del propio docente, el juicio de colegas de cátedra, la valoración de los estudiantes y el seguimiento institucional.</w:t>
+        <w:t xml:space="preserve">(Dalmau et al., 2017; Lepsinger &amp; Lucia, 2009)</w:t>
+      </w:r>
+      <w:r>
+        <w:t xml:space="preserve"> </w:t>
+      </w:r>
+      <w:r>
+        <w:t xml:space="preserve">como una herramienta idónea para articular distintas fuentes de retroalimentación: la reflexión del propio docente, el juicio de colegas de cátedra, la valoración de los estudiantes y el seguimiento institucional.</w:t>
       </w:r>
     </w:p>
     <w:p>
@@ -1485,7 +1655,10 @@
         <w:t xml:space="preserve"> </w:t>
       </w:r>
       <w:r>
-        <w:t xml:space="preserve">(Matus, 1993; Longo, 2006).</w:t>
+        <w:t xml:space="preserve">(Longo, 2006; Matus, 1993)</w:t>
+      </w:r>
+      <w:r>
+        <w:t xml:space="preserve">.</w:t>
       </w:r>
     </w:p>
     <w:bookmarkEnd w:id="19"/>
@@ -1595,7 +1768,16 @@
         <w:t xml:space="preserve"> </w:t>
       </w:r>
       <w:r>
-        <w:t xml:space="preserve">(cogobierno, diálogo paritario y control compartido de variables institucionales; Matus, 1993); y</w:t>
+        <w:t xml:space="preserve">[cogobierno, diálogo paritario y control compartido de variables institucionales;</w:t>
+      </w:r>
+      <w:r>
+        <w:t xml:space="preserve"> </w:t>
+      </w:r>
+      <w:r>
+        <w:t xml:space="preserve">Matus (1993)</w:t>
+      </w:r>
+      <w:r>
+        <w:t xml:space="preserve">]; y</w:t>
       </w:r>
       <w:r>
         <w:t xml:space="preserve"> </w:t>
@@ -1611,7 +1793,16 @@
         <w:t xml:space="preserve"> </w:t>
       </w:r>
       <w:r>
-        <w:t xml:space="preserve">(aprendizaje continuo y formación pedagógica articulada; Longo, 2006).</w:t>
+        <w:t xml:space="preserve">[aprendizaje continuo y formación pedagógica articulada;</w:t>
+      </w:r>
+      <w:r>
+        <w:t xml:space="preserve"> </w:t>
+      </w:r>
+      <w:r>
+        <w:t xml:space="preserve">Longo (2006)</w:t>
+      </w:r>
+      <w:r>
+        <w:t xml:space="preserve">].</w:t>
       </w:r>
     </w:p>
     <w:p>
@@ -1864,7 +2055,16 @@
         <w:t xml:space="preserve"> </w:t>
       </w:r>
       <w:r>
-        <w:t xml:space="preserve">¿Cuenta la propuesta con viabilidad política para ser tratada y consensuada en los órganos colegiados sobre variables de control compartido (Matus, 1993; Longo, 2006)?</w:t>
+        <w:t xml:space="preserve">¿Cuenta la propuesta con viabilidad política para ser tratada y consensuada en los órganos colegiados sobre variables de control compartido</w:t>
+      </w:r>
+      <w:r>
+        <w:t xml:space="preserve"> </w:t>
+      </w:r>
+      <w:r>
+        <w:t xml:space="preserve">(Longo, 2006; Matus, 1993)</w:t>
+      </w:r>
+      <w:r>
+        <w:t xml:space="preserve">?</w:t>
       </w:r>
     </w:p>
     <w:bookmarkEnd w:id="21"/>
@@ -2300,7 +2500,16 @@
         <w:pStyle w:val="FirstParagraph"/>
       </w:pPr>
       <w:r>
-        <w:t xml:space="preserve">La pertinencia del proyecto se sustenta en tres planos complementarios, acatando el esquema formal establecido por la normativa de graduación institucional (Universidad Nacional del Comahue - CURZAS, 2023):</w:t>
+        <w:t xml:space="preserve">La pertinencia del proyecto se sustenta en tres planos complementarios, acatando el esquema formal establecido por la normativa de graduación institucional</w:t>
+      </w:r>
+      <w:r>
+        <w:t xml:space="preserve"> </w:t>
+      </w:r>
+      <w:r>
+        <w:t xml:space="preserve">(Universidad Nacional del Comahue - CURZAS, 2023)</w:t>
+      </w:r>
+      <w:r>
+        <w:t xml:space="preserve">:</w:t>
       </w:r>
     </w:p>
     <w:bookmarkStart w:id="27" w:name="plano-cognitivo-y-disciplinar"/>
@@ -2317,7 +2526,16 @@
         <w:pStyle w:val="FirstParagraph"/>
       </w:pPr>
       <w:r>
-        <w:t xml:space="preserve">En el plano teórico, el trabajo busca aportar al campo de la Administración Pública y la Gestión de Recursos Humanos en el sector estatal, dialogando con los enfoques sobre modernización y capacidades institucionales (Oszlak, 2020). La implementación de modelos de retroalimentación 360° en universidades públicas argentinas —con estructuras de cogobierno, autonomía y regímenes paritarios específicos— representa un área de vacancia que amerita ser investigada de forma situada.</w:t>
+        <w:t xml:space="preserve">En el plano teórico, el trabajo busca aportar al campo de la Administración Pública y la Gestión de Recursos Humanos en el sector estatal, dialogando con los enfoques sobre modernización y capacidades institucionales</w:t>
+      </w:r>
+      <w:r>
+        <w:t xml:space="preserve"> </w:t>
+      </w:r>
+      <w:r>
+        <w:t xml:space="preserve">(Oszlak, 2020)</w:t>
+      </w:r>
+      <w:r>
+        <w:t xml:space="preserve">. La implementación de modelos de retroalimentación 360° en universidades públicas argentinas —con estructuras de cogobierno, autonomía y regímenes paritarios específicos— representa un área de vacancia que amerita ser investigada de forma situada.</w:t>
       </w:r>
     </w:p>
     <w:p>
@@ -2325,7 +2543,19 @@
         <w:pStyle w:val="BodyText"/>
       </w:pPr>
       <w:r>
-        <w:t xml:space="preserve">Asimismo, la investigación operacionaliza el Subsistema de Gestión del Rendimiento de Longo (2006) en una universidad patagónica. Se examina en qué condiciones la evaluación docente puede orientarse al aprendizaje continuo, generando evidencia empírica sobre la articulación entre gobernanza colegiada y dispositivos de retroalimentación en organizaciones públicas complejas.</w:t>
+        <w:t xml:space="preserve">Asimismo, la investigación operacionaliza el Subsistema de Gestión del Rendimiento de</w:t>
+      </w:r>
+      <w:r>
+        <w:t xml:space="preserve"> </w:t>
+      </w:r>
+      <w:r>
+        <w:t xml:space="preserve">Longo (2006)</w:t>
+      </w:r>
+      <w:r>
+        <w:t xml:space="preserve"> </w:t>
+      </w:r>
+      <w:r>
+        <w:t xml:space="preserve">en una universidad patagónica. Se examina en qué condiciones la evaluación docente puede orientarse al aprendizaje continuo, generando evidencia empírica sobre la articulación entre gobernanza colegiada y dispositivos de retroalimentación en organizaciones públicas complejas.</w:t>
       </w:r>
     </w:p>
     <w:bookmarkEnd w:id="27"/>
@@ -2601,7 +2831,19 @@
         <w:pStyle w:val="FirstParagraph"/>
       </w:pPr>
       <w:r>
-        <w:t xml:space="preserve">Para dotar de consistencia analítica a la investigación, cada subsistema del modelo de Longo (2006) aporta una clave interpretativa específica al problema planteado:</w:t>
+        <w:t xml:space="preserve">Para dotar de consistencia analítica a la investigación, cada subsistema del modelo de</w:t>
+      </w:r>
+      <w:r>
+        <w:t xml:space="preserve"> </w:t>
+      </w:r>
+      <w:r>
+        <w:t xml:space="preserve">Longo (2006)</w:t>
+      </w:r>
+      <w:r>
+        <w:t xml:space="preserve"> </w:t>
+      </w:r>
+      <w:r>
+        <w:t xml:space="preserve">aporta una clave interpretativa específica al problema planteado:</w:t>
       </w:r>
       <w:r>
         <w:t xml:space="preserve"> </w:t>
@@ -3218,7 +3460,7 @@
     </w:p>
     <w:bookmarkEnd w:id="33"/>
     <w:bookmarkEnd w:id="34"/>
-    <w:bookmarkStart w:id="35" w:name="referencias"/>
+    <w:bookmarkStart w:id="50" w:name="referencias"/>
     <w:p>
       <w:pPr>
         <w:pStyle w:val="Heading1"/>
@@ -3228,10 +3470,11 @@
         <w:t xml:space="preserve">Referencias</w:t>
       </w:r>
     </w:p>
-    <w:bookmarkEnd w:id="35"/>
-    <w:p>
-      <w:pPr>
-        <w:pStyle w:val="FirstParagraph"/>
+    <w:bookmarkStart w:id="49" w:name="refs"/>
+    <w:bookmarkStart w:id="35" w:name="ref-chiavenato2020"/>
+    <w:p>
+      <w:pPr>
+        <w:pStyle w:val="Bibliography"/>
         <w:spacing w:after="120"/>
         <w:ind w:left="720" w:hanging="720"/>
         <w:jc w:val="left"/>
@@ -3256,15 +3499,17 @@
         <w:t xml:space="preserve">(5.ª ed.). McGraw-Hill Interamericana.</w:t>
       </w:r>
     </w:p>
-    <w:p>
-      <w:pPr>
-        <w:pStyle w:val="BodyText"/>
+    <w:bookmarkEnd w:id="35"/>
+    <w:bookmarkStart w:id="37" w:name="ref-dalmau2017"/>
+    <w:p>
+      <w:pPr>
+        <w:pStyle w:val="Bibliography"/>
         <w:spacing w:after="120"/>
         <w:ind w:left="720" w:hanging="720"/>
         <w:jc w:val="left"/>
       </w:pPr>
       <w:r>
-        <w:t xml:space="preserve">Dalmau, I., Llinares, C., &amp; Montañana, A. (2017). La evaluación docente del profesorado universitario mediante el modelo 360°: Hacia un sistema formativo e integral.</w:t>
+        <w:t xml:space="preserve">Dalmau, I., Llinares, S., &amp; Montañana, A. (2017). La evaluación docente del profesorado universitario mediante el modelo 360°: Hacia un sistema formativo e integral.</w:t>
       </w:r>
       <w:r>
         <w:t xml:space="preserve"> </w:t>
@@ -3277,45 +3522,57 @@
         <w:t xml:space="preserve">Revista de Docencia Universitaria</w:t>
       </w:r>
       <w:r>
-        <w:t xml:space="preserve">, 15(2), 245–266. https://doi.org/10.4995/redu.2017.6053</w:t>
-      </w:r>
-    </w:p>
-    <w:p>
-      <w:pPr>
-        <w:pStyle w:val="BodyText"/>
+        <w:t xml:space="preserve">,</w:t>
+      </w:r>
+      <w:r>
+        <w:t xml:space="preserve"> </w:t>
+      </w:r>
+      <w:r>
+        <w:rPr>
+          <w:i/>
+          <w:iCs/>
+        </w:rPr>
+        <w:t xml:space="preserve">15</w:t>
+      </w:r>
+      <w:r>
+        <w:t xml:space="preserve">(2), 245-266.</w:t>
+      </w:r>
+      <w:r>
+        <w:t xml:space="preserve"> </w:t>
+      </w:r>
+      <w:hyperlink r:id="rId36">
+        <w:r>
+          <w:rPr>
+            <w:rStyle w:val="Hyperlink"/>
+          </w:rPr>
+          <w:t xml:space="preserve">https://doi.org/10.4995/redu.2017.6053</w:t>
+        </w:r>
+      </w:hyperlink>
+    </w:p>
+    <w:bookmarkEnd w:id="37"/>
+    <w:bookmarkStart w:id="38" w:name="ref-pen2015"/>
+    <w:p>
+      <w:pPr>
+        <w:pStyle w:val="Bibliography"/>
         <w:spacing w:after="120"/>
         <w:ind w:left="720" w:hanging="720"/>
         <w:jc w:val="left"/>
       </w:pPr>
       <w:r>
-        <w:t xml:space="preserve">Lepsinger, R., &amp; Lucia, A. D. (2009).</w:t>
-      </w:r>
-      <w:r>
-        <w:t xml:space="preserve"> </w:t>
-      </w:r>
-      <w:r>
-        <w:rPr>
-          <w:i/>
-          <w:iCs/>
-        </w:rPr>
-        <w:t xml:space="preserve">The art and science of 360 degree feedback</w:t>
-      </w:r>
-      <w:r>
-        <w:t xml:space="preserve"> </w:t>
-      </w:r>
-      <w:r>
-        <w:t xml:space="preserve">(2.ª ed.). Pfeiffer.</w:t>
-      </w:r>
-    </w:p>
-    <w:p>
-      <w:pPr>
-        <w:pStyle w:val="BodyText"/>
+        <w:t xml:space="preserve">Decreto N° 1246/2015. Convenio Colectivo de Trabajo para los Docentes de las Instituciones Universitarias Nacionales (2015).</w:t>
+      </w:r>
+    </w:p>
+    <w:bookmarkEnd w:id="38"/>
+    <w:bookmarkStart w:id="39" w:name="ref-lepsinger2009"/>
+    <w:p>
+      <w:pPr>
+        <w:pStyle w:val="Bibliography"/>
         <w:spacing w:after="120"/>
         <w:ind w:left="720" w:hanging="720"/>
         <w:jc w:val="left"/>
       </w:pPr>
       <w:r>
-        <w:t xml:space="preserve">Longo, F. (2006).</w:t>
+        <w:t xml:space="preserve">Lepsinger, R., &amp; Lucia, A. D. (2009).</w:t>
       </w:r>
       <w:r>
         <w:t xml:space="preserve"> </w:t>
@@ -3325,45 +3582,39 @@
           <w:i/>
           <w:iCs/>
         </w:rPr>
-        <w:t xml:space="preserve">Mérito y flexibilidad: La gestión de las personas en las organizaciones del sector público</w:t>
-      </w:r>
-      <w:r>
-        <w:t xml:space="preserve">. Paidós.</w:t>
-      </w:r>
-    </w:p>
-    <w:p>
-      <w:pPr>
-        <w:pStyle w:val="BodyText"/>
+        <w:t xml:space="preserve">The art and science of 360 degree feedback</w:t>
+      </w:r>
+      <w:r>
+        <w:t xml:space="preserve"> </w:t>
+      </w:r>
+      <w:r>
+        <w:t xml:space="preserve">(2.ª ed.). Pfeiffer.</w:t>
+      </w:r>
+    </w:p>
+    <w:bookmarkEnd w:id="39"/>
+    <w:bookmarkStart w:id="40" w:name="ref-ministerio1995"/>
+    <w:p>
+      <w:pPr>
+        <w:pStyle w:val="Bibliography"/>
         <w:spacing w:after="120"/>
         <w:ind w:left="720" w:hanging="720"/>
         <w:jc w:val="left"/>
       </w:pPr>
       <w:r>
-        <w:t xml:space="preserve">Matus, C. (1993).</w:t>
-      </w:r>
-      <w:r>
-        <w:t xml:space="preserve"> </w:t>
-      </w:r>
-      <w:r>
-        <w:rPr>
-          <w:i/>
-          <w:iCs/>
-        </w:rPr>
-        <w:t xml:space="preserve">Política, planificación y gobierno</w:t>
-      </w:r>
-      <w:r>
-        <w:t xml:space="preserve">. Fundación ALTIDIR.</w:t>
-      </w:r>
-    </w:p>
-    <w:p>
-      <w:pPr>
-        <w:pStyle w:val="BodyText"/>
+        <w:t xml:space="preserve">Ley N° 24.521 de Educación Superior (1995).</w:t>
+      </w:r>
+    </w:p>
+    <w:bookmarkEnd w:id="40"/>
+    <w:bookmarkStart w:id="41" w:name="ref-longo2006"/>
+    <w:p>
+      <w:pPr>
+        <w:pStyle w:val="Bibliography"/>
         <w:spacing w:after="120"/>
         <w:ind w:left="720" w:hanging="720"/>
         <w:jc w:val="left"/>
       </w:pPr>
       <w:r>
-        <w:t xml:space="preserve">Ministerio de Educación. (1995, 10 de agosto).</w:t>
+        <w:t xml:space="preserve">Longo, F. (2006).</w:t>
       </w:r>
       <w:r>
         <w:t xml:space="preserve"> </w:t>
@@ -3373,21 +3624,23 @@
           <w:i/>
           <w:iCs/>
         </w:rPr>
-        <w:t xml:space="preserve">Ley N° 24.521 de Educación Superior</w:t>
-      </w:r>
-      <w:r>
-        <w:t xml:space="preserve">. Boletín Oficial de la República Argentina.</w:t>
-      </w:r>
-    </w:p>
-    <w:p>
-      <w:pPr>
-        <w:pStyle w:val="BodyText"/>
+        <w:t xml:space="preserve">Mérito y flexibilidad: La gestión de las personas en las organizaciones del sector público</w:t>
+      </w:r>
+      <w:r>
+        <w:t xml:space="preserve">. Paidós.</w:t>
+      </w:r>
+    </w:p>
+    <w:bookmarkEnd w:id="41"/>
+    <w:bookmarkStart w:id="42" w:name="ref-matus1993"/>
+    <w:p>
+      <w:pPr>
+        <w:pStyle w:val="Bibliography"/>
         <w:spacing w:after="120"/>
         <w:ind w:left="720" w:hanging="720"/>
         <w:jc w:val="left"/>
       </w:pPr>
       <w:r>
-        <w:t xml:space="preserve">Oszlak, O. (2020).</w:t>
+        <w:t xml:space="preserve">Matus, C. (1993).</w:t>
       </w:r>
       <w:r>
         <w:t xml:space="preserve"> </w:t>
@@ -3397,21 +3650,23 @@
           <w:i/>
           <w:iCs/>
         </w:rPr>
-        <w:t xml:space="preserve">El Estado en la era del exponente tecnológico: Hacia una burocracia 4.0</w:t>
-      </w:r>
-      <w:r>
-        <w:t xml:space="preserve">. Instituto Nacional de la Administración Pública.</w:t>
-      </w:r>
-    </w:p>
-    <w:p>
-      <w:pPr>
-        <w:pStyle w:val="BodyText"/>
+        <w:t xml:space="preserve">Política, planificación y gobierno</w:t>
+      </w:r>
+      <w:r>
+        <w:t xml:space="preserve">. Fundación ALTIDIR.</w:t>
+      </w:r>
+    </w:p>
+    <w:bookmarkEnd w:id="42"/>
+    <w:bookmarkStart w:id="43" w:name="ref-oszlak2020"/>
+    <w:p>
+      <w:pPr>
+        <w:pStyle w:val="Bibliography"/>
         <w:spacing w:after="120"/>
         <w:ind w:left="720" w:hanging="720"/>
         <w:jc w:val="left"/>
       </w:pPr>
       <w:r>
-        <w:t xml:space="preserve">Poder Ejecutivo Nacional. (2015, 2 de julio).</w:t>
+        <w:t xml:space="preserve">Oszlak, O. (2020).</w:t>
       </w:r>
       <w:r>
         <w:t xml:space="preserve"> </w:t>
@@ -3421,15 +3676,17 @@
           <w:i/>
           <w:iCs/>
         </w:rPr>
-        <w:t xml:space="preserve">Decreto N° 1246/2015. Convenio Colectivo de Trabajo para los Docentes de las Instituciones Universitarias Nacionales</w:t>
-      </w:r>
-      <w:r>
-        <w:t xml:space="preserve">. Boletín Oficial de la República Argentina.</w:t>
-      </w:r>
-    </w:p>
-    <w:p>
-      <w:pPr>
-        <w:pStyle w:val="BodyText"/>
+        <w:t xml:space="preserve">El Estado en la era del exponente tecnológico: Hacia una burocracia 4.0</w:t>
+      </w:r>
+      <w:r>
+        <w:t xml:space="preserve">. Instituto Nacional de la Administración Pública.</w:t>
+      </w:r>
+    </w:p>
+    <w:bookmarkEnd w:id="43"/>
+    <w:bookmarkStart w:id="44" w:name="ref-sautu2005"/>
+    <w:p>
+      <w:pPr>
+        <w:pStyle w:val="Bibliography"/>
         <w:spacing w:after="120"/>
         <w:ind w:left="720" w:hanging="720"/>
         <w:jc w:val="left"/>
@@ -3451,9 +3708,11 @@
         <w:t xml:space="preserve">. Lumiere.</w:t>
       </w:r>
     </w:p>
-    <w:p>
-      <w:pPr>
-        <w:pStyle w:val="BodyText"/>
+    <w:bookmarkEnd w:id="44"/>
+    <w:bookmarkStart w:id="45" w:name="ref-unco2009"/>
+    <w:p>
+      <w:pPr>
+        <w:pStyle w:val="Bibliography"/>
         <w:spacing w:after="120"/>
         <w:ind w:left="720" w:hanging="720"/>
         <w:jc w:val="left"/>
@@ -3472,15 +3731,14 @@
         <w:t xml:space="preserve">Ordenanza N° 470/2009: Estatuto de la Universidad Nacional del Comahue</w:t>
       </w:r>
       <w:r>
-        <w:t xml:space="preserve"> </w:t>
-      </w:r>
-      <w:r>
-        <w:t xml:space="preserve">(y sus normas modificatorias). Consejo Superior.</w:t>
-      </w:r>
-    </w:p>
-    <w:p>
-      <w:pPr>
-        <w:pStyle w:val="BodyText"/>
+        <w:t xml:space="preserve">.</w:t>
+      </w:r>
+    </w:p>
+    <w:bookmarkEnd w:id="45"/>
+    <w:bookmarkStart w:id="46" w:name="ref-unco2019"/>
+    <w:p>
+      <w:pPr>
+        <w:pStyle w:val="Bibliography"/>
         <w:spacing w:after="120"/>
         <w:ind w:left="720" w:hanging="720"/>
         <w:jc w:val="left"/>
@@ -3499,15 +3757,14 @@
         <w:t xml:space="preserve">Ordenanza N° 0920/2019: Reglamento de Carrera Docente</w:t>
       </w:r>
       <w:r>
-        <w:t xml:space="preserve"> </w:t>
-      </w:r>
-      <w:r>
-        <w:t xml:space="preserve">(y sus normas modificatorias y complementarias). Consejo Superior.</w:t>
-      </w:r>
-    </w:p>
-    <w:p>
-      <w:pPr>
-        <w:pStyle w:val="BodyText"/>
+        <w:t xml:space="preserve">.</w:t>
+      </w:r>
+    </w:p>
+    <w:bookmarkEnd w:id="46"/>
+    <w:bookmarkStart w:id="47" w:name="ref-uncocurzas2023"/>
+    <w:p>
+      <w:pPr>
+        <w:pStyle w:val="Bibliography"/>
         <w:spacing w:after="120"/>
         <w:ind w:left="720" w:hanging="720"/>
         <w:jc w:val="left"/>
@@ -3526,21 +3783,20 @@
         <w:t xml:space="preserve">Resolución CD-CURZAS N° 266/2023: Reglamento de Trabajo Final de Graduación (TFG) para las carreras del Departamento de Administración Pública</w:t>
       </w:r>
       <w:r>
-        <w:t xml:space="preserve"> </w:t>
-      </w:r>
-      <w:r>
-        <w:t xml:space="preserve">(y resoluciones complementarias). Consejo Directivo.</w:t>
-      </w:r>
-    </w:p>
-    <w:p>
-      <w:pPr>
-        <w:pStyle w:val="BodyText"/>
+        <w:t xml:space="preserve">.</w:t>
+      </w:r>
+    </w:p>
+    <w:bookmarkEnd w:id="47"/>
+    <w:bookmarkStart w:id="48" w:name="ref-wainerman2011"/>
+    <w:p>
+      <w:pPr>
+        <w:pStyle w:val="Bibliography"/>
         <w:spacing w:after="120"/>
         <w:ind w:left="720" w:hanging="720"/>
         <w:jc w:val="left"/>
       </w:pPr>
       <w:r>
-        <w:t xml:space="preserve">Wainerman, C., &amp; Sautu, R. (Comps.). (2011).</w:t>
+        <w:t xml:space="preserve">Wainerman, C., &amp; Sautu, R. (2011).</w:t>
       </w:r>
       <w:r>
         <w:t xml:space="preserve"> </w:t>
@@ -3559,6 +3815,9 @@
         <w:t xml:space="preserve">(4.ª ed.). Manantial.</w:t>
       </w:r>
     </w:p>
+    <w:bookmarkEnd w:id="48"/>
+    <w:bookmarkEnd w:id="49"/>
+    <w:bookmarkEnd w:id="50"/>
     <w:sectPr>
       <w:footerReference w:type="default" r:id="rId10"/>
       <w:footnotePr>

</xml_diff>

<commit_message>
feat: improve document page numbering to exclude cover and index pages
</commit_message>
<xml_diff>
--- a/Entregas/Actividad 2/TP2_Ayarachi_Fuentes.docx
+++ b/Entregas/Actividad 2/TP2_Ayarachi_Fuentes.docx
@@ -902,6 +902,12 @@
       </w:r>
     </w:p>
     <w:p>
+      <w:pPr>
+        <w:sectPr>
+          <w:footerReference w:type="default" r:id="rId10"/>
+          <w:type w:val="nextPage"/>
+        </w:sectPr>
+      </w:pPr>
       <w:r>
         <w:br w:type="page"/>
       </w:r>
@@ -3819,13 +3825,12 @@
     <w:bookmarkEnd w:id="49"/>
     <w:bookmarkEnd w:id="50"/>
     <w:sectPr>
-      <w:footerReference w:type="default" r:id="rId10"/>
+      <w:footerReference w:type="default" r:id="rId11"/>
       <w:footnotePr>
         <w:numRestart w:val="eachSect"/>
       </w:footnotePr>
       <w:pgMar w:top="1417" w:bottom="1417" w:left="1417" w:right="1417"/>
-      <w:titlePg/>
-      <w:pgNumType w:start="0"/>
+      <w:pgNumType w:start="1"/>
     </w:sectPr>
   </w:body>
 </w:document>
@@ -3840,8 +3845,20 @@
   <w:p>
     <w:pPr>
       <w:pStyle w:val="Footer"/>
+    </w:pPr>
+    <w:r/>
+  </w:p>
+</w:ftr>
+</file>
+
+<file path=word/footer2.xml><?xml version="1.0" encoding="utf-8"?>
+<w:ftr xmlns:m="http://schemas.openxmlformats.org/officeDocument/2006/math" xmlns:mc="http://schemas.openxmlformats.org/markup-compatibility/2006" xmlns:mo="http://schemas.microsoft.com/office/mac/office/2008/main" xmlns:mv="urn:schemas-microsoft-com:mac:vml" xmlns:o="urn:schemas-microsoft-com:office:office" xmlns:r="http://schemas.openxmlformats.org/officeDocument/2006/relationships" xmlns:v="urn:schemas-microsoft-com:vml" xmlns:w10="urn:schemas-microsoft-com:office:word" xmlns:w14="http://schemas.microsoft.com/office/word/2010/wordml" xmlns:w="http://schemas.openxmlformats.org/wordprocessingml/2006/main" xmlns:wne="http://schemas.microsoft.com/office/word/2006/wordml" xmlns:wp14="http://schemas.microsoft.com/office/word/2010/wordprocessingDrawing" xmlns:wp="http://schemas.openxmlformats.org/drawingml/2006/wordprocessingDrawing" xmlns:wpc="http://schemas.microsoft.com/office/word/2010/wordprocessingCanvas" xmlns:wpg="http://schemas.microsoft.com/office/word/2010/wordprocessingGroup" xmlns:wpi="http://schemas.microsoft.com/office/word/2010/wordprocessingInk" xmlns:wps="http://schemas.microsoft.com/office/word/2010/wordprocessingShape" mc:Ignorable="w14 wp14">
+  <w:p>
+    <w:pPr>
+      <w:pStyle w:val="Footer"/>
       <w:jc w:val="center"/>
     </w:pPr>
+    <w:r/>
     <w:fldSimple w:instr="PAGE"/>
   </w:p>
 </w:ftr>

</xml_diff>

<commit_message>
feat: add Quarto source and compiled documents for Actividad 2 (TP2) and update compilation script
</commit_message>
<xml_diff>
--- a/Entregas/Actividad 2/TP2_Ayarachi_Fuentes.docx
+++ b/Entregas/Actividad 2/TP2_Ayarachi_Fuentes.docx
@@ -314,8 +314,15 @@
     <w:p>
       <w:pPr>
         <w:pStyle w:val="Heading1"/>
-      </w:pPr>
-      <w:r>
+        <w:keepNext/>
+        <w:spacing w:before="240" w:after="120" w:line="300" w:lineRule="auto"/>
+      </w:pPr>
+      <w:r>
+        <w:rPr>
+          <w:rFonts w:ascii="Arial" w:hAnsi="Arial"/>
+          <w:b/>
+          <w:sz w:val="28"/>
+        </w:rPr>
         <w:t xml:space="preserve">Índice de Contenidos</w:t>
       </w:r>
     </w:p>
@@ -569,7 +576,7 @@
           <w:rFonts w:ascii="Arial" w:hAnsi="Arial"/>
           <w:sz w:val="22"/>
         </w:rPr>
-        <w:t>5</w:t>
+        <w:t>6</w:t>
       </w:r>
     </w:p>
     <w:p>
@@ -623,7 +630,7 @@
           <w:rFonts w:ascii="Arial" w:hAnsi="Arial"/>
           <w:sz w:val="22"/>
         </w:rPr>
-        <w:t>6</w:t>
+        <w:t>7</w:t>
       </w:r>
     </w:p>
     <w:p>
@@ -650,7 +657,7 @@
           <w:rFonts w:ascii="Arial" w:hAnsi="Arial"/>
           <w:sz w:val="22"/>
         </w:rPr>
-        <w:t>6</w:t>
+        <w:t>7</w:t>
       </w:r>
     </w:p>
     <w:p>
@@ -677,7 +684,7 @@
           <w:rFonts w:ascii="Arial" w:hAnsi="Arial"/>
           <w:sz w:val="22"/>
         </w:rPr>
-        <w:t>6</w:t>
+        <w:t>7</w:t>
       </w:r>
     </w:p>
     <w:p>
@@ -731,7 +738,7 @@
           <w:rFonts w:ascii="Arial" w:hAnsi="Arial"/>
           <w:sz w:val="22"/>
         </w:rPr>
-        <w:t>7</w:t>
+        <w:t>8</w:t>
       </w:r>
     </w:p>
     <w:p>
@@ -758,7 +765,7 @@
           <w:rFonts w:ascii="Arial" w:hAnsi="Arial"/>
           <w:sz w:val="22"/>
         </w:rPr>
-        <w:t>7</w:t>
+        <w:t>8</w:t>
       </w:r>
     </w:p>
     <w:p>
@@ -866,7 +873,7 @@
           <w:rFonts w:ascii="Arial" w:hAnsi="Arial"/>
           <w:sz w:val="22"/>
         </w:rPr>
-        <w:t>10</w:t>
+        <w:t>11</w:t>
       </w:r>
     </w:p>
     <w:p>
@@ -893,7 +900,7 @@
           <w:rFonts w:ascii="Arial" w:hAnsi="Arial"/>
           <w:sz w:val="22"/>
         </w:rPr>
-        <w:t>10</w:t>
+        <w:t>11</w:t>
       </w:r>
     </w:p>
     <w:p>
@@ -915,49 +922,69 @@
     <w:p>
       <w:pPr>
         <w:pStyle w:val="FirstParagraph"/>
-      </w:pPr>
-      <w:r>
-        <w:rPr>
-          <w:b/>
-          <w:bCs/>
-        </w:rPr>
-        <w:t xml:space="preserve">Evaluación del Desempeño Docente y Factibilidad de Implementación de un Modelo de Retroalimentación 360° en el Departamento de Administración Pública del CURZAS-UNCo (2025–2026)</w:t>
-      </w:r>
-      <w:r>
-        <w:br/>
-      </w:r>
-      <w:r>
-        <w:rPr>
+        <w:spacing w:before="0" w:after="40" w:line="276" w:lineRule="auto"/>
+        <w:jc w:val="center"/>
+      </w:pPr>
+      <w:r/>
+      <w:r>
+        <w:rPr>
+          <w:rFonts w:ascii="Arial" w:hAnsi="Arial"/>
+          <w:b/>
+          <w:sz w:val="26"/>
+        </w:rPr>
+        <w:t>Evaluación del Desempeño Docente y Factibilidad de Implementación de un Modelo de Retroalimentación 360° en el Departamento de Administración Pública del CURZAS-UNCo (2025–2026)</w:t>
+      </w:r>
+    </w:p>
+    <w:p>
+      <w:pPr>
+        <w:spacing w:before="0" w:after="120" w:line="276" w:lineRule="auto"/>
+        <w:jc w:val="center"/>
+      </w:pPr>
+      <w:r>
+        <w:rPr>
+          <w:rFonts w:ascii="Arial" w:hAnsi="Arial"/>
           <w:i/>
-          <w:iCs/>
-        </w:rPr>
-        <w:t xml:space="preserve">(Trabajo Práctico N° 2: Primera Parte de la Estructura del Proyecto de Investigación de TFG)</w:t>
-      </w:r>
-    </w:p>
-    <w:p>
-      <w:pPr>
-        <w:pStyle w:val="BodyText"/>
-      </w:pPr>
-      <w:r>
-        <w:br/>
-      </w:r>
-    </w:p>
-    <w:bookmarkEnd w:id="12"/>
-    <w:bookmarkStart w:id="18" w:name="tema-de-investigación"/>
+          <w:sz w:val="22"/>
+        </w:rPr>
+        <w:t>(Trabajo Práctico N° 2: Primera Parte de la Estructura del Proyecto de Investigación de TFG)</w:t>
+      </w:r>
+    </w:p>
     <w:p>
       <w:pPr>
         <w:pStyle w:val="Heading1"/>
-      </w:pPr>
-      <w:r>
+        <w:keepNext/>
+        <w:spacing w:before="240" w:after="120" w:line="300" w:lineRule="auto"/>
+      </w:pPr>
+      <w:r>
+        <w:rPr>
+          <w:rFonts w:ascii="Arial" w:hAnsi="Arial"/>
+          <w:b/>
+          <w:sz w:val="28"/>
+        </w:rPr>
         <w:t xml:space="preserve">1. Tema de Investigación</w:t>
       </w:r>
     </w:p>
+    <w:p>
+      <w:pPr>
+        <w:pStyle w:val="FirstParagraph"/>
+      </w:pPr>
+      <w:r>
+        <w:t xml:space="preserve">En esta primera sección del Proyecto de TFG se presenta la delimitación del tema de estudio, articulando la gestión pública universitaria con los modelos teóricos de gestión del empleo y recursos humanos en el sector público.</w:t>
+      </w:r>
+    </w:p>
     <w:bookmarkStart w:id="16" w:name="X3b7543707cc40a247a490b86cb2ce8465d5a046"/>
     <w:p>
       <w:pPr>
         <w:pStyle w:val="Heading2"/>
-      </w:pPr>
-      <w:r>
+        <w:keepNext/>
+        <w:spacing w:before="200" w:after="80" w:line="300" w:lineRule="auto"/>
+      </w:pPr>
+      <w:r>
+        <w:rPr>
+          <w:rFonts w:ascii="Arial" w:hAnsi="Arial"/>
+          <w:b/>
+          <w:sz w:val="24"/>
+        </w:rPr>
         <w:t xml:space="preserve">1.1 Identificación del Tema y Encuadre en el Modelo de Francisco Longo</w:t>
       </w:r>
     </w:p>
@@ -1287,8 +1314,15 @@
     <w:p>
       <w:pPr>
         <w:pStyle w:val="Heading2"/>
-      </w:pPr>
-      <w:r>
+        <w:keepNext/>
+        <w:spacing w:before="200" w:after="80" w:line="300" w:lineRule="auto"/>
+      </w:pPr>
+      <w:r>
+        <w:rPr>
+          <w:rFonts w:ascii="Arial" w:hAnsi="Arial"/>
+          <w:b/>
+          <w:sz w:val="24"/>
+        </w:rPr>
         <w:t xml:space="preserve">1.2 Descripción Contextual Socioeconómica, Histórica e Institucional</w:t>
       </w:r>
     </w:p>
@@ -1486,17 +1520,39 @@
     <w:p>
       <w:pPr>
         <w:pStyle w:val="Heading1"/>
-      </w:pPr>
-      <w:r>
+        <w:keepNext/>
+        <w:spacing w:before="240" w:after="120" w:line="300" w:lineRule="auto"/>
+      </w:pPr>
+      <w:r>
+        <w:rPr>
+          <w:rFonts w:ascii="Arial" w:hAnsi="Arial"/>
+          <w:b/>
+          <w:sz w:val="28"/>
+        </w:rPr>
         <w:t xml:space="preserve">2. Delimitación del Objeto Problema</w:t>
       </w:r>
     </w:p>
+    <w:p>
+      <w:pPr>
+        <w:pStyle w:val="FirstParagraph"/>
+      </w:pPr>
+      <w:r>
+        <w:t xml:space="preserve">En este apartado se problematiza la evaluación del desempeño docente a partir de la tensión entre el control estatutario y el desarrollo formativo, precisando las delimitaciones metodológicas y las dimensiones de factibilidad.</w:t>
+      </w:r>
+    </w:p>
     <w:bookmarkStart w:id="19" w:name="X9314e5ae1895006622d4a256dda74be91243933"/>
     <w:p>
       <w:pPr>
         <w:pStyle w:val="Heading2"/>
-      </w:pPr>
-      <w:r>
+        <w:keepNext/>
+        <w:spacing w:before="200" w:after="80" w:line="300" w:lineRule="auto"/>
+      </w:pPr>
+      <w:r>
+        <w:rPr>
+          <w:rFonts w:ascii="Arial" w:hAnsi="Arial"/>
+          <w:b/>
+          <w:sz w:val="24"/>
+        </w:rPr>
         <w:t xml:space="preserve">2.1 Problematización y Construcción del Objeto de Estudio</w:t>
       </w:r>
     </w:p>
@@ -1672,8 +1728,15 @@
     <w:p>
       <w:pPr>
         <w:pStyle w:val="Heading2"/>
-      </w:pPr>
-      <w:r>
+        <w:keepNext/>
+        <w:spacing w:before="200" w:after="80" w:line="300" w:lineRule="auto"/>
+      </w:pPr>
+      <w:r>
+        <w:rPr>
+          <w:rFonts w:ascii="Arial" w:hAnsi="Arial"/>
+          <w:b/>
+          <w:sz w:val="24"/>
+        </w:rPr>
         <w:t xml:space="preserve">2.2 Desglose de las Cuatro (4) Delimitaciones Metodológicas</w:t>
       </w:r>
     </w:p>
@@ -1917,8 +1980,15 @@
     <w:p>
       <w:pPr>
         <w:pStyle w:val="Heading2"/>
-      </w:pPr>
-      <w:r>
+        <w:keepNext/>
+        <w:spacing w:before="200" w:after="80" w:line="300" w:lineRule="auto"/>
+      </w:pPr>
+      <w:r>
+        <w:rPr>
+          <w:rFonts w:ascii="Arial" w:hAnsi="Arial"/>
+          <w:b/>
+          <w:sz w:val="24"/>
+        </w:rPr>
         <w:t xml:space="preserve">2.3 Operacionalización de las Dimensiones de Factibilidad</w:t>
       </w:r>
     </w:p>
@@ -1926,8 +1996,16 @@
     <w:p>
       <w:pPr>
         <w:pStyle w:val="Heading3"/>
-      </w:pPr>
-      <w:r>
+        <w:keepNext/>
+        <w:spacing w:before="160" w:after="40" w:line="300" w:lineRule="auto"/>
+      </w:pPr>
+      <w:r>
+        <w:rPr>
+          <w:rFonts w:ascii="Arial" w:hAnsi="Arial"/>
+          <w:b/>
+          <w:i/>
+          <w:sz w:val="24"/>
+        </w:rPr>
         <w:t xml:space="preserve">2.3.1 Definición Conceptual y Operativa de Factibilidad</w:t>
       </w:r>
     </w:p>
@@ -2078,8 +2156,16 @@
     <w:p>
       <w:pPr>
         <w:pStyle w:val="Heading3"/>
-      </w:pPr>
-      <w:r>
+        <w:keepNext/>
+        <w:spacing w:before="160" w:after="40" w:line="300" w:lineRule="auto"/>
+      </w:pPr>
+      <w:r>
+        <w:rPr>
+          <w:rFonts w:ascii="Arial" w:hAnsi="Arial"/>
+          <w:b/>
+          <w:i/>
+          <w:sz w:val="24"/>
+        </w:rPr>
         <w:t xml:space="preserve">2.3.2 Dimensiones de Observación y Fuentes Empíricas</w:t>
       </w:r>
     </w:p>
@@ -2380,8 +2466,16 @@
     <w:p>
       <w:pPr>
         <w:pStyle w:val="Heading3"/>
-      </w:pPr>
-      <w:r>
+        <w:keepNext/>
+        <w:spacing w:before="160" w:after="40" w:line="300" w:lineRule="auto"/>
+      </w:pPr>
+      <w:r>
+        <w:rPr>
+          <w:rFonts w:ascii="Arial" w:hAnsi="Arial"/>
+          <w:b/>
+          <w:i/>
+          <w:sz w:val="24"/>
+        </w:rPr>
         <w:t xml:space="preserve">2.3.3 Criterios Cualitativos para la Interpretación de Resultados</w:t>
       </w:r>
     </w:p>
@@ -2465,8 +2559,15 @@
     <w:p>
       <w:pPr>
         <w:pStyle w:val="Heading2"/>
-      </w:pPr>
-      <w:r>
+        <w:keepNext/>
+        <w:spacing w:before="200" w:after="80" w:line="300" w:lineRule="auto"/>
+      </w:pPr>
+      <w:r>
+        <w:rPr>
+          <w:rFonts w:ascii="Arial" w:hAnsi="Arial"/>
+          <w:b/>
+          <w:sz w:val="24"/>
+        </w:rPr>
         <w:t xml:space="preserve">2.4 Pregunta General de Investigación</w:t>
       </w:r>
     </w:p>
@@ -2496,8 +2597,15 @@
     <w:p>
       <w:pPr>
         <w:pStyle w:val="Heading1"/>
-      </w:pPr>
-      <w:r>
+        <w:keepNext/>
+        <w:spacing w:before="240" w:after="120" w:line="300" w:lineRule="auto"/>
+      </w:pPr>
+      <w:r>
+        <w:rPr>
+          <w:rFonts w:ascii="Arial" w:hAnsi="Arial"/>
+          <w:b/>
+          <w:sz w:val="28"/>
+        </w:rPr>
         <w:t xml:space="preserve">3. Justificación y Relevancia de la Investigación</w:t>
       </w:r>
     </w:p>
@@ -2506,24 +2614,22 @@
         <w:pStyle w:val="FirstParagraph"/>
       </w:pPr>
       <w:r>
-        <w:t xml:space="preserve">La pertinencia del proyecto se sustenta en tres planos complementarios, acatando el esquema formal establecido por la normativa de graduación institucional</w:t>
-      </w:r>
-      <w:r>
-        <w:t xml:space="preserve"> </w:t>
-      </w:r>
-      <w:r>
-        <w:t xml:space="preserve">(Universidad Nacional del Comahue - CURZAS, 2023)</w:t>
-      </w:r>
-      <w:r>
-        <w:t xml:space="preserve">:</w:t>
+        <w:t xml:space="preserve">A continuación, se explicita la pertinencia del estudio desde tres planos convergentes, en estricta consonancia con los criterios formales del Reglamento de TFG de la universidad:</w:t>
       </w:r>
     </w:p>
     <w:bookmarkStart w:id="27" w:name="plano-cognitivo-y-disciplinar"/>
     <w:p>
       <w:pPr>
         <w:pStyle w:val="Heading2"/>
-      </w:pPr>
-      <w:r>
+        <w:keepNext/>
+        <w:spacing w:before="200" w:after="80" w:line="300" w:lineRule="auto"/>
+      </w:pPr>
+      <w:r>
+        <w:rPr>
+          <w:rFonts w:ascii="Arial" w:hAnsi="Arial"/>
+          <w:b/>
+          <w:sz w:val="24"/>
+        </w:rPr>
         <w:t xml:space="preserve">3.1 Plano Cognitivo y Disciplinar</w:t>
       </w:r>
     </w:p>
@@ -2569,8 +2675,15 @@
     <w:p>
       <w:pPr>
         <w:pStyle w:val="Heading2"/>
-      </w:pPr>
-      <w:r>
+        <w:keepNext/>
+        <w:spacing w:before="200" w:after="80" w:line="300" w:lineRule="auto"/>
+      </w:pPr>
+      <w:r>
+        <w:rPr>
+          <w:rFonts w:ascii="Arial" w:hAnsi="Arial"/>
+          <w:b/>
+          <w:sz w:val="24"/>
+        </w:rPr>
         <w:t xml:space="preserve">3.2 Plano Social e Institucional</w:t>
       </w:r>
     </w:p>
@@ -2661,8 +2774,15 @@
     <w:p>
       <w:pPr>
         <w:pStyle w:val="Heading2"/>
-      </w:pPr>
-      <w:r>
+        <w:keepNext/>
+        <w:spacing w:before="200" w:after="80" w:line="300" w:lineRule="auto"/>
+      </w:pPr>
+      <w:r>
+        <w:rPr>
+          <w:rFonts w:ascii="Arial" w:hAnsi="Arial"/>
+          <w:b/>
+          <w:sz w:val="24"/>
+        </w:rPr>
         <w:t xml:space="preserve">3.3 Plano Personal y Profesional</w:t>
       </w:r>
     </w:p>
@@ -2680,8 +2800,15 @@
     <w:p>
       <w:pPr>
         <w:pStyle w:val="Heading1"/>
-      </w:pPr>
-      <w:r>
+        <w:keepNext/>
+        <w:spacing w:before="240" w:after="120" w:line="300" w:lineRule="auto"/>
+      </w:pPr>
+      <w:r>
+        <w:rPr>
+          <w:rFonts w:ascii="Arial" w:hAnsi="Arial"/>
+          <w:b/>
+          <w:sz w:val="28"/>
+        </w:rPr>
         <w:t xml:space="preserve">4. Definición de Objetivos del TFG</w:t>
       </w:r>
     </w:p>
@@ -2690,15 +2817,22 @@
         <w:pStyle w:val="FirstParagraph"/>
       </w:pPr>
       <w:r>
-        <w:t xml:space="preserve">En estricta correspondencia lógica y simétrica con la pregunta general de investigación, los objetivos se formulan mediante verbos en infinitivo que denotan acción empíricamente contrastable:</w:t>
+        <w:t xml:space="preserve">En este apartado se formulan las metas analíticas del proyecto en congruencia directa con la pregunta general de investigación y las dimensiones metodológicas planteadas:</w:t>
       </w:r>
     </w:p>
     <w:bookmarkStart w:id="31" w:name="objetivo-general"/>
     <w:p>
       <w:pPr>
         <w:pStyle w:val="Heading2"/>
-      </w:pPr>
-      <w:r>
+        <w:keepNext/>
+        <w:spacing w:before="200" w:after="80" w:line="300" w:lineRule="auto"/>
+      </w:pPr>
+      <w:r>
+        <w:rPr>
+          <w:rFonts w:ascii="Arial" w:hAnsi="Arial"/>
+          <w:b/>
+          <w:sz w:val="24"/>
+        </w:rPr>
         <w:t xml:space="preserve">4.1 Objetivo General</w:t>
       </w:r>
     </w:p>
@@ -2729,8 +2863,15 @@
     <w:p>
       <w:pPr>
         <w:pStyle w:val="Heading2"/>
-      </w:pPr>
-      <w:r>
+        <w:keepNext/>
+        <w:spacing w:before="200" w:after="80" w:line="300" w:lineRule="auto"/>
+      </w:pPr>
+      <w:r>
+        <w:rPr>
+          <w:rFonts w:ascii="Arial" w:hAnsi="Arial"/>
+          <w:b/>
+          <w:sz w:val="24"/>
+        </w:rPr>
         <w:t xml:space="preserve">4.2 Objetivos Específicos</w:t>
       </w:r>
     </w:p>
@@ -2827,8 +2968,15 @@
     <w:p>
       <w:pPr>
         <w:pStyle w:val="Heading2"/>
-      </w:pPr>
-      <w:r>
+        <w:keepNext/>
+        <w:spacing w:before="200" w:after="80" w:line="300" w:lineRule="auto"/>
+      </w:pPr>
+      <w:r>
+        <w:rPr>
+          <w:rFonts w:ascii="Arial" w:hAnsi="Arial"/>
+          <w:b/>
+          <w:sz w:val="24"/>
+        </w:rPr>
         <w:t xml:space="preserve">4.3 Matriz de Consistencia Metodológica y Articulación con Longo (2006)</w:t>
       </w:r>
     </w:p>
@@ -3470,9 +3618,16 @@
     <w:p>
       <w:pPr>
         <w:pStyle w:val="Heading1"/>
+        <w:keepNext/>
+        <w:spacing w:before="240" w:after="120" w:line="300" w:lineRule="auto"/>
         <w:jc w:val="center"/>
       </w:pPr>
       <w:r>
+        <w:rPr>
+          <w:rFonts w:ascii="Arial" w:hAnsi="Arial"/>
+          <w:b/>
+          <w:sz w:val="28"/>
+        </w:rPr>
         <w:t xml:space="preserve">Referencias</w:t>
       </w:r>
     </w:p>
@@ -4435,14 +4590,14 @@
     <w:pPr>
       <w:keepNext/>
       <w:keepLines/>
-      <w:spacing w:after="80" w:before="360" w:line="360" w:lineRule="auto"/>
+      <w:spacing w:after="200" w:before="400" w:line="288" w:lineRule="auto"/>
       <w:outlineLvl w:val="0"/>
     </w:pPr>
     <w:rPr>
       <w:rFonts w:asciiTheme="majorHAnsi" w:cstheme="majorBidi" w:eastAsiaTheme="majorEastAsia" w:hAnsiTheme="majorHAnsi" w:ascii="Arial" w:hAnsi="Arial"/>
       <w:b/>
       <w:color w:themeColor="accent1" w:themeShade="BF" w:val="0F4761"/>
-      <w:sz w:val="24"/>
+      <w:sz w:val="28"/>
       <w:szCs w:val="40"/>
     </w:rPr>
   </w:style>
@@ -4459,7 +4614,7 @@
     <w:pPr>
       <w:keepNext/>
       <w:keepLines/>
-      <w:spacing w:after="80" w:before="160" w:line="360" w:lineRule="auto"/>
+      <w:spacing w:after="120" w:before="280" w:line="288" w:lineRule="auto"/>
       <w:outlineLvl w:val="1"/>
     </w:pPr>
     <w:rPr>
@@ -4483,12 +4638,13 @@
     <w:pPr>
       <w:keepNext/>
       <w:keepLines/>
-      <w:spacing w:after="80" w:before="160" w:line="360" w:lineRule="auto"/>
+      <w:spacing w:after="80" w:before="200" w:line="288" w:lineRule="auto"/>
       <w:outlineLvl w:val="2"/>
     </w:pPr>
     <w:rPr>
       <w:rFonts w:cstheme="majorBidi" w:eastAsiaTheme="majorEastAsia" w:ascii="Arial" w:hAnsi="Arial"/>
       <w:b/>
+      <w:i/>
       <w:color w:themeColor="accent1" w:themeShade="BF" w:val="0F4761"/>
       <w:sz w:val="24"/>
       <w:szCs w:val="28"/>

</xml_diff>

<commit_message>
feat: add research proposal document and bibliography for Actividad 2
</commit_message>
<xml_diff>
--- a/Entregas/Actividad 2/TP2_Ayarachi_Fuentes.docx
+++ b/Entregas/Actividad 2/TP2_Ayarachi_Fuentes.docx
@@ -836,7 +836,7 @@
           <w:rFonts w:ascii="Arial" w:hAnsi="Arial"/>
           <w:sz w:val="22"/>
         </w:rPr>
-        <w:t>4.3 Matriz de Consistencia Metodológica y Articulación con Longo (2006)</w:t>
+        <w:t>4.3 Matriz de Consistencia Metodológica y Articulación con Longo (2004)</w:t>
       </w:r>
       <w:r>
         <w:tab/>
@@ -846,7 +846,7 @@
           <w:rFonts w:ascii="Arial" w:hAnsi="Arial"/>
           <w:sz w:val="22"/>
         </w:rPr>
-        <w:t>8</w:t>
+        <w:t>9</w:t>
       </w:r>
     </w:p>
     <w:p>
@@ -1103,7 +1103,7 @@
           <w:b/>
           <w:bCs/>
         </w:rPr>
-        <w:t xml:space="preserve">Longo (2006)</w:t>
+        <w:t xml:space="preserve">Longo (2004)</w:t>
       </w:r>
       <w:r>
         <w:t xml:space="preserve">. Este modelo concibe la administración de personas como un sistema articulado con la estrategia institucional y compuesto por subsistemas interdependientes:</w:t>
@@ -1118,7 +1118,7 @@
           <wp:inline>
             <wp:extent cx="3733800" cy="2893695"/>
             <wp:effectExtent b="0" l="0" r="0" t="0"/>
-            <wp:docPr descr="Subsistemas de la Gestión de Recursos Humanos en el Sector Público (Longo, 2006)." title="" id="14" name="Picture"/>
+            <wp:docPr descr="Subsistemas de la Gestión de Recursos Humanos en el Sector Público (Longo, 2004)." title="" id="14" name="Picture"/>
             <a:graphic>
               <a:graphicData uri="http://schemas.openxmlformats.org/drawingml/2006/picture">
                 <pic:pic>
@@ -1188,7 +1188,7 @@
           <w:i/>
           <w:iCs/>
         </w:rPr>
-        <w:t xml:space="preserve">(Longo, 2006)</w:t>
+        <w:t xml:space="preserve">(Longo, 2004)</w:t>
       </w:r>
       <w:r>
         <w:rPr>
@@ -1297,16 +1297,16 @@
         <w:t xml:space="preserve">retroalimentación 360 grados</w:t>
       </w:r>
       <w:r>
-        <w:t xml:space="preserve">, que articula diversas miradas sobre la labor docente: autoevaluación, valoración de pares disciplinares, apreciación de los estudiantes y seguimiento de directores departamentales</w:t>
-      </w:r>
-      <w:r>
-        <w:t xml:space="preserve"> </w:t>
-      </w:r>
-      <w:r>
-        <w:t xml:space="preserve">(Dalmau et al., 2017; Lepsinger &amp; Lucia, 2009)</w:t>
-      </w:r>
-      <w:r>
-        <w:t xml:space="preserve">.</w:t>
+        <w:t xml:space="preserve">, que articula diversas fuentes sobre la labor docente (autoevaluación, valoración de pares, apreciación de los estudiantes e integración de portafolios) en el ámbito de la educación superior</w:t>
+      </w:r>
+      <w:r>
+        <w:t xml:space="preserve"> </w:t>
+      </w:r>
+      <w:r>
+        <w:t xml:space="preserve">(Obando Freire et al., 2014; Sifuentes Ocegueda, 2016)</w:t>
+      </w:r>
+      <w:r>
+        <w:t xml:space="preserve">, sobre la cual el presente proyecto propone incorporar formalmente la mirada de los directores departamentales como actores clave de la gestión universitaria.</w:t>
       </w:r>
     </w:p>
     <w:bookmarkEnd w:id="16"/>
@@ -1570,13 +1570,13 @@
         <w:t xml:space="preserve">(Wainerman &amp; Sautu, 2011)</w:t>
       </w:r>
       <w:r>
-        <w:t xml:space="preserve">. En la educación pública, la evaluación docente suele debatirse entre dos lógicas: el control formal-estatutario y el acompañamiento formativo enfocado en el desarrollo continuo</w:t>
-      </w:r>
-      <w:r>
-        <w:t xml:space="preserve"> </w:t>
-      </w:r>
-      <w:r>
-        <w:t xml:space="preserve">(Longo, 2006)</w:t>
+        <w:t xml:space="preserve">. En la educación pública, la evaluación docente suele debatirse entre deux lógicas: el control formal-estatutario y el acompañamiento formativo enfocado en el desarrollo continuo</w:t>
+      </w:r>
+      <w:r>
+        <w:t xml:space="preserve"> </w:t>
+      </w:r>
+      <w:r>
+        <w:t xml:space="preserve">(Longo, 2004)</w:t>
       </w:r>
       <w:r>
         <w:t xml:space="preserve">.</w:t>
@@ -1621,7 +1621,19 @@
         <w:pStyle w:val="BodyText"/>
       </w:pPr>
       <w:r>
-        <w:t xml:space="preserve">Para responder a este interrogante, la literatura especializada destaca el modelo de</w:t>
+        <w:t xml:space="preserve">Para responder a este interrogante, la literatura sobre evaluación docente en el nivel universitario</w:t>
+      </w:r>
+      <w:r>
+        <w:t xml:space="preserve"> </w:t>
+      </w:r>
+      <w:r>
+        <w:t xml:space="preserve">(Obando Freire et al., 2014; Sifuentes Ocegueda, 2016)</w:t>
+      </w:r>
+      <w:r>
+        <w:t xml:space="preserve"> </w:t>
+      </w:r>
+      <w:r>
+        <w:t xml:space="preserve">destaca el modelo de</w:t>
       </w:r>
       <w:r>
         <w:t xml:space="preserve"> </w:t>
@@ -1631,19 +1643,13 @@
           <w:b/>
           <w:bCs/>
         </w:rPr>
-        <w:t xml:space="preserve">evaluación multiactoral o 360 grados</w:t>
-      </w:r>
-      <w:r>
-        <w:t xml:space="preserve"> </w:t>
-      </w:r>
-      <w:r>
-        <w:t xml:space="preserve">(Dalmau et al., 2017; Lepsinger &amp; Lucia, 2009)</w:t>
-      </w:r>
-      <w:r>
-        <w:t xml:space="preserve"> </w:t>
-      </w:r>
-      <w:r>
-        <w:t xml:space="preserve">como una herramienta idónea para articular distintas fuentes de retroalimentación: la reflexión del propio docente, el juicio de colegas de cátedra, la valoración de los estudiantes y el seguimiento institucional.</w:t>
+        <w:t xml:space="preserve">retroalimentación multiactoral o 360 grados</w:t>
+      </w:r>
+      <w:r>
+        <w:t xml:space="preserve"> </w:t>
+      </w:r>
+      <w:r>
+        <w:t xml:space="preserve">como una herramienta idónea para articular distintas fuentes de información: la autoevaluación reflexiva del docente, el juicio valorativo de colegas de cátedra, la apreciación de los estudiantes y el seguimiento institucional.</w:t>
       </w:r>
     </w:p>
     <w:p>
@@ -1651,20 +1657,28 @@
         <w:pStyle w:val="BodyText"/>
       </w:pPr>
       <w:r>
-        <w:t xml:space="preserve">Conviene advertir que</w:t>
-      </w:r>
-      <w:r>
-        <w:t xml:space="preserve"> </w:t>
-      </w:r>
-      <w:r>
-        <w:rPr>
-          <w:b/>
-          <w:bCs/>
-        </w:rPr>
-        <w:t xml:space="preserve">la evaluación 360° no garantiza resultados formativos de forma automática</w:t>
-      </w:r>
-      <w:r>
-        <w:t xml:space="preserve">. Las investigaciones comparadas señalan que su viabilidad depende de condiciones precisas: anonimato y confidencialidad de los datos, instrumentos pedagógicamente válidos, sensibilización previa de los claustros y un clima institucional de confianza que aleje cualquier percepción de control punitivo.</w:t>
+        <w:t xml:space="preserve">Conviene advertir que la aplicación de dispositivos 360° no garantiza resultados formativos de forma automática. Tal como señala la literatura sobre evaluación en organizaciones</w:t>
+      </w:r>
+      <w:r>
+        <w:t xml:space="preserve"> </w:t>
+      </w:r>
+      <w:r>
+        <w:t xml:space="preserve">(Lepsinger &amp; Lucia, 2009)</w:t>
+      </w:r>
+      <w:r>
+        <w:t xml:space="preserve"> </w:t>
+      </w:r>
+      <w:r>
+        <w:t xml:space="preserve">y sus análisis aplicados al ámbito universitario</w:t>
+      </w:r>
+      <w:r>
+        <w:t xml:space="preserve"> </w:t>
+      </w:r>
+      <w:r>
+        <w:t xml:space="preserve">(Obando Freire et al., 2014; Sifuentes Ocegueda, 2016)</w:t>
+      </w:r>
+      <w:r>
+        <w:t xml:space="preserve">, la efectividad y viabilidad del modelo dependen de condiciones metodológicas precisas: resguardo de la confidencialidad y el anonimato, validez pedagógica de los instrumentos, sensibilización previa de los claustros y un clima de confianza institucional que prevenga interpretaciones punitivas.</w:t>
       </w:r>
     </w:p>
     <w:p>
@@ -1717,7 +1731,7 @@
         <w:t xml:space="preserve"> </w:t>
       </w:r>
       <w:r>
-        <w:t xml:space="preserve">(Longo, 2006; Matus, 1993)</w:t>
+        <w:t xml:space="preserve">(Longo, 2004; Matus, 1993)</w:t>
       </w:r>
       <w:r>
         <w:t xml:space="preserve">.</w:t>
@@ -1868,7 +1882,7 @@
         <w:t xml:space="preserve"> </w:t>
       </w:r>
       <w:r>
-        <w:t xml:space="preserve">Longo (2006)</w:t>
+        <w:t xml:space="preserve">Longo (2004)</w:t>
       </w:r>
       <w:r>
         <w:t xml:space="preserve">].</w:t>
@@ -2145,7 +2159,7 @@
         <w:t xml:space="preserve"> </w:t>
       </w:r>
       <w:r>
-        <w:t xml:space="preserve">(Longo, 2006; Matus, 1993)</w:t>
+        <w:t xml:space="preserve">(Longo, 2004; Matus, 1993)</w:t>
       </w:r>
       <w:r>
         <w:t xml:space="preserve">?</w:t>
@@ -2661,7 +2675,7 @@
         <w:t xml:space="preserve"> </w:t>
       </w:r>
       <w:r>
-        <w:t xml:space="preserve">Longo (2006)</w:t>
+        <w:t xml:space="preserve">Longo (2004)</w:t>
       </w:r>
       <w:r>
         <w:t xml:space="preserve"> </w:t>
@@ -2964,7 +2978,7 @@
       </w:r>
     </w:p>
     <w:bookmarkEnd w:id="32"/>
-    <w:bookmarkStart w:id="33" w:name="X296c76344d338238a09b1d3109b3b1ec06ec08f"/>
+    <w:bookmarkStart w:id="33" w:name="X3e337276daa19207d7cf7464738fde0007e6794"/>
     <w:p>
       <w:pPr>
         <w:pStyle w:val="Heading2"/>
@@ -2977,7 +2991,7 @@
           <w:b/>
           <w:sz w:val="24"/>
         </w:rPr>
-        <w:t xml:space="preserve">4.3 Matriz de Consistencia Metodológica y Articulación con Longo (2006)</w:t>
+        <w:t xml:space="preserve">4.3 Matriz de Consistencia Metodológica y Articulación con Longo (2004)</w:t>
       </w:r>
     </w:p>
     <w:p>
@@ -2991,7 +3005,7 @@
         <w:t xml:space="preserve"> </w:t>
       </w:r>
       <w:r>
-        <w:t xml:space="preserve">Longo (2006)</w:t>
+        <w:t xml:space="preserve">Longo (2004)</w:t>
       </w:r>
       <w:r>
         <w:t xml:space="preserve"> </w:t>
@@ -3165,7 +3179,7 @@
               <w:jc w:val="left"/>
             </w:pPr>
             <w:r>
-              <w:t xml:space="preserve">Subsistema de RR.HH. (Longo, 2006)</w:t>
+              <w:t xml:space="preserve">Subsistema de RR.HH. (Longo, 2004)</w:t>
             </w:r>
           </w:p>
         </w:tc>
@@ -3614,7 +3628,7 @@
     </w:p>
     <w:bookmarkEnd w:id="33"/>
     <w:bookmarkEnd w:id="34"/>
-    <w:bookmarkStart w:id="50" w:name="referencias"/>
+    <w:bookmarkStart w:id="52" w:name="referencias"/>
     <w:p>
       <w:pPr>
         <w:pStyle w:val="Heading1"/>
@@ -3631,7 +3645,7 @@
         <w:t xml:space="preserve">Referencias</w:t>
       </w:r>
     </w:p>
-    <w:bookmarkStart w:id="49" w:name="refs"/>
+    <w:bookmarkStart w:id="51" w:name="refs"/>
     <w:bookmarkStart w:id="35" w:name="ref-chiavenato2020"/>
     <w:p>
       <w:pPr>
@@ -3661,7 +3675,7 @@
       </w:r>
     </w:p>
     <w:bookmarkEnd w:id="35"/>
-    <w:bookmarkStart w:id="37" w:name="ref-dalmau2017"/>
+    <w:bookmarkStart w:id="36" w:name="ref-pen2015"/>
     <w:p>
       <w:pPr>
         <w:pStyle w:val="Bibliography"/>
@@ -3670,7 +3684,20 @@
         <w:jc w:val="left"/>
       </w:pPr>
       <w:r>
-        <w:t xml:space="preserve">Dalmau, I., Llinares, S., &amp; Montañana, A. (2017). La evaluación docente del profesorado universitario mediante el modelo 360°: Hacia un sistema formativo e integral.</w:t>
+        <w:t xml:space="preserve">Decreto N° 1246/2015. Convenio Colectivo de Trabajo para los Docentes de las Instituciones Universitarias Nacionales (2015).</w:t>
+      </w:r>
+    </w:p>
+    <w:bookmarkEnd w:id="36"/>
+    <w:bookmarkStart w:id="37" w:name="ref-lepsinger2009"/>
+    <w:p>
+      <w:pPr>
+        <w:pStyle w:val="Bibliography"/>
+        <w:spacing w:after="120"/>
+        <w:ind w:left="720" w:hanging="720"/>
+        <w:jc w:val="left"/>
+      </w:pPr>
+      <w:r>
+        <w:t xml:space="preserve">Lepsinger, R., &amp; Lucia, A. D. (2009).</w:t>
       </w:r>
       <w:r>
         <w:t xml:space="preserve"> </w:t>
@@ -3680,10 +3707,39 @@
           <w:i/>
           <w:iCs/>
         </w:rPr>
-        <w:t xml:space="preserve">Revista de Docencia Universitaria</w:t>
-      </w:r>
-      <w:r>
-        <w:t xml:space="preserve">,</w:t>
+        <w:t xml:space="preserve">The art and science of 360 degree feedback</w:t>
+      </w:r>
+      <w:r>
+        <w:t xml:space="preserve"> </w:t>
+      </w:r>
+      <w:r>
+        <w:t xml:space="preserve">(2.ª ed.). Pfeiffer.</w:t>
+      </w:r>
+    </w:p>
+    <w:bookmarkEnd w:id="37"/>
+    <w:bookmarkStart w:id="38" w:name="ref-ministerio1995"/>
+    <w:p>
+      <w:pPr>
+        <w:pStyle w:val="Bibliography"/>
+        <w:spacing w:after="120"/>
+        <w:ind w:left="720" w:hanging="720"/>
+        <w:jc w:val="left"/>
+      </w:pPr>
+      <w:r>
+        <w:t xml:space="preserve">Ley N° 24.521 de Educación Superior (1995).</w:t>
+      </w:r>
+    </w:p>
+    <w:bookmarkEnd w:id="38"/>
+    <w:bookmarkStart w:id="39" w:name="ref-longo2004"/>
+    <w:p>
+      <w:pPr>
+        <w:pStyle w:val="Bibliography"/>
+        <w:spacing w:after="120"/>
+        <w:ind w:left="720" w:hanging="720"/>
+        <w:jc w:val="left"/>
+      </w:pPr>
+      <w:r>
+        <w:t xml:space="preserve">Longo, F. (2004).</w:t>
       </w:r>
       <w:r>
         <w:t xml:space="preserve"> </w:t>
@@ -3693,25 +3749,90 @@
           <w:i/>
           <w:iCs/>
         </w:rPr>
-        <w:t xml:space="preserve">15</w:t>
-      </w:r>
-      <w:r>
-        <w:t xml:space="preserve">(2), 245-266.</w:t>
-      </w:r>
-      <w:r>
-        <w:t xml:space="preserve"> </w:t>
-      </w:r>
-      <w:hyperlink r:id="rId36">
+        <w:t xml:space="preserve">Mérito y flexibilidad: La gestión de las personas en las organizaciones del sector público</w:t>
+      </w:r>
+      <w:r>
+        <w:t xml:space="preserve">. Paidós.</w:t>
+      </w:r>
+    </w:p>
+    <w:bookmarkEnd w:id="39"/>
+    <w:bookmarkStart w:id="40" w:name="ref-matus1993"/>
+    <w:p>
+      <w:pPr>
+        <w:pStyle w:val="Bibliography"/>
+        <w:spacing w:after="120"/>
+        <w:ind w:left="720" w:hanging="720"/>
+        <w:jc w:val="left"/>
+      </w:pPr>
+      <w:r>
+        <w:t xml:space="preserve">Matus, C. (1993).</w:t>
+      </w:r>
+      <w:r>
+        <w:t xml:space="preserve"> </w:t>
+      </w:r>
+      <w:r>
+        <w:rPr>
+          <w:i/>
+          <w:iCs/>
+        </w:rPr>
+        <w:t xml:space="preserve">Política, planificación y gobierno</w:t>
+      </w:r>
+      <w:r>
+        <w:t xml:space="preserve">. Fundación ALTIDIR.</w:t>
+      </w:r>
+    </w:p>
+    <w:bookmarkEnd w:id="40"/>
+    <w:bookmarkStart w:id="42" w:name="ref-obando2014"/>
+    <w:p>
+      <w:pPr>
+        <w:pStyle w:val="Bibliography"/>
+        <w:spacing w:after="120"/>
+        <w:ind w:left="720" w:hanging="720"/>
+        <w:jc w:val="left"/>
+      </w:pPr>
+      <w:r>
+        <w:t xml:space="preserve">Obando Freire, F., López Fernández, R., Luna Álvarez, D., Luna Álvarez, E., Luna Álvarez, W., &amp; Alpizar Fernández, R. (2014). Sistema de evaluación docente mediante el modelo 360 grados y el portafolio electrónico.</w:t>
+      </w:r>
+      <w:r>
+        <w:t xml:space="preserve"> </w:t>
+      </w:r>
+      <w:r>
+        <w:rPr>
+          <w:i/>
+          <w:iCs/>
+        </w:rPr>
+        <w:t xml:space="preserve">Medisur</w:t>
+      </w:r>
+      <w:r>
+        <w:t xml:space="preserve">,</w:t>
+      </w:r>
+      <w:r>
+        <w:t xml:space="preserve"> </w:t>
+      </w:r>
+      <w:r>
+        <w:rPr>
+          <w:i/>
+          <w:iCs/>
+        </w:rPr>
+        <w:t xml:space="preserve">12</w:t>
+      </w:r>
+      <w:r>
+        <w:t xml:space="preserve">(1), 334-339.</w:t>
+      </w:r>
+      <w:r>
+        <w:t xml:space="preserve"> </w:t>
+      </w:r>
+      <w:hyperlink r:id="rId41">
         <w:r>
           <w:rPr>
             <w:rStyle w:val="Hyperlink"/>
           </w:rPr>
-          <w:t xml:space="preserve">https://doi.org/10.4995/redu.2017.6053</w:t>
+          <w:t xml:space="preserve">https://medisur.sld.cu/index.php/medisur/article/view/2749</w:t>
         </w:r>
       </w:hyperlink>
     </w:p>
-    <w:bookmarkEnd w:id="37"/>
-    <w:bookmarkStart w:id="38" w:name="ref-pen2015"/>
+    <w:bookmarkEnd w:id="42"/>
+    <w:bookmarkStart w:id="43" w:name="ref-oszlak2020"/>
     <w:p>
       <w:pPr>
         <w:pStyle w:val="Bibliography"/>
@@ -3720,11 +3841,24 @@
         <w:jc w:val="left"/>
       </w:pPr>
       <w:r>
-        <w:t xml:space="preserve">Decreto N° 1246/2015. Convenio Colectivo de Trabajo para los Docentes de las Instituciones Universitarias Nacionales (2015).</w:t>
-      </w:r>
-    </w:p>
-    <w:bookmarkEnd w:id="38"/>
-    <w:bookmarkStart w:id="39" w:name="ref-lepsinger2009"/>
+        <w:t xml:space="preserve">Oszlak, O. (2020).</w:t>
+      </w:r>
+      <w:r>
+        <w:t xml:space="preserve"> </w:t>
+      </w:r>
+      <w:r>
+        <w:rPr>
+          <w:i/>
+          <w:iCs/>
+        </w:rPr>
+        <w:t xml:space="preserve">El Estado en la era exponencial</w:t>
+      </w:r>
+      <w:r>
+        <w:t xml:space="preserve">. Instituto Nacional de la Administración Pública.</w:t>
+      </w:r>
+    </w:p>
+    <w:bookmarkEnd w:id="43"/>
+    <w:bookmarkStart w:id="44" w:name="ref-sautu2005"/>
     <w:p>
       <w:pPr>
         <w:pStyle w:val="Bibliography"/>
@@ -3733,7 +3867,7 @@
         <w:jc w:val="left"/>
       </w:pPr>
       <w:r>
-        <w:t xml:space="preserve">Lepsinger, R., &amp; Lucia, A. D. (2009).</w:t>
+        <w:t xml:space="preserve">Sautu, R. (2005).</w:t>
       </w:r>
       <w:r>
         <w:t xml:space="preserve"> </w:t>
@@ -3743,17 +3877,14 @@
           <w:i/>
           <w:iCs/>
         </w:rPr>
-        <w:t xml:space="preserve">The art and science of 360 degree feedback</w:t>
-      </w:r>
-      <w:r>
-        <w:t xml:space="preserve"> </w:t>
-      </w:r>
-      <w:r>
-        <w:t xml:space="preserve">(2.ª ed.). Pfeiffer.</w:t>
-      </w:r>
-    </w:p>
-    <w:bookmarkEnd w:id="39"/>
-    <w:bookmarkStart w:id="40" w:name="ref-ministerio1995"/>
+        <w:t xml:space="preserve">Todo es teoría: Objetivos y métodos de investigación</w:t>
+      </w:r>
+      <w:r>
+        <w:t xml:space="preserve">. Lumiere.</w:t>
+      </w:r>
+    </w:p>
+    <w:bookmarkEnd w:id="44"/>
+    <w:bookmarkStart w:id="46" w:name="ref-sifuentes2016"/>
     <w:p>
       <w:pPr>
         <w:pStyle w:val="Bibliography"/>
@@ -3762,11 +3893,48 @@
         <w:jc w:val="left"/>
       </w:pPr>
       <w:r>
-        <w:t xml:space="preserve">Ley N° 24.521 de Educación Superior (1995).</w:t>
-      </w:r>
-    </w:p>
-    <w:bookmarkEnd w:id="40"/>
-    <w:bookmarkStart w:id="41" w:name="ref-longo2006"/>
+        <w:t xml:space="preserve">Sifuentes Ocegueda, E. (2016). La evaluación de 360° aplicada al personal docente de nivel superior.</w:t>
+      </w:r>
+      <w:r>
+        <w:t xml:space="preserve"> </w:t>
+      </w:r>
+      <w:r>
+        <w:rPr>
+          <w:i/>
+          <w:iCs/>
+        </w:rPr>
+        <w:t xml:space="preserve">Revista de Investigación en Tecnologías de la Información (RITI)</w:t>
+      </w:r>
+      <w:r>
+        <w:t xml:space="preserve">,</w:t>
+      </w:r>
+      <w:r>
+        <w:t xml:space="preserve"> </w:t>
+      </w:r>
+      <w:r>
+        <w:rPr>
+          <w:i/>
+          <w:iCs/>
+        </w:rPr>
+        <w:t xml:space="preserve">4</w:t>
+      </w:r>
+      <w:r>
+        <w:t xml:space="preserve">(8), 38-44.</w:t>
+      </w:r>
+      <w:r>
+        <w:t xml:space="preserve"> </w:t>
+      </w:r>
+      <w:hyperlink r:id="rId45">
+        <w:r>
+          <w:rPr>
+            <w:rStyle w:val="Hyperlink"/>
+          </w:rPr>
+          <w:t xml:space="preserve">https://dialnet.unirioja.es/descarga/articulo/7242790.pdf</w:t>
+        </w:r>
+      </w:hyperlink>
+    </w:p>
+    <w:bookmarkEnd w:id="46"/>
+    <w:bookmarkStart w:id="47" w:name="ref-unco2009"/>
     <w:p>
       <w:pPr>
         <w:pStyle w:val="Bibliography"/>
@@ -3775,7 +3943,7 @@
         <w:jc w:val="left"/>
       </w:pPr>
       <w:r>
-        <w:t xml:space="preserve">Longo, F. (2006).</w:t>
+        <w:t xml:space="preserve">Universidad Nacional del Comahue. (2009).</w:t>
       </w:r>
       <w:r>
         <w:t xml:space="preserve"> </w:t>
@@ -3785,14 +3953,14 @@
           <w:i/>
           <w:iCs/>
         </w:rPr>
-        <w:t xml:space="preserve">Mérito y flexibilidad: La gestión de las personas en las organizaciones del sector público</w:t>
-      </w:r>
-      <w:r>
-        <w:t xml:space="preserve">. Paidós.</w:t>
-      </w:r>
-    </w:p>
-    <w:bookmarkEnd w:id="41"/>
-    <w:bookmarkStart w:id="42" w:name="ref-matus1993"/>
+        <w:t xml:space="preserve">Ordenanza N° 470/2009: Estatuto de la Universidad Nacional del Comahue</w:t>
+      </w:r>
+      <w:r>
+        <w:t xml:space="preserve">.</w:t>
+      </w:r>
+    </w:p>
+    <w:bookmarkEnd w:id="47"/>
+    <w:bookmarkStart w:id="48" w:name="ref-unco2019"/>
     <w:p>
       <w:pPr>
         <w:pStyle w:val="Bibliography"/>
@@ -3801,7 +3969,7 @@
         <w:jc w:val="left"/>
       </w:pPr>
       <w:r>
-        <w:t xml:space="preserve">Matus, C. (1993).</w:t>
+        <w:t xml:space="preserve">Universidad Nacional del Comahue. (2019).</w:t>
       </w:r>
       <w:r>
         <w:t xml:space="preserve"> </w:t>
@@ -3811,14 +3979,14 @@
           <w:i/>
           <w:iCs/>
         </w:rPr>
-        <w:t xml:space="preserve">Política, planificación y gobierno</w:t>
-      </w:r>
-      <w:r>
-        <w:t xml:space="preserve">. Fundación ALTIDIR.</w:t>
-      </w:r>
-    </w:p>
-    <w:bookmarkEnd w:id="42"/>
-    <w:bookmarkStart w:id="43" w:name="ref-oszlak2020"/>
+        <w:t xml:space="preserve">Ordenanza N° 0920/2019: Reglamento de Carrera Docente</w:t>
+      </w:r>
+      <w:r>
+        <w:t xml:space="preserve">.</w:t>
+      </w:r>
+    </w:p>
+    <w:bookmarkEnd w:id="48"/>
+    <w:bookmarkStart w:id="49" w:name="ref-uncocurzas2023"/>
     <w:p>
       <w:pPr>
         <w:pStyle w:val="Bibliography"/>
@@ -3827,7 +3995,7 @@
         <w:jc w:val="left"/>
       </w:pPr>
       <w:r>
-        <w:t xml:space="preserve">Oszlak, O. (2020).</w:t>
+        <w:t xml:space="preserve">Universidad Nacional del Comahue - CURZAS. (2023).</w:t>
       </w:r>
       <w:r>
         <w:t xml:space="preserve"> </w:t>
@@ -3837,14 +4005,14 @@
           <w:i/>
           <w:iCs/>
         </w:rPr>
-        <w:t xml:space="preserve">El Estado en la era del exponente tecnológico: Hacia una burocracia 4.0</w:t>
-      </w:r>
-      <w:r>
-        <w:t xml:space="preserve">. Instituto Nacional de la Administración Pública.</w:t>
-      </w:r>
-    </w:p>
-    <w:bookmarkEnd w:id="43"/>
-    <w:bookmarkStart w:id="44" w:name="ref-sautu2005"/>
+        <w:t xml:space="preserve">Resolución CD-CURZAS N° 266/2023: Reglamento de Trabajo Final de Graduación (TFG) para las carreras del Departamento de Administración Pública</w:t>
+      </w:r>
+      <w:r>
+        <w:t xml:space="preserve">.</w:t>
+      </w:r>
+    </w:p>
+    <w:bookmarkEnd w:id="49"/>
+    <w:bookmarkStart w:id="50" w:name="ref-wainerman2011"/>
     <w:p>
       <w:pPr>
         <w:pStyle w:val="Bibliography"/>
@@ -3853,7 +4021,7 @@
         <w:jc w:val="left"/>
       </w:pPr>
       <w:r>
-        <w:t xml:space="preserve">Sautu, R. (2005).</w:t>
+        <w:t xml:space="preserve">Wainerman, C., &amp; Sautu, R. (2011).</w:t>
       </w:r>
       <w:r>
         <w:t xml:space="preserve"> </w:t>
@@ -3863,110 +4031,6 @@
           <w:i/>
           <w:iCs/>
         </w:rPr>
-        <w:t xml:space="preserve">Todo es teoría: Objetivos y métodos de investigación</w:t>
-      </w:r>
-      <w:r>
-        <w:t xml:space="preserve">. Lumiere.</w:t>
-      </w:r>
-    </w:p>
-    <w:bookmarkEnd w:id="44"/>
-    <w:bookmarkStart w:id="45" w:name="ref-unco2009"/>
-    <w:p>
-      <w:pPr>
-        <w:pStyle w:val="Bibliography"/>
-        <w:spacing w:after="120"/>
-        <w:ind w:left="720" w:hanging="720"/>
-        <w:jc w:val="left"/>
-      </w:pPr>
-      <w:r>
-        <w:t xml:space="preserve">Universidad Nacional del Comahue. (2009).</w:t>
-      </w:r>
-      <w:r>
-        <w:t xml:space="preserve"> </w:t>
-      </w:r>
-      <w:r>
-        <w:rPr>
-          <w:i/>
-          <w:iCs/>
-        </w:rPr>
-        <w:t xml:space="preserve">Ordenanza N° 470/2009: Estatuto de la Universidad Nacional del Comahue</w:t>
-      </w:r>
-      <w:r>
-        <w:t xml:space="preserve">.</w:t>
-      </w:r>
-    </w:p>
-    <w:bookmarkEnd w:id="45"/>
-    <w:bookmarkStart w:id="46" w:name="ref-unco2019"/>
-    <w:p>
-      <w:pPr>
-        <w:pStyle w:val="Bibliography"/>
-        <w:spacing w:after="120"/>
-        <w:ind w:left="720" w:hanging="720"/>
-        <w:jc w:val="left"/>
-      </w:pPr>
-      <w:r>
-        <w:t xml:space="preserve">Universidad Nacional del Comahue. (2019).</w:t>
-      </w:r>
-      <w:r>
-        <w:t xml:space="preserve"> </w:t>
-      </w:r>
-      <w:r>
-        <w:rPr>
-          <w:i/>
-          <w:iCs/>
-        </w:rPr>
-        <w:t xml:space="preserve">Ordenanza N° 0920/2019: Reglamento de Carrera Docente</w:t>
-      </w:r>
-      <w:r>
-        <w:t xml:space="preserve">.</w:t>
-      </w:r>
-    </w:p>
-    <w:bookmarkEnd w:id="46"/>
-    <w:bookmarkStart w:id="47" w:name="ref-uncocurzas2023"/>
-    <w:p>
-      <w:pPr>
-        <w:pStyle w:val="Bibliography"/>
-        <w:spacing w:after="120"/>
-        <w:ind w:left="720" w:hanging="720"/>
-        <w:jc w:val="left"/>
-      </w:pPr>
-      <w:r>
-        <w:t xml:space="preserve">Universidad Nacional del Comahue - CURZAS. (2023).</w:t>
-      </w:r>
-      <w:r>
-        <w:t xml:space="preserve"> </w:t>
-      </w:r>
-      <w:r>
-        <w:rPr>
-          <w:i/>
-          <w:iCs/>
-        </w:rPr>
-        <w:t xml:space="preserve">Resolución CD-CURZAS N° 266/2023: Reglamento de Trabajo Final de Graduación (TFG) para las carreras del Departamento de Administración Pública</w:t>
-      </w:r>
-      <w:r>
-        <w:t xml:space="preserve">.</w:t>
-      </w:r>
-    </w:p>
-    <w:bookmarkEnd w:id="47"/>
-    <w:bookmarkStart w:id="48" w:name="ref-wainerman2011"/>
-    <w:p>
-      <w:pPr>
-        <w:pStyle w:val="Bibliography"/>
-        <w:spacing w:after="120"/>
-        <w:ind w:left="720" w:hanging="720"/>
-        <w:jc w:val="left"/>
-      </w:pPr>
-      <w:r>
-        <w:t xml:space="preserve">Wainerman, C., &amp; Sautu, R. (2011).</w:t>
-      </w:r>
-      <w:r>
-        <w:t xml:space="preserve"> </w:t>
-      </w:r>
-      <w:r>
-        <w:rPr>
-          <w:i/>
-          <w:iCs/>
-        </w:rPr>
         <w:t xml:space="preserve">La trastienda de la investigación</w:t>
       </w:r>
       <w:r>
@@ -3976,9 +4040,9 @@
         <w:t xml:space="preserve">(4.ª ed.). Manantial.</w:t>
       </w:r>
     </w:p>
-    <w:bookmarkEnd w:id="48"/>
-    <w:bookmarkEnd w:id="49"/>
     <w:bookmarkEnd w:id="50"/>
+    <w:bookmarkEnd w:id="51"/>
+    <w:bookmarkEnd w:id="52"/>
     <w:sectPr>
       <w:footerReference w:type="default" r:id="rId11"/>
       <w:footnotePr>

</xml_diff>

<commit_message>
feat: add Quarto source files, bibliography, and compiled documents for Actividad 2 research project
</commit_message>
<xml_diff>
--- a/Entregas/Actividad 2/TP2_Ayarachi_Fuentes.docx
+++ b/Entregas/Actividad 2/TP2_Ayarachi_Fuentes.docx
@@ -441,7 +441,7 @@
           <w:rFonts w:ascii="Arial" w:hAnsi="Arial"/>
           <w:sz w:val="22"/>
         </w:rPr>
-        <w:t>3</w:t>
+        <w:t>4</w:t>
       </w:r>
     </w:p>
     <w:p>
@@ -468,7 +468,7 @@
           <w:rFonts w:ascii="Arial" w:hAnsi="Arial"/>
           <w:sz w:val="22"/>
         </w:rPr>
-        <w:t>3</w:t>
+        <w:t>4</w:t>
       </w:r>
     </w:p>
     <w:p>
@@ -495,7 +495,7 @@
           <w:rFonts w:ascii="Arial" w:hAnsi="Arial"/>
           <w:sz w:val="22"/>
         </w:rPr>
-        <w:t>4</w:t>
+        <w:t>5</w:t>
       </w:r>
     </w:p>
     <w:p>
@@ -603,7 +603,7 @@
           <w:rFonts w:ascii="Arial" w:hAnsi="Arial"/>
           <w:sz w:val="22"/>
         </w:rPr>
-        <w:t>6</w:t>
+        <w:t>7</w:t>
       </w:r>
     </w:p>
     <w:p>
@@ -657,7 +657,7 @@
           <w:rFonts w:ascii="Arial" w:hAnsi="Arial"/>
           <w:sz w:val="22"/>
         </w:rPr>
-        <w:t>7</w:t>
+        <w:t>8</w:t>
       </w:r>
     </w:p>
     <w:p>
@@ -684,7 +684,7 @@
           <w:rFonts w:ascii="Arial" w:hAnsi="Arial"/>
           <w:sz w:val="22"/>
         </w:rPr>
-        <w:t>7</w:t>
+        <w:t>8</w:t>
       </w:r>
     </w:p>
     <w:p>
@@ -711,7 +711,7 @@
           <w:rFonts w:ascii="Arial" w:hAnsi="Arial"/>
           <w:sz w:val="22"/>
         </w:rPr>
-        <w:t>7</w:t>
+        <w:t>8</w:t>
       </w:r>
     </w:p>
     <w:p>
@@ -765,7 +765,7 @@
           <w:rFonts w:ascii="Arial" w:hAnsi="Arial"/>
           <w:sz w:val="22"/>
         </w:rPr>
-        <w:t>8</w:t>
+        <w:t>9</w:t>
       </w:r>
     </w:p>
     <w:p>
@@ -792,7 +792,7 @@
           <w:rFonts w:ascii="Arial" w:hAnsi="Arial"/>
           <w:sz w:val="22"/>
         </w:rPr>
-        <w:t>8</w:t>
+        <w:t>9</w:t>
       </w:r>
     </w:p>
     <w:p>
@@ -819,7 +819,7 @@
           <w:rFonts w:ascii="Arial" w:hAnsi="Arial"/>
           <w:sz w:val="22"/>
         </w:rPr>
-        <w:t>8</w:t>
+        <w:t>9</w:t>
       </w:r>
     </w:p>
     <w:p>
@@ -1284,7 +1284,7 @@
         <w:t xml:space="preserve"> </w:t>
       </w:r>
       <w:r>
-        <w:t xml:space="preserve">para orientarse hacia un enfoque formativo de aprendizaje continuo. Para ello, se analiza la factibilidad de un modelo de</w:t>
+        <w:t xml:space="preserve">para orientarse hacia un enfoque formativo de aprendizaje continuo. Para lograrlo, la investigación examina la factibilidad de un modelo de</w:t>
       </w:r>
       <w:r>
         <w:t xml:space="preserve"> </w:t>
@@ -1297,16 +1297,19 @@
         <w:t xml:space="preserve">retroalimentación 360 grados</w:t>
       </w:r>
       <w:r>
-        <w:t xml:space="preserve">, que articula diversas fuentes sobre la labor docente (autoevaluación, valoración de pares, apreciación de los estudiantes e integración de portafolios) en el ámbito de la educación superior</w:t>
-      </w:r>
-      <w:r>
-        <w:t xml:space="preserve"> </w:t>
-      </w:r>
-      <w:r>
-        <w:t xml:space="preserve">(Obando Freire et al., 2014; Sifuentes Ocegueda, 2016)</w:t>
-      </w:r>
-      <w:r>
-        <w:t xml:space="preserve">, sobre la cual el presente proyecto propone incorporar formalmente la mirada de los directores departamentales como actores clave de la gestión universitaria.</w:t>
+        <w:t xml:space="preserve"> </w:t>
+      </w:r>
+      <w:r>
+        <w:t xml:space="preserve">adaptado al ámbito de la educación superior</w:t>
+      </w:r>
+      <w:r>
+        <w:t xml:space="preserve"> </w:t>
+      </w:r>
+      <w:r>
+        <w:t xml:space="preserve">(Luna Álvarez et al., 2014)</w:t>
+      </w:r>
+      <w:r>
+        <w:t xml:space="preserve">. La singularidad de esta propuesta radica en situar dicho modelo en una universidad pública patagónica signada por el cogobierno colegiado, la negociación paritaria y la atención a entornos híbridos de enseñanza en su Red de Nodos Territoriales, articulando la mirada del propio docente, de los colegas de cátedra, de los estudiantes y de las autoridades departamentales.</w:t>
       </w:r>
     </w:p>
     <w:bookmarkEnd w:id="16"/>
@@ -1428,13 +1431,13 @@
         <w:pStyle w:val="BodyText"/>
       </w:pPr>
       <w:r>
-        <w:t xml:space="preserve">En el plano normativo, la actividad docente en el CURZAS se encuentra reglada por el Estatuto de la UNCo</w:t>
-      </w:r>
-      <w:r>
-        <w:t xml:space="preserve"> </w:t>
-      </w:r>
-      <w:r>
-        <w:t xml:space="preserve">(Ordenanza N° 470/2009 y sus modificatorias, Universidad Nacional del Comahue, 2009)</w:t>
+        <w:t xml:space="preserve">En el plano normativo, la actividad docente en el CURZAS —definido estatutariamente como Complejo Universitario Regional (Art. 17 y Disposición Transitoria Cuarta del nuevo Estatuto)— se encuentra reglada por el Estatuto de la UNCo</w:t>
+      </w:r>
+      <w:r>
+        <w:t xml:space="preserve"> </w:t>
+      </w:r>
+      <w:r>
+        <w:t xml:space="preserve">(Ordenanza CS N° 0988/2025 (texto ordenado), Universidad Nacional del Comahue, 2025)</w:t>
       </w:r>
       <w:r>
         <w:t xml:space="preserve">, el Reglamento de Carrera Docente</w:t>
@@ -1443,22 +1446,22 @@
         <w:t xml:space="preserve"> </w:t>
       </w:r>
       <w:r>
-        <w:t xml:space="preserve">(Ordenanza N° 0920/2019 y sus normas complementarias, Universidad Nacional del Comahue, 2019)</w:t>
-      </w:r>
-      <w:r>
-        <w:t xml:space="preserve"> </w:t>
-      </w:r>
-      <w:r>
-        <w:t xml:space="preserve">y el Convenio Colectivo de Trabajo Docente homologado por Decreto N° 1246/2015</w:t>
-      </w:r>
-      <w:r>
-        <w:t xml:space="preserve"> </w:t>
-      </w:r>
-      <w:r>
-        <w:t xml:space="preserve">(Decreto N° 1246/2015. Convenio Colectivo de Trabajo para los Docentes de las Instituciones Universitarias Nacionales, 2015)</w:t>
-      </w:r>
-      <w:r>
-        <w:t xml:space="preserve">. Estos instrumentos fijan mecanismos periódicos de evaluación con fines de permanencia y promoción, que incluyen informes de labor académica, dictámenes de pares y encuestas estudiantiles de fin de cuatrimestre.</w:t>
+        <w:t xml:space="preserve">(Ordenanza CS N° 0920/2019 y sus modificatorias, Universidad Nacional del Comahue, 2019)</w:t>
+      </w:r>
+      <w:r>
+        <w:t xml:space="preserve"> </w:t>
+      </w:r>
+      <w:r>
+        <w:t xml:space="preserve">y el Convenio Colectivo de Trabajo Docente</w:t>
+      </w:r>
+      <w:r>
+        <w:t xml:space="preserve"> </w:t>
+      </w:r>
+      <w:r>
+        <w:t xml:space="preserve">(Decreto N° 1246/2015, Decreto N° 1246/2015. Convenio Colectivo de Trabajo para los Docentes de las Instituciones Universitarias Nacionales, 2015)</w:t>
+      </w:r>
+      <w:r>
+        <w:t xml:space="preserve">. Estos instrumentos fijan el régimen de ingreso y ascenso mediante concursos públicos de antecedentes y oposición (Arts. 67 y 70), así como la evaluación obligatoria de la inserción y permanencia docente (Art. 74) a través de dos mecanismos estatutarios: informes anuales (que incluyen plan de trabajo, avance, opinión de la Dirección del Departamento y encuestas estudiantiles obligatorias, Art. 75) y evaluaciones cuatrienales a cargo de jurados evaluadores (Art. 76).</w:t>
       </w:r>
     </w:p>
     <w:p>
@@ -1476,13 +1479,19 @@
           <w:b/>
           <w:bCs/>
         </w:rPr>
-        <w:t xml:space="preserve">supuesto de partida e hipótesis exploratoria</w:t>
-      </w:r>
-      <w:r>
-        <w:t xml:space="preserve"> </w:t>
-      </w:r>
-      <w:r>
-        <w:t xml:space="preserve">que, en la dinámica cotidiana, dichos dispositivos podrían estar funcionando prioritariamente con un sentido administrativo y sumativo, enfocado en el cumplimiento reglamentario. No obstante, lejos de asumir una conclusión anticipada,</w:t>
+        <w:t xml:space="preserve">supuesto orientador de investigación</w:t>
+      </w:r>
+      <w:r>
+        <w:t xml:space="preserve"> </w:t>
+      </w:r>
+      <w:r>
+        <w:t xml:space="preserve">(Sautu, 2005)</w:t>
+      </w:r>
+      <w:r>
+        <w:t xml:space="preserve"> </w:t>
+      </w:r>
+      <w:r>
+        <w:t xml:space="preserve">que, en la dinámica cotidiana, dichos dispositivos estatutarios podrían estar funcionando prioritariamente con un sentido administrativo y sumativo, enfocado en la acreditación reglamentaria de permanencia. No obstante, lejos de asumir una conclusión anticipada,</w:t>
       </w:r>
       <w:r>
         <w:t xml:space="preserve"> </w:t>
@@ -1498,7 +1507,7 @@
         <w:t xml:space="preserve"> </w:t>
       </w:r>
       <w:r>
-        <w:t xml:space="preserve">estas herramientas operan de manera aislada o si generan instancias efectivas de retroalimentación pedagógica. Examinar si los resultados evaluativos se vinculan efectivamente con planes de capacitación y mejora docente constituye el objetivo central del relevamiento de campo para el período</w:t>
+        <w:t xml:space="preserve">estas herramientas generan instancias efectivas de retroalimentación pedagógica y si sus resultados se vinculan efectivamente con planes de formación docente para el período</w:t>
       </w:r>
       <w:r>
         <w:t xml:space="preserve"> </w:t>
@@ -1570,7 +1579,7 @@
         <w:t xml:space="preserve">(Wainerman &amp; Sautu, 2011)</w:t>
       </w:r>
       <w:r>
-        <w:t xml:space="preserve">. En la educación pública, la evaluación docente suele debatirse entre deux lógicas: el control formal-estatutario y el acompañamiento formativo enfocado en el desarrollo continuo</w:t>
+        <w:t xml:space="preserve">. En la educación pública, la evaluación docente suele debatirse entre dos lógicas: el control formal-estatutario y el acompañamiento formativo enfocado en el desarrollo continuo</w:t>
       </w:r>
       <w:r>
         <w:t xml:space="preserve"> </w:t>
@@ -1627,7 +1636,7 @@
         <w:t xml:space="preserve"> </w:t>
       </w:r>
       <w:r>
-        <w:t xml:space="preserve">(Obando Freire et al., 2014; Sifuentes Ocegueda, 2016)</w:t>
+        <w:t xml:space="preserve">(Luna Álvarez et al., 2014)</w:t>
       </w:r>
       <w:r>
         <w:t xml:space="preserve"> </w:t>
@@ -1649,7 +1658,7 @@
         <w:t xml:space="preserve"> </w:t>
       </w:r>
       <w:r>
-        <w:t xml:space="preserve">como una herramienta idónea para articular distintas fuentes de información: la autoevaluación reflexiva del docente, el juicio valorativo de colegas de cátedra, la apreciación de los estudiantes y el seguimiento institucional.</w:t>
+        <w:t xml:space="preserve">como un dispositivo valioso para articular la autoevaluación reflexiva del profesorado, el juicio de valor entre pares, la apreciación estudiantil y la valoración de las autoridades académicas.</w:t>
       </w:r>
     </w:p>
     <w:p>
@@ -1657,28 +1666,33 @@
         <w:pStyle w:val="BodyText"/>
       </w:pPr>
       <w:r>
-        <w:t xml:space="preserve">Conviene advertir que la aplicación de dispositivos 360° no garantiza resultados formativos de forma automática. Tal como señala la literatura sobre evaluación en organizaciones</w:t>
-      </w:r>
-      <w:r>
-        <w:t xml:space="preserve"> </w:t>
-      </w:r>
-      <w:r>
-        <w:t xml:space="preserve">(Lepsinger &amp; Lucia, 2009)</w:t>
-      </w:r>
-      <w:r>
-        <w:t xml:space="preserve"> </w:t>
-      </w:r>
-      <w:r>
-        <w:t xml:space="preserve">y sus análisis aplicados al ámbito universitario</w:t>
-      </w:r>
-      <w:r>
-        <w:t xml:space="preserve"> </w:t>
-      </w:r>
-      <w:r>
-        <w:t xml:space="preserve">(Obando Freire et al., 2014; Sifuentes Ocegueda, 2016)</w:t>
-      </w:r>
-      <w:r>
-        <w:t xml:space="preserve">, la efectividad y viabilidad del modelo dependen de condiciones metodológicas precisas: resguardo de la confidencialidad y el anonimato, validez pedagógica de los instrumentos, sensibilización previa de los claustros y un clima de confianza institucional que prevenga interpretaciones punitivas.</w:t>
+        <w:t xml:space="preserve">En una universidad pública cogobernada, es indispensable</w:t>
+      </w:r>
+      <w:r>
+        <w:t xml:space="preserve"> </w:t>
+      </w:r>
+      <w:r>
+        <w:rPr>
+          <w:b/>
+          <w:bCs/>
+        </w:rPr>
+        <w:t xml:space="preserve">diferenciar la evaluación orientada a la mejora pedagógica de aquella vinculada a decisiones laborales sumativas</w:t>
+      </w:r>
+      <w:r>
+        <w:t xml:space="preserve">. Dado que el Estatuto sanciona que dos evaluaciones cuatrienales consecutivas negativas determinan la vacancia del cargo y llamado a concurso público (Art. 76, inc. c), existe una comprensible prevención docente frente a controles auditadores. Si bien la normativa vigente ya contempla la opinión del Director del Departamento en los informes anuales del legajo académico (Art. 75), la singularidad y valor añadido de este proyecto radica en analizar la factibilidad de un</w:t>
+      </w:r>
+      <w:r>
+        <w:t xml:space="preserve"> </w:t>
+      </w:r>
+      <w:r>
+        <w:rPr>
+          <w:b/>
+          <w:bCs/>
+        </w:rPr>
+        <w:t xml:space="preserve">circuito de retroalimentación 360° estrictamente formativo, confidencial e independiente del legajo sumativo</w:t>
+      </w:r>
+      <w:r>
+        <w:t xml:space="preserve">.</w:t>
       </w:r>
     </w:p>
     <w:p>
@@ -1686,23 +1700,7 @@
         <w:pStyle w:val="BodyText"/>
       </w:pPr>
       <w:r>
-        <w:t xml:space="preserve">En una universidad pública cogobernada, es indispensable</w:t>
-      </w:r>
-      <w:r>
-        <w:t xml:space="preserve"> </w:t>
-      </w:r>
-      <w:r>
-        <w:rPr>
-          <w:b/>
-          <w:bCs/>
-        </w:rPr>
-        <w:t xml:space="preserve">diferenciar la evaluación orientada a la mejora pedagógica de aquella vinculada a decisiones laborales sumativas</w:t>
-      </w:r>
-      <w:r>
-        <w:t xml:space="preserve"> </w:t>
-      </w:r>
-      <w:r>
-        <w:t xml:space="preserve">(como la permanencia o promoción regladas por la Ordenanza N° 0920/2019 y modificatorias, y el CCT Docente, Decreto N° 1246/2015). Trasladar herramientas de gestión sin cuidar esta frontera o sin el acuerdo de los claustros podría despertar comprensibles prevenciones. Por eso, la viabilidad de cualquier propuesta descansa en la</w:t>
+        <w:t xml:space="preserve">Dicho dispositivo busca articular los insumos de los claustros (docentes y estudiantes) y de la Dirección del Departamento —quien es electa por sus propios pares docentes por un período de dos años (Art. 14)— para alimentar de forma directa el Programa Anual de Formación de Recursos Humanos del Departamento (Art. 77) y el perfeccionamiento continuo de la Carrera Docente (Art. 66). Por ello, la viabilidad de la propuesta descansa en la</w:t>
       </w:r>
       <w:r>
         <w:t xml:space="preserve"> </w:t>
@@ -1942,7 +1940,7 @@
         <w:t xml:space="preserve"> </w:t>
       </w:r>
       <w:r>
-        <w:t xml:space="preserve">Formulación del problema, revisión bibliográfica sistemática sobre evaluación 360°, análisis normativo institucional (Estatuto UNCo, Ordenanzas CS N° 470/2009 y N° 0920/2019 con sus modificatorias, y CCT Docente Decreto N° 1246/2015) y diseño metodológico.</w:t>
+        <w:t xml:space="preserve">Formulación del problema, revisión bibliográfica sistemática sobre evaluación 360°, análisis normativo institucional (Estatuto UNCo, Ordenanza CS N° 0988/2025; Carrera Docente, Ordenanza CS N° 0920/2019 con sus modificatorias; y CCT Docente, Decreto N° 1246/2015) y diseño metodológico.</w:t>
       </w:r>
     </w:p>
     <w:p>
@@ -2065,7 +2063,7 @@
         <w:pStyle w:val="BodyText"/>
       </w:pPr>
       <w:r>
-        <w:t xml:space="preserve">En términos prácticos, determinar si el modelo es factible en el Departamento de Administración Pública del CURZAS implica responder a cuatro interrogantes centrales:</w:t>
+        <w:t xml:space="preserve">En términos prácticos, determinar si el modelo es factible en el Departamento de Administración Pública del CURZAS exige responder a cinco interrogantes centrales, correspondientes punto por punto con sus dimensiones analíticas:</w:t>
       </w:r>
       <w:r>
         <w:t xml:space="preserve"> </w:t>
@@ -2081,13 +2079,13 @@
           <w:b/>
           <w:bCs/>
         </w:rPr>
-        <w:t xml:space="preserve">Compatibilidad jurídica:</w:t>
-      </w:r>
-      <w:r>
-        <w:t xml:space="preserve"> </w:t>
-      </w:r>
-      <w:r>
-        <w:t xml:space="preserve">¿Puede aplicarse con fines formativos sin colisionar con la estabilidad laboral regulada por el Estatuto UNCo, la Carrera Docente (Ord. N° 0920/2019 y modificatorias) y el CCT Docente (Decreto N° 1246/2015)?</w:t>
+        <w:t xml:space="preserve">Factibilidad Normativa y Estatutaria:</w:t>
+      </w:r>
+      <w:r>
+        <w:t xml:space="preserve"> </w:t>
+      </w:r>
+      <w:r>
+        <w:t xml:space="preserve">¿Puede aplicarse con fines formativos sin colisionar con la estabilidad laboral regulada por el Estatuto UNCo (Ord. N° 0988/2025), la Carrera Docente (Ord. N° 0920/2019 y modificatorias) y el CCT Docente (Decreto N° 1246/2015)?</w:t>
       </w:r>
       <w:r>
         <w:t xml:space="preserve"> </w:t>
@@ -2103,13 +2101,13 @@
           <w:b/>
           <w:bCs/>
         </w:rPr>
-        <w:t xml:space="preserve">Capacidad técnica y de gestión:</w:t>
-      </w:r>
-      <w:r>
-        <w:t xml:space="preserve"> </w:t>
-      </w:r>
-      <w:r>
-        <w:t xml:space="preserve">¿Existen plataformas informáticas (SIU-Guaraní, campus virtual) y circuitos administrativos capaces de resguardar el anonimato y procesar devoluciones oportunas?</w:t>
+        <w:t xml:space="preserve">Factibilidad Técnica e Instrumental:</w:t>
+      </w:r>
+      <w:r>
+        <w:t xml:space="preserve"> </w:t>
+      </w:r>
+      <w:r>
+        <w:t xml:space="preserve">¿Existen plataformas informáticas (SIU-Guaraní, campus virtual) e instrumentos pedagógicamente válidos capaces de resguardar el anonimato?</w:t>
       </w:r>
       <w:r>
         <w:t xml:space="preserve"> </w:t>
@@ -2125,13 +2123,13 @@
           <w:b/>
           <w:bCs/>
         </w:rPr>
-        <w:t xml:space="preserve">Aceptación y confianza de los claustros:</w:t>
-      </w:r>
-      <w:r>
-        <w:t xml:space="preserve"> </w:t>
-      </w:r>
-      <w:r>
-        <w:t xml:space="preserve">¿Existe disposición en docentes, estudiantes y autoridades para participar en una evaluación multiactoral, disipando temores a controles punitivos?</w:t>
+        <w:t xml:space="preserve">Factibilidad Organizacional y Procedimental:</w:t>
+      </w:r>
+      <w:r>
+        <w:t xml:space="preserve"> </w:t>
+      </w:r>
+      <w:r>
+        <w:t xml:space="preserve">¿Cuenta el departamento con circuitos administrativos, roles institucionales y tiempos de gestión idóneos para procesar devoluciones oportunas?</w:t>
       </w:r>
       <w:r>
         <w:t xml:space="preserve"> </w:t>
@@ -2147,13 +2145,35 @@
           <w:b/>
           <w:bCs/>
         </w:rPr>
-        <w:t xml:space="preserve">Legitimidad en el cogobierno:</w:t>
-      </w:r>
-      <w:r>
-        <w:t xml:space="preserve"> </w:t>
-      </w:r>
-      <w:r>
-        <w:t xml:space="preserve">¿Cuenta la propuesta con viabilidad política para ser tratada y consensuada en los órganos colegiados sobre variables de control compartido</w:t>
+        <w:t xml:space="preserve">Factibilidad Cultural y Actitudinal:</w:t>
+      </w:r>
+      <w:r>
+        <w:t xml:space="preserve"> </w:t>
+      </w:r>
+      <w:r>
+        <w:t xml:space="preserve">¿Existe disposición favorable en los claustros involucrados (docentes y estudiantes) y en las autoridades departamentales para participar en una evaluación multiactoral, atenuando prevenciones frente al control jerárquico?</w:t>
+      </w:r>
+      <w:r>
+        <w:t xml:space="preserve"> </w:t>
+      </w:r>
+      <w:r>
+        <w:t xml:space="preserve">5.</w:t>
+      </w:r>
+      <w:r>
+        <w:t xml:space="preserve"> </w:t>
+      </w:r>
+      <w:r>
+        <w:rPr>
+          <w:b/>
+          <w:bCs/>
+        </w:rPr>
+        <w:t xml:space="preserve">Factibilidad de Gobernanza y Política Institucional:</w:t>
+      </w:r>
+      <w:r>
+        <w:t xml:space="preserve"> </w:t>
+      </w:r>
+      <w:r>
+        <w:t xml:space="preserve">¿Cuenta la propuesta con viabilidad política para ser tratada y consensuada en los órganos colegiados y mesas paritarias sobre variables de control compartido</w:t>
       </w:r>
       <w:r>
         <w:t xml:space="preserve"> </w:t>
@@ -2188,7 +2208,7 @@
         <w:pStyle w:val="FirstParagraph"/>
       </w:pPr>
       <w:r>
-        <w:t xml:space="preserve">Para contrastar estos aspectos en el trabajo de campo, la investigación desagrega la factibilidad en cinco dimensiones observables:</w:t>
+        <w:t xml:space="preserve">Para contrastar estos aspectos en el trabajo de campo, la investigación desagrega la factibilidad en cinco dimensiones observables perfectamente alineadas con los interrogantes planteados:</w:t>
       </w:r>
     </w:p>
     <w:tbl>
@@ -2289,7 +2309,7 @@
               <w:jc w:val="left"/>
             </w:pPr>
             <w:r>
-              <w:t xml:space="preserve">Compatibilidad con el Estatuto UNCo (Ord. 470/2009 y modif.), la Carrera Docente (Ord. N° 0920/2019 y modificatorias) y el CCT Docente (Decreto N° 1246/2015)</w:t>
+              <w:t xml:space="preserve">Compatibilidad con el Estatuto UNCo (Ord. N° 0988/2025), la Carrera Docente (Ord. N° 0920/2019 y modificatorias) y el CCT Docente (Decreto N° 1246/2015)</w:t>
             </w:r>
           </w:p>
         </w:tc>
@@ -2301,7 +2321,7 @@
               <w:jc w:val="left"/>
             </w:pPr>
             <w:r>
-              <w:t xml:space="preserve">Análisis documental normativo; ausencia de colisión con la estabilidad y derechos adquiridos</w:t>
+              <w:t xml:space="preserve">Análisis documental normativo; ausencia de colisión con la estabilidad laboral y derechos adquiridos</w:t>
             </w:r>
           </w:p>
         </w:tc>
@@ -2331,7 +2351,7 @@
               <w:jc w:val="left"/>
             </w:pPr>
             <w:r>
-              <w:t xml:space="preserve">Disponibilidad de plataformas digitales, recursos informáticos y diseño pedagógico de instrumentos</w:t>
+              <w:t xml:space="preserve">Disponibilidad de plataformas digitales, recursos informáticos y validez metodológica de instrumentos de consulta</w:t>
             </w:r>
           </w:p>
         </w:tc>
@@ -2343,7 +2363,7 @@
               <w:jc w:val="left"/>
             </w:pPr>
             <w:r>
-              <w:t xml:space="preserve">Relevamiento de entornos virtuales (SIU-Guaraní, campus virtual); validez y confidencialidad técnica</w:t>
+              <w:t xml:space="preserve">Relevamiento de entornos virtuales (SIU-Guaraní, campus virtual); confiabilidad técnica y anonimato</w:t>
             </w:r>
           </w:p>
         </w:tc>
@@ -2373,7 +2393,7 @@
               <w:jc w:val="left"/>
             </w:pPr>
             <w:r>
-              <w:t xml:space="preserve">Roles departamentales, comisiones curriculares, circuitos de devolución y tiempos de gestión</w:t>
+              <w:t xml:space="preserve">Roles departamentales, comisiones curriculares, circuitos de devolución y tiempos de gestión administrativa</w:t>
             </w:r>
           </w:p>
         </w:tc>
@@ -2385,7 +2405,7 @@
               <w:jc w:val="left"/>
             </w:pPr>
             <w:r>
-              <w:t xml:space="preserve">Procedimientos administrativos instituidos; capacidad de canalizar la retroalimentación formativa</w:t>
+              <w:t xml:space="preserve">Procedimientos administrativos instituidos; capacidad organizacional de canalizar la retroalimentación formativa</w:t>
             </w:r>
           </w:p>
         </w:tc>
@@ -2415,7 +2435,7 @@
               <w:jc w:val="left"/>
             </w:pPr>
             <w:r>
-              <w:t xml:space="preserve">Nivel de confianza institucional, cultura participativa y disposición de los claustros ante la coevaluación</w:t>
+              <w:t xml:space="preserve">Nivel de confianza institucional, cultura participativa y disposición de claustros y autoridades ante la coevaluación</w:t>
             </w:r>
           </w:p>
         </w:tc>
@@ -2427,7 +2447,7 @@
               <w:jc w:val="left"/>
             </w:pPr>
             <w:r>
-              <w:t xml:space="preserve">Cuestionarios y entrevistas; percepción de utilidad pedagógica y eventuales prevenciones frente al control sumativo</w:t>
+              <w:t xml:space="preserve">Cuestionarios y entrevistas; percepción de utilidad pedagógica y superación de tensiones frente al control auditador</w:t>
             </w:r>
           </w:p>
         </w:tc>
@@ -2457,7 +2477,7 @@
               <w:jc w:val="left"/>
             </w:pPr>
             <w:r>
-              <w:t xml:space="preserve">Participación y legitimación en el cogobierno (Consejo Directivo y Departamental) y mesas paritarias</w:t>
+              <w:t xml:space="preserve">Participación y legitimación en el cogobierno (Consejo Directivo y Departamental) y mesas paritarias docentes</w:t>
             </w:r>
           </w:p>
         </w:tc>
@@ -2469,7 +2489,7 @@
               <w:jc w:val="left"/>
             </w:pPr>
             <w:r>
-              <w:t xml:space="preserve">Acuerdos colegiados; consulta a representaciones gremiales sobre variables de control compartido</w:t>
+              <w:t xml:space="preserve">Acuerdos colegiados; consulta a representaciones gremiales y departamentales sobre variables de control compartido</w:t>
             </w:r>
           </w:p>
         </w:tc>
@@ -2498,7 +2518,7 @@
         <w:pStyle w:val="FirstParagraph"/>
       </w:pPr>
       <w:r>
-        <w:t xml:space="preserve">Para valorar las conclusiones del relevamiento empírico sin recurrir a mediciones forzadas, la investigación establece tres categorías cualitativas de interpretación:</w:t>
+        <w:t xml:space="preserve">La síntesis analítica y la asignación a la categoría global de factibilidad responden a una regla de integración sistemática basada en la articulación de las cinco dimensiones:</w:t>
       </w:r>
     </w:p>
     <w:p>
@@ -2520,7 +2540,7 @@
         <w:t xml:space="preserve"> </w:t>
       </w:r>
       <w:r>
-        <w:t xml:space="preserve">Se verifica cuando existe compatibilidad normativa plena, soporte tecnológico adecuado, disposición favorable de los tres claustros (docentes, alumnos y directores) y viabilidad de tratamiento colegiado en el cogobierno.</w:t>
+        <w:t xml:space="preserve">Se determina únicamente cuando se verifica una evaluación favorable y convergente en las cinco dimensiones: compatibilidad normativa plena con el Estatuto UNCo (Ord. N° 0988/2025), soporte tecnológico garantizado, capacidad procedimental instalada, disposición favorable de los claustros involucrados (docentes y estudiantes) junto a las autoridades departamentales, y viabilidad de tratamiento colegiado en el cogobierno.</w:t>
       </w:r>
     </w:p>
     <w:p>
@@ -2536,13 +2556,13 @@
           <w:b/>
           <w:bCs/>
         </w:rPr>
-        <w:t xml:space="preserve">Factibilidad Condicionada (Media / Viable con adecuaciones):</w:t>
-      </w:r>
-      <w:r>
-        <w:t xml:space="preserve"> </w:t>
-      </w:r>
-      <w:r>
-        <w:t xml:space="preserve">Se constata cuando no existen impedimentos jurídicos ni rechazo de fondo, pero la aplicación requiere pasos previos de gestión institucional: acuerdos paritarios específicos sobre confidencialidad, adecuación de plataformas digitales, instancias de sensibilización docente o implementación gradual mediante pruebas piloto.</w:t>
+        <w:t xml:space="preserve">Factibilidad Condicionada (Viable con adecuaciones de gestión):</w:t>
+      </w:r>
+      <w:r>
+        <w:t xml:space="preserve"> </w:t>
+      </w:r>
+      <w:r>
+        <w:t xml:space="preserve">Se determina cuando no existen barreras jurídicas insuperables ni rechazo institucional de fondo, pero una o dos dimensiones (técnica, procedimental o actitudinal) requieren instancias previas de gestión: acuerdos paritarios específicos sobre confidencialidad, adecuación de plataformas digitales, talleres de sensibilización o pruebas piloto graduadas.</w:t>
       </w:r>
     </w:p>
     <w:p>
@@ -2564,7 +2584,7 @@
         <w:t xml:space="preserve"> </w:t>
       </w:r>
       <w:r>
-        <w:t xml:space="preserve">Se determina ante la presencia de barreras estructurales no superables en el corto plazo, tales como colisión con el régimen estatutario de carrera docente, desconfianza generalizada en los claustros o carencia absoluta de soporte técnico y administrativo.</w:t>
+        <w:t xml:space="preserve">Se determina ante la presencia de al menos un obstáculo estructural no superable en el mediano plazo, tal como la colisión insalvable con el régimen estatutario de carrera docente, la desconfianza generalizada de los claustros o autoridades frente al uso punitivo de los datos o la imposibilidad técnica absoluta de garantizar el anonimato.</w:t>
       </w:r>
     </w:p>
     <w:bookmarkEnd w:id="23"/>
@@ -2930,7 +2950,7 @@
         <w:t xml:space="preserve"> </w:t>
       </w:r>
       <w:r>
-        <w:t xml:space="preserve">de los distintos claustros involucrados (docentes, estudiantes y directores de departamento) respecto a la retroalimentación multiactoral (360°) y las condiciones de confianza institucional requeridas.</w:t>
+        <w:t xml:space="preserve">de los distintos claustros involucrados (docentes y estudiantes) y de las autoridades departamentales respecto a la retroalimentación multiactoral (360°) y las condiciones de confianza institucional requeridas.</w:t>
       </w:r>
     </w:p>
     <w:p>
@@ -3363,7 +3383,7 @@
               <w:jc w:val="left"/>
             </w:pPr>
             <w:r>
-              <w:t xml:space="preserve">Estatuto UNCo (Ord. 470/2009 y modif.), Ord. N° 0920/2019 (y modif.) y CCT Docente (Decreto N° 1246/2015) (Matriz de análisis documental)</w:t>
+              <w:t xml:space="preserve">Estatuto UNCo (Ord. N° 0988/2025), Ord. N° 0920/2019 (y modif.) y CCT Docente (Decreto N° 1246/2015) (Matriz de análisis documental)</w:t>
             </w:r>
           </w:p>
         </w:tc>
@@ -3628,7 +3648,7 @@
     </w:p>
     <w:bookmarkEnd w:id="33"/>
     <w:bookmarkEnd w:id="34"/>
-    <w:bookmarkStart w:id="52" w:name="referencias"/>
+    <w:bookmarkStart w:id="49" w:name="referencias"/>
     <w:p>
       <w:pPr>
         <w:pStyle w:val="Heading1"/>
@@ -3645,7 +3665,7 @@
         <w:t xml:space="preserve">Referencias</w:t>
       </w:r>
     </w:p>
-    <w:bookmarkStart w:id="51" w:name="refs"/>
+    <w:bookmarkStart w:id="48" w:name="refs"/>
     <w:bookmarkStart w:id="35" w:name="ref-chiavenato2020"/>
     <w:p>
       <w:pPr>
@@ -3688,7 +3708,7 @@
       </w:r>
     </w:p>
     <w:bookmarkEnd w:id="36"/>
-    <w:bookmarkStart w:id="37" w:name="ref-lepsinger2009"/>
+    <w:bookmarkStart w:id="37" w:name="ref-ministerio1995"/>
     <w:p>
       <w:pPr>
         <w:pStyle w:val="Bibliography"/>
@@ -3697,27 +3717,11 @@
         <w:jc w:val="left"/>
       </w:pPr>
       <w:r>
-        <w:t xml:space="preserve">Lepsinger, R., &amp; Lucia, A. D. (2009).</w:t>
-      </w:r>
-      <w:r>
-        <w:t xml:space="preserve"> </w:t>
-      </w:r>
-      <w:r>
-        <w:rPr>
-          <w:i/>
-          <w:iCs/>
-        </w:rPr>
-        <w:t xml:space="preserve">The art and science of 360 degree feedback</w:t>
-      </w:r>
-      <w:r>
-        <w:t xml:space="preserve"> </w:t>
-      </w:r>
-      <w:r>
-        <w:t xml:space="preserve">(2.ª ed.). Pfeiffer.</w:t>
+        <w:t xml:space="preserve">Ley N° 24.521 de Educación Superior (1995).</w:t>
       </w:r>
     </w:p>
     <w:bookmarkEnd w:id="37"/>
-    <w:bookmarkStart w:id="38" w:name="ref-ministerio1995"/>
+    <w:bookmarkStart w:id="38" w:name="ref-longo2004"/>
     <w:p>
       <w:pPr>
         <w:pStyle w:val="Bibliography"/>
@@ -3726,11 +3730,24 @@
         <w:jc w:val="left"/>
       </w:pPr>
       <w:r>
-        <w:t xml:space="preserve">Ley N° 24.521 de Educación Superior (1995).</w:t>
+        <w:t xml:space="preserve">Longo, F. (2004).</w:t>
+      </w:r>
+      <w:r>
+        <w:t xml:space="preserve"> </w:t>
+      </w:r>
+      <w:r>
+        <w:rPr>
+          <w:i/>
+          <w:iCs/>
+        </w:rPr>
+        <w:t xml:space="preserve">Mérito y flexibilidad: La gestión de las personas en las organizaciones del sector público</w:t>
+      </w:r>
+      <w:r>
+        <w:t xml:space="preserve">. Paidós.</w:t>
       </w:r>
     </w:p>
     <w:bookmarkEnd w:id="38"/>
-    <w:bookmarkStart w:id="39" w:name="ref-longo2004"/>
+    <w:bookmarkStart w:id="40" w:name="ref-luna2014"/>
     <w:p>
       <w:pPr>
         <w:pStyle w:val="Bibliography"/>
@@ -3739,7 +3756,7 @@
         <w:jc w:val="left"/>
       </w:pPr>
       <w:r>
-        <w:t xml:space="preserve">Longo, F. (2004).</w:t>
+        <w:t xml:space="preserve">Luna Álvarez, H., Baute Álvarez, L. M., Luna Álvarez, D., Luna Álvarez, E., Luna Álvarez, W., &amp; Alpízar Fernández, R. (2014). Sistema de evaluación docente mediante el modelo 360 grados y el portafolio electrónico.</w:t>
       </w:r>
       <w:r>
         <w:t xml:space="preserve"> </w:t>
@@ -3749,23 +3766,10 @@
           <w:i/>
           <w:iCs/>
         </w:rPr>
-        <w:t xml:space="preserve">Mérito y flexibilidad: La gestión de las personas en las organizaciones del sector público</w:t>
-      </w:r>
-      <w:r>
-        <w:t xml:space="preserve">. Paidós.</w:t>
-      </w:r>
-    </w:p>
-    <w:bookmarkEnd w:id="39"/>
-    <w:bookmarkStart w:id="40" w:name="ref-matus1993"/>
-    <w:p>
-      <w:pPr>
-        <w:pStyle w:val="Bibliography"/>
-        <w:spacing w:after="120"/>
-        <w:ind w:left="720" w:hanging="720"/>
-        <w:jc w:val="left"/>
-      </w:pPr>
-      <w:r>
-        <w:t xml:space="preserve">Matus, C. (1993).</w:t>
+        <w:t xml:space="preserve">Medisur</w:t>
+      </w:r>
+      <w:r>
+        <w:t xml:space="preserve">,</w:t>
       </w:r>
       <w:r>
         <w:t xml:space="preserve"> </w:t>
@@ -3775,45 +3779,6 @@
           <w:i/>
           <w:iCs/>
         </w:rPr>
-        <w:t xml:space="preserve">Política, planificación y gobierno</w:t>
-      </w:r>
-      <w:r>
-        <w:t xml:space="preserve">. Fundación ALTIDIR.</w:t>
-      </w:r>
-    </w:p>
-    <w:bookmarkEnd w:id="40"/>
-    <w:bookmarkStart w:id="42" w:name="ref-obando2014"/>
-    <w:p>
-      <w:pPr>
-        <w:pStyle w:val="Bibliography"/>
-        <w:spacing w:after="120"/>
-        <w:ind w:left="720" w:hanging="720"/>
-        <w:jc w:val="left"/>
-      </w:pPr>
-      <w:r>
-        <w:t xml:space="preserve">Obando Freire, F., López Fernández, R., Luna Álvarez, D., Luna Álvarez, E., Luna Álvarez, W., &amp; Alpizar Fernández, R. (2014). Sistema de evaluación docente mediante el modelo 360 grados y el portafolio electrónico.</w:t>
-      </w:r>
-      <w:r>
-        <w:t xml:space="preserve"> </w:t>
-      </w:r>
-      <w:r>
-        <w:rPr>
-          <w:i/>
-          <w:iCs/>
-        </w:rPr>
-        <w:t xml:space="preserve">Medisur</w:t>
-      </w:r>
-      <w:r>
-        <w:t xml:space="preserve">,</w:t>
-      </w:r>
-      <w:r>
-        <w:t xml:space="preserve"> </w:t>
-      </w:r>
-      <w:r>
-        <w:rPr>
-          <w:i/>
-          <w:iCs/>
-        </w:rPr>
         <w:t xml:space="preserve">12</w:t>
       </w:r>
       <w:r>
@@ -3822,7 +3787,7 @@
       <w:r>
         <w:t xml:space="preserve"> </w:t>
       </w:r>
-      <w:hyperlink r:id="rId41">
+      <w:hyperlink r:id="rId39">
         <w:r>
           <w:rPr>
             <w:rStyle w:val="Hyperlink"/>
@@ -3831,8 +3796,8 @@
         </w:r>
       </w:hyperlink>
     </w:p>
-    <w:bookmarkEnd w:id="42"/>
-    <w:bookmarkStart w:id="43" w:name="ref-oszlak2020"/>
+    <w:bookmarkEnd w:id="40"/>
+    <w:bookmarkStart w:id="41" w:name="ref-matus1993"/>
     <w:p>
       <w:pPr>
         <w:pStyle w:val="Bibliography"/>
@@ -3841,7 +3806,7 @@
         <w:jc w:val="left"/>
       </w:pPr>
       <w:r>
-        <w:t xml:space="preserve">Oszlak, O. (2020).</w:t>
+        <w:t xml:space="preserve">Matus, C. (1993).</w:t>
       </w:r>
       <w:r>
         <w:t xml:space="preserve"> </w:t>
@@ -3851,14 +3816,14 @@
           <w:i/>
           <w:iCs/>
         </w:rPr>
-        <w:t xml:space="preserve">El Estado en la era exponencial</w:t>
-      </w:r>
-      <w:r>
-        <w:t xml:space="preserve">. Instituto Nacional de la Administración Pública.</w:t>
-      </w:r>
-    </w:p>
-    <w:bookmarkEnd w:id="43"/>
-    <w:bookmarkStart w:id="44" w:name="ref-sautu2005"/>
+        <w:t xml:space="preserve">Política, planificación y gobierno</w:t>
+      </w:r>
+      <w:r>
+        <w:t xml:space="preserve">. Fundación ALTIDIR.</w:t>
+      </w:r>
+    </w:p>
+    <w:bookmarkEnd w:id="41"/>
+    <w:bookmarkStart w:id="42" w:name="ref-oszlak2020"/>
     <w:p>
       <w:pPr>
         <w:pStyle w:val="Bibliography"/>
@@ -3867,7 +3832,7 @@
         <w:jc w:val="left"/>
       </w:pPr>
       <w:r>
-        <w:t xml:space="preserve">Sautu, R. (2005).</w:t>
+        <w:t xml:space="preserve">Oszlak, O. (2020).</w:t>
       </w:r>
       <w:r>
         <w:t xml:space="preserve"> </w:t>
@@ -3877,14 +3842,14 @@
           <w:i/>
           <w:iCs/>
         </w:rPr>
-        <w:t xml:space="preserve">Todo es teoría: Objetivos y métodos de investigación</w:t>
-      </w:r>
-      <w:r>
-        <w:t xml:space="preserve">. Lumiere.</w:t>
-      </w:r>
-    </w:p>
-    <w:bookmarkEnd w:id="44"/>
-    <w:bookmarkStart w:id="46" w:name="ref-sifuentes2016"/>
+        <w:t xml:space="preserve">El Estado en la era exponencial</w:t>
+      </w:r>
+      <w:r>
+        <w:t xml:space="preserve">. Instituto Nacional de la Administración Pública.</w:t>
+      </w:r>
+    </w:p>
+    <w:bookmarkEnd w:id="42"/>
+    <w:bookmarkStart w:id="43" w:name="ref-sautu2005"/>
     <w:p>
       <w:pPr>
         <w:pStyle w:val="Bibliography"/>
@@ -3893,7 +3858,7 @@
         <w:jc w:val="left"/>
       </w:pPr>
       <w:r>
-        <w:t xml:space="preserve">Sifuentes Ocegueda, E. (2016). La evaluación de 360° aplicada al personal docente de nivel superior.</w:t>
+        <w:t xml:space="preserve">Sautu, R. (2005).</w:t>
       </w:r>
       <w:r>
         <w:t xml:space="preserve"> </w:t>
@@ -3903,38 +3868,14 @@
           <w:i/>
           <w:iCs/>
         </w:rPr>
-        <w:t xml:space="preserve">Revista de Investigación en Tecnologías de la Información (RITI)</w:t>
-      </w:r>
-      <w:r>
-        <w:t xml:space="preserve">,</w:t>
-      </w:r>
-      <w:r>
-        <w:t xml:space="preserve"> </w:t>
-      </w:r>
-      <w:r>
-        <w:rPr>
-          <w:i/>
-          <w:iCs/>
-        </w:rPr>
-        <w:t xml:space="preserve">4</w:t>
-      </w:r>
-      <w:r>
-        <w:t xml:space="preserve">(8), 38-44.</w:t>
-      </w:r>
-      <w:r>
-        <w:t xml:space="preserve"> </w:t>
-      </w:r>
-      <w:hyperlink r:id="rId45">
-        <w:r>
-          <w:rPr>
-            <w:rStyle w:val="Hyperlink"/>
-          </w:rPr>
-          <w:t xml:space="preserve">https://dialnet.unirioja.es/descarga/articulo/7242790.pdf</w:t>
-        </w:r>
-      </w:hyperlink>
-    </w:p>
-    <w:bookmarkEnd w:id="46"/>
-    <w:bookmarkStart w:id="47" w:name="ref-unco2009"/>
+        <w:t xml:space="preserve">Todo es teoría: Objetivos y métodos de investigación</w:t>
+      </w:r>
+      <w:r>
+        <w:t xml:space="preserve">. Lumiere.</w:t>
+      </w:r>
+    </w:p>
+    <w:bookmarkEnd w:id="43"/>
+    <w:bookmarkStart w:id="44" w:name="ref-unco2019"/>
     <w:p>
       <w:pPr>
         <w:pStyle w:val="Bibliography"/>
@@ -3943,7 +3884,7 @@
         <w:jc w:val="left"/>
       </w:pPr>
       <w:r>
-        <w:t xml:space="preserve">Universidad Nacional del Comahue. (2009).</w:t>
+        <w:t xml:space="preserve">Universidad Nacional del Comahue. (2019).</w:t>
       </w:r>
       <w:r>
         <w:t xml:space="preserve"> </w:t>
@@ -3953,14 +3894,14 @@
           <w:i/>
           <w:iCs/>
         </w:rPr>
-        <w:t xml:space="preserve">Ordenanza N° 470/2009: Estatuto de la Universidad Nacional del Comahue</w:t>
+        <w:t xml:space="preserve">Ordenanza N° 0920/2019: Reglamento de Carrera Docente</w:t>
       </w:r>
       <w:r>
         <w:t xml:space="preserve">.</w:t>
       </w:r>
     </w:p>
-    <w:bookmarkEnd w:id="47"/>
-    <w:bookmarkStart w:id="48" w:name="ref-unco2019"/>
+    <w:bookmarkEnd w:id="44"/>
+    <w:bookmarkStart w:id="45" w:name="ref-unco2025"/>
     <w:p>
       <w:pPr>
         <w:pStyle w:val="Bibliography"/>
@@ -3969,7 +3910,7 @@
         <w:jc w:val="left"/>
       </w:pPr>
       <w:r>
-        <w:t xml:space="preserve">Universidad Nacional del Comahue. (2019).</w:t>
+        <w:t xml:space="preserve">Universidad Nacional del Comahue. (2025).</w:t>
       </w:r>
       <w:r>
         <w:t xml:space="preserve"> </w:t>
@@ -3979,14 +3920,14 @@
           <w:i/>
           <w:iCs/>
         </w:rPr>
-        <w:t xml:space="preserve">Ordenanza N° 0920/2019: Reglamento de Carrera Docente</w:t>
+        <w:t xml:space="preserve">Ordenanza N° 0988/2025: Texto ordenado del Estatuto de la Universidad Nacional del Comahue</w:t>
       </w:r>
       <w:r>
         <w:t xml:space="preserve">.</w:t>
       </w:r>
     </w:p>
-    <w:bookmarkEnd w:id="48"/>
-    <w:bookmarkStart w:id="49" w:name="ref-uncocurzas2023"/>
+    <w:bookmarkEnd w:id="45"/>
+    <w:bookmarkStart w:id="46" w:name="ref-uncocurzas2023"/>
     <w:p>
       <w:pPr>
         <w:pStyle w:val="Bibliography"/>
@@ -4011,8 +3952,8 @@
         <w:t xml:space="preserve">.</w:t>
       </w:r>
     </w:p>
-    <w:bookmarkEnd w:id="49"/>
-    <w:bookmarkStart w:id="50" w:name="ref-wainerman2011"/>
+    <w:bookmarkEnd w:id="46"/>
+    <w:bookmarkStart w:id="47" w:name="ref-wainerman2011"/>
     <w:p>
       <w:pPr>
         <w:pStyle w:val="Bibliography"/>
@@ -4040,9 +3981,9 @@
         <w:t xml:space="preserve">(4.ª ed.). Manantial.</w:t>
       </w:r>
     </w:p>
-    <w:bookmarkEnd w:id="50"/>
-    <w:bookmarkEnd w:id="51"/>
-    <w:bookmarkEnd w:id="52"/>
+    <w:bookmarkEnd w:id="47"/>
+    <w:bookmarkEnd w:id="48"/>
+    <w:bookmarkEnd w:id="49"/>
     <w:sectPr>
       <w:footerReference w:type="default" r:id="rId11"/>
       <w:footnotePr>

</xml_diff>

<commit_message>
docs: add Quarto source, bibliography, and compiled deliverables for Trabajo Práctico 2
</commit_message>
<xml_diff>
--- a/Entregas/Actividad 2/TP2_Ayarachi_Fuentes.docx
+++ b/Entregas/Actividad 2/TP2_Ayarachi_Fuentes.docx
@@ -1052,7 +1052,17 @@
         <w:t xml:space="preserve"> </w:t>
       </w:r>
       <w:r>
-        <w:t xml:space="preserve">(Sautu, 2005)</w:t>
+        <w:t xml:space="preserve">(</w:t>
+      </w:r>
+      <w:r>
+        <w:rPr>
+          <w:b/>
+          <w:bCs/>
+        </w:rPr>
+        <w:t xml:space="preserve">sautu2005?</w:t>
+      </w:r>
+      <w:r>
+        <w:t xml:space="preserve">)</w:t>
       </w:r>
       <w:r>
         <w:t xml:space="preserve">, transitando desde el macrosistema de gestión pública hasta el análisis empírico de un problema situado en el ámbito universitario regional.</w:t>
@@ -1306,7 +1316,7 @@
         <w:t xml:space="preserve"> </w:t>
       </w:r>
       <w:r>
-        <w:t xml:space="preserve">(Luna Álvarez et al., 2014)</w:t>
+        <w:t xml:space="preserve">(Obando Freire et al., 2014; Sifuentes Ocegueda et al., 2016)</w:t>
       </w:r>
       <w:r>
         <w:t xml:space="preserve">. La singularidad de esta propuesta radica en situar dicho modelo en una universidad pública patagónica signada por el cogobierno colegiado, la negociación paritaria y la atención a entornos híbridos de enseñanza en su Red de Nodos Territoriales, articulando la mirada del propio docente, de los colegas de cátedra, de los estudiantes y de las autoridades departamentales.</w:t>
@@ -1461,7 +1471,7 @@
         <w:t xml:space="preserve">(Decreto N° 1246/2015, Decreto N° 1246/2015. Convenio Colectivo de Trabajo para los Docentes de las Instituciones Universitarias Nacionales, 2015)</w:t>
       </w:r>
       <w:r>
-        <w:t xml:space="preserve">. Estos instrumentos fijan el régimen de ingreso y ascenso mediante concursos públicos de antecedentes y oposición (Arts. 67 y 70), así como la evaluación obligatoria de la inserción y permanencia docente (Art. 74) a través de dos mecanismos estatutarios: informes anuales (que incluyen plan de trabajo, avance, opinión de la Dirección del Departamento y encuestas estudiantiles obligatorias, Art. 75) y evaluaciones cuatrienales a cargo de jurados evaluadores (Art. 76).</w:t>
+        <w:t xml:space="preserve">. Estos instrumentos fijan el régimen de ingreso y ascenso mediante concursos públicos de antecedentes y oposición (Arts. 66 y 69), así como la evaluación obligatoria de la inserción y permanencia docente (Art. 73) a través de dos mecanismos estatutarios: informes anuales (que incluyen plan de trabajo, avance, opinión de la Dirección del Departamento y encuestas estudiantiles obligatorias, Art. 74) y evaluaciones cuatrienales a cargo de un tribunal integrado por dos evaluadores externos de la disciplina y un integrante del claustro estudiantil (Art. 75, inc. a).</w:t>
       </w:r>
     </w:p>
     <w:p>
@@ -1485,7 +1495,17 @@
         <w:t xml:space="preserve"> </w:t>
       </w:r>
       <w:r>
-        <w:t xml:space="preserve">(Sautu, 2005)</w:t>
+        <w:t xml:space="preserve">(</w:t>
+      </w:r>
+      <w:r>
+        <w:rPr>
+          <w:b/>
+          <w:bCs/>
+        </w:rPr>
+        <w:t xml:space="preserve">sautu2005?</w:t>
+      </w:r>
+      <w:r>
+        <w:t xml:space="preserve">)</w:t>
       </w:r>
       <w:r>
         <w:t xml:space="preserve"> </w:t>
@@ -1636,7 +1656,7 @@
         <w:t xml:space="preserve"> </w:t>
       </w:r>
       <w:r>
-        <w:t xml:space="preserve">(Luna Álvarez et al., 2014)</w:t>
+        <w:t xml:space="preserve">(Obando Freire et al., 2014)</w:t>
       </w:r>
       <w:r>
         <w:t xml:space="preserve"> </w:t>
@@ -2208,7 +2228,7 @@
         <w:pStyle w:val="FirstParagraph"/>
       </w:pPr>
       <w:r>
-        <w:t xml:space="preserve">Para contrastar estos aspectos en el trabajo de campo, la investigación desagrega la factibilidad en cinco dimensiones observables perfectamente alineadas con los interrogantes planteados:</w:t>
+        <w:t xml:space="preserve">Para contrastar estos aspectos en el trabajo de campo, la investigación desagrega la factibilidad en cinco dimensiones observables alineadas con los interrogantes planteados:</w:t>
       </w:r>
     </w:p>
     <w:tbl>
@@ -2477,7 +2497,7 @@
               <w:jc w:val="left"/>
             </w:pPr>
             <w:r>
-              <w:t xml:space="preserve">Participación y legitimación en el cogobierno (Consejo Directivo y Departamental) y mesas paritarias docentes</w:t>
+              <w:t xml:space="preserve">Participación y legitimación en el cogobierno (Consejo Superior y Consejo Directivo) y mesas paritarias docentes</w:t>
             </w:r>
           </w:p>
         </w:tc>
@@ -2562,7 +2582,29 @@
         <w:t xml:space="preserve"> </w:t>
       </w:r>
       <w:r>
-        <w:t xml:space="preserve">Se determina cuando no existen barreras jurídicas insuperables ni rechazo institucional de fondo, pero una o dos dimensiones (técnica, procedimental o actitudinal) requieren instancias previas de gestión: acuerdos paritarios específicos sobre confidencialidad, adecuación de plataformas digitales, talleres de sensibilización o pruebas piloto graduadas.</w:t>
+        <w:t xml:space="preserve">Se determina cuando no existen barreras jurídicas insuperables ni rechazo institucional de fondo, pero una o más dimensiones (técnica, procedimental, actitudinal o de gobernanza) requieren instancias previas de gestión institucional: acuerdos paritarios específicos sobre confidencialidad, adecuación de plataformas digitales, talleres de sensibilización, aprobación en el Consejo Directivo de la Unidad Académica o el Consejo Superior, o implementación mediante pruebas piloto graduadas</w:t>
+      </w:r>
+      <w:r>
+        <w:t xml:space="preserve"> </w:t>
+      </w:r>
+      <w:r>
+        <w:t xml:space="preserve">(Sifuentes Ocegueda et al., 2016)</w:t>
+      </w:r>
+      <w:r>
+        <w:t xml:space="preserve">. En caso de que tres o más dimensiones requieran adecuaciones o si la viabilidad exige una modificación estatutaria o reglamentaria expresa del Consejo Superior, el proyecto se categoriza como</w:t>
+      </w:r>
+      <w:r>
+        <w:t xml:space="preserve"> </w:t>
+      </w:r>
+      <w:r>
+        <w:rPr>
+          <w:i/>
+          <w:iCs/>
+        </w:rPr>
+        <w:t xml:space="preserve">Factibilidad Condicionada de Nivel Superior</w:t>
+      </w:r>
+      <w:r>
+        <w:t xml:space="preserve">.</w:t>
       </w:r>
     </w:p>
     <w:p>
@@ -3467,7 +3509,7 @@
               <w:jc w:val="left"/>
             </w:pPr>
             <w:r>
-              <w:t xml:space="preserve">Docentes, estudiantes y directores de departamento (Guías de entrevista y cuestionarios diagnósticos)</w:t>
+              <w:t xml:space="preserve">Docentes, estudiantes y autoridades del Departamento (Guías de entrevista y cuestionarios diagnósticos)</w:t>
             </w:r>
           </w:p>
         </w:tc>
@@ -3648,7 +3690,7 @@
     </w:p>
     <w:bookmarkEnd w:id="33"/>
     <w:bookmarkEnd w:id="34"/>
-    <w:bookmarkStart w:id="49" w:name="referencias"/>
+    <w:bookmarkStart w:id="50" w:name="referencias"/>
     <w:p>
       <w:pPr>
         <w:pStyle w:val="Heading1"/>
@@ -3665,7 +3707,7 @@
         <w:t xml:space="preserve">Referencias</w:t>
       </w:r>
     </w:p>
-    <w:bookmarkStart w:id="48" w:name="refs"/>
+    <w:bookmarkStart w:id="49" w:name="refs"/>
     <w:bookmarkStart w:id="35" w:name="ref-chiavenato2020"/>
     <w:p>
       <w:pPr>
@@ -3747,7 +3789,7 @@
       </w:r>
     </w:p>
     <w:bookmarkEnd w:id="38"/>
-    <w:bookmarkStart w:id="40" w:name="ref-luna2014"/>
+    <w:bookmarkStart w:id="39" w:name="ref-matus1993"/>
     <w:p>
       <w:pPr>
         <w:pStyle w:val="Bibliography"/>
@@ -3756,7 +3798,7 @@
         <w:jc w:val="left"/>
       </w:pPr>
       <w:r>
-        <w:t xml:space="preserve">Luna Álvarez, H., Baute Álvarez, L. M., Luna Álvarez, D., Luna Álvarez, E., Luna Álvarez, W., &amp; Alpízar Fernández, R. (2014). Sistema de evaluación docente mediante el modelo 360 grados y el portafolio electrónico.</w:t>
+        <w:t xml:space="preserve">Matus, C. (1993).</w:t>
       </w:r>
       <w:r>
         <w:t xml:space="preserve"> </w:t>
@@ -3766,10 +3808,23 @@
           <w:i/>
           <w:iCs/>
         </w:rPr>
-        <w:t xml:space="preserve">Medisur</w:t>
-      </w:r>
-      <w:r>
-        <w:t xml:space="preserve">,</w:t>
+        <w:t xml:space="preserve">Política, planificación y gobierno</w:t>
+      </w:r>
+      <w:r>
+        <w:t xml:space="preserve">. Fundación ALTIDIR.</w:t>
+      </w:r>
+    </w:p>
+    <w:bookmarkEnd w:id="39"/>
+    <w:bookmarkStart w:id="41" w:name="ref-obando2014"/>
+    <w:p>
+      <w:pPr>
+        <w:pStyle w:val="Bibliography"/>
+        <w:spacing w:after="120"/>
+        <w:ind w:left="720" w:hanging="720"/>
+        <w:jc w:val="left"/>
+      </w:pPr>
+      <w:r>
+        <w:t xml:space="preserve">Obando Freire, F., López Fernández, R., Luna Álvarez, D., Luna Álvarez, E., Luna Álvarez, W., &amp; Alpizar Fernández, R. (2014). Sistema de evaluación docente mediante el modelo 360 grados y el portafolio electrónico.</w:t>
       </w:r>
       <w:r>
         <w:t xml:space="preserve"> </w:t>
@@ -3779,6 +3834,19 @@
           <w:i/>
           <w:iCs/>
         </w:rPr>
+        <w:t xml:space="preserve">Medisur</w:t>
+      </w:r>
+      <w:r>
+        <w:t xml:space="preserve">,</w:t>
+      </w:r>
+      <w:r>
+        <w:t xml:space="preserve"> </w:t>
+      </w:r>
+      <w:r>
+        <w:rPr>
+          <w:i/>
+          <w:iCs/>
+        </w:rPr>
         <w:t xml:space="preserve">12</w:t>
       </w:r>
       <w:r>
@@ -3787,7 +3855,7 @@
       <w:r>
         <w:t xml:space="preserve"> </w:t>
       </w:r>
-      <w:hyperlink r:id="rId39">
+      <w:hyperlink r:id="rId40">
         <w:r>
           <w:rPr>
             <w:rStyle w:val="Hyperlink"/>
@@ -3796,8 +3864,8 @@
         </w:r>
       </w:hyperlink>
     </w:p>
-    <w:bookmarkEnd w:id="40"/>
-    <w:bookmarkStart w:id="41" w:name="ref-matus1993"/>
+    <w:bookmarkEnd w:id="41"/>
+    <w:bookmarkStart w:id="42" w:name="ref-oszlak2020"/>
     <w:p>
       <w:pPr>
         <w:pStyle w:val="Bibliography"/>
@@ -3806,7 +3874,7 @@
         <w:jc w:val="left"/>
       </w:pPr>
       <w:r>
-        <w:t xml:space="preserve">Matus, C. (1993).</w:t>
+        <w:t xml:space="preserve">Oszlak, O. (2020).</w:t>
       </w:r>
       <w:r>
         <w:t xml:space="preserve"> </w:t>
@@ -3816,14 +3884,14 @@
           <w:i/>
           <w:iCs/>
         </w:rPr>
-        <w:t xml:space="preserve">Política, planificación y gobierno</w:t>
-      </w:r>
-      <w:r>
-        <w:t xml:space="preserve">. Fundación ALTIDIR.</w:t>
-      </w:r>
-    </w:p>
-    <w:bookmarkEnd w:id="41"/>
-    <w:bookmarkStart w:id="42" w:name="ref-oszlak2020"/>
+        <w:t xml:space="preserve">El Estado en la era exponencial</w:t>
+      </w:r>
+      <w:r>
+        <w:t xml:space="preserve">. Instituto Nacional de la Administración Pública.</w:t>
+      </w:r>
+    </w:p>
+    <w:bookmarkEnd w:id="42"/>
+    <w:bookmarkStart w:id="44" w:name="ref-sifuentes2016"/>
     <w:p>
       <w:pPr>
         <w:pStyle w:val="Bibliography"/>
@@ -3832,7 +3900,7 @@
         <w:jc w:val="left"/>
       </w:pPr>
       <w:r>
-        <w:t xml:space="preserve">Oszlak, O. (2020).</w:t>
+        <w:t xml:space="preserve">Sifuentes Ocegueda, A. T., Suárez Flores, M., &amp; Lara González, L. M. (2016). La evaluación de 360° aplicada al personal docente de nivel superior.</w:t>
       </w:r>
       <w:r>
         <w:t xml:space="preserve"> </w:t>
@@ -3842,14 +3910,38 @@
           <w:i/>
           <w:iCs/>
         </w:rPr>
-        <w:t xml:space="preserve">El Estado en la era exponencial</w:t>
-      </w:r>
-      <w:r>
-        <w:t xml:space="preserve">. Instituto Nacional de la Administración Pública.</w:t>
-      </w:r>
-    </w:p>
-    <w:bookmarkEnd w:id="42"/>
-    <w:bookmarkStart w:id="43" w:name="ref-sautu2005"/>
+        <w:t xml:space="preserve">Revista de Investigación en Tecnologías de la Información (RITI)</w:t>
+      </w:r>
+      <w:r>
+        <w:t xml:space="preserve">,</w:t>
+      </w:r>
+      <w:r>
+        <w:t xml:space="preserve"> </w:t>
+      </w:r>
+      <w:r>
+        <w:rPr>
+          <w:i/>
+          <w:iCs/>
+        </w:rPr>
+        <w:t xml:space="preserve">4</w:t>
+      </w:r>
+      <w:r>
+        <w:t xml:space="preserve">(7), 17-26.</w:t>
+      </w:r>
+      <w:r>
+        <w:t xml:space="preserve"> </w:t>
+      </w:r>
+      <w:hyperlink r:id="rId43">
+        <w:r>
+          <w:rPr>
+            <w:rStyle w:val="Hyperlink"/>
+          </w:rPr>
+          <w:t xml:space="preserve">https://dialnet.unirioja.es/descarga/articulo/7242790.pdf</w:t>
+        </w:r>
+      </w:hyperlink>
+    </w:p>
+    <w:bookmarkEnd w:id="44"/>
+    <w:bookmarkStart w:id="45" w:name="ref-unco2019"/>
     <w:p>
       <w:pPr>
         <w:pStyle w:val="Bibliography"/>
@@ -3858,7 +3950,7 @@
         <w:jc w:val="left"/>
       </w:pPr>
       <w:r>
-        <w:t xml:space="preserve">Sautu, R. (2005).</w:t>
+        <w:t xml:space="preserve">Universidad Nacional del Comahue. (2019).</w:t>
       </w:r>
       <w:r>
         <w:t xml:space="preserve"> </w:t>
@@ -3868,14 +3960,14 @@
           <w:i/>
           <w:iCs/>
         </w:rPr>
-        <w:t xml:space="preserve">Todo es teoría: Objetivos y métodos de investigación</w:t>
-      </w:r>
-      <w:r>
-        <w:t xml:space="preserve">. Lumiere.</w:t>
-      </w:r>
-    </w:p>
-    <w:bookmarkEnd w:id="43"/>
-    <w:bookmarkStart w:id="44" w:name="ref-unco2019"/>
+        <w:t xml:space="preserve">Ordenanza N° 0920/2019: Reglamento de Carrera Docente</w:t>
+      </w:r>
+      <w:r>
+        <w:t xml:space="preserve">.</w:t>
+      </w:r>
+    </w:p>
+    <w:bookmarkEnd w:id="45"/>
+    <w:bookmarkStart w:id="46" w:name="ref-unco2025"/>
     <w:p>
       <w:pPr>
         <w:pStyle w:val="Bibliography"/>
@@ -3884,7 +3976,7 @@
         <w:jc w:val="left"/>
       </w:pPr>
       <w:r>
-        <w:t xml:space="preserve">Universidad Nacional del Comahue. (2019).</w:t>
+        <w:t xml:space="preserve">Universidad Nacional del Comahue. (2025).</w:t>
       </w:r>
       <w:r>
         <w:t xml:space="preserve"> </w:t>
@@ -3894,14 +3986,14 @@
           <w:i/>
           <w:iCs/>
         </w:rPr>
-        <w:t xml:space="preserve">Ordenanza N° 0920/2019: Reglamento de Carrera Docente</w:t>
+        <w:t xml:space="preserve">Ordenanza N° 0988/2025: Texto ordenado del Estatuto de la Universidad Nacional del Comahue</w:t>
       </w:r>
       <w:r>
         <w:t xml:space="preserve">.</w:t>
       </w:r>
     </w:p>
-    <w:bookmarkEnd w:id="44"/>
-    <w:bookmarkStart w:id="45" w:name="ref-unco2025"/>
+    <w:bookmarkEnd w:id="46"/>
+    <w:bookmarkStart w:id="47" w:name="ref-uncocurzas2023"/>
     <w:p>
       <w:pPr>
         <w:pStyle w:val="Bibliography"/>
@@ -3910,7 +4002,7 @@
         <w:jc w:val="left"/>
       </w:pPr>
       <w:r>
-        <w:t xml:space="preserve">Universidad Nacional del Comahue. (2025).</w:t>
+        <w:t xml:space="preserve">Universidad Nacional del Comahue - CURZAS. (2023).</w:t>
       </w:r>
       <w:r>
         <w:t xml:space="preserve"> </w:t>
@@ -3920,14 +4012,14 @@
           <w:i/>
           <w:iCs/>
         </w:rPr>
-        <w:t xml:space="preserve">Ordenanza N° 0988/2025: Texto ordenado del Estatuto de la Universidad Nacional del Comahue</w:t>
+        <w:t xml:space="preserve">Resolución CD-CURZAS N° 266/2023: Reglamento de Trabajo Final de Graduación (TFG) para las carreras del Departamento de Administración Pública</w:t>
       </w:r>
       <w:r>
         <w:t xml:space="preserve">.</w:t>
       </w:r>
     </w:p>
-    <w:bookmarkEnd w:id="45"/>
-    <w:bookmarkStart w:id="46" w:name="ref-uncocurzas2023"/>
+    <w:bookmarkEnd w:id="47"/>
+    <w:bookmarkStart w:id="48" w:name="ref-wainerman2011"/>
     <w:p>
       <w:pPr>
         <w:pStyle w:val="Bibliography"/>
@@ -3936,7 +4028,7 @@
         <w:jc w:val="left"/>
       </w:pPr>
       <w:r>
-        <w:t xml:space="preserve">Universidad Nacional del Comahue - CURZAS. (2023).</w:t>
+        <w:t xml:space="preserve">Wainerman, C., &amp; Sautu, R. (2011).</w:t>
       </w:r>
       <w:r>
         <w:t xml:space="preserve"> </w:t>
@@ -3946,32 +4038,6 @@
           <w:i/>
           <w:iCs/>
         </w:rPr>
-        <w:t xml:space="preserve">Resolución CD-CURZAS N° 266/2023: Reglamento de Trabajo Final de Graduación (TFG) para las carreras del Departamento de Administración Pública</w:t>
-      </w:r>
-      <w:r>
-        <w:t xml:space="preserve">.</w:t>
-      </w:r>
-    </w:p>
-    <w:bookmarkEnd w:id="46"/>
-    <w:bookmarkStart w:id="47" w:name="ref-wainerman2011"/>
-    <w:p>
-      <w:pPr>
-        <w:pStyle w:val="Bibliography"/>
-        <w:spacing w:after="120"/>
-        <w:ind w:left="720" w:hanging="720"/>
-        <w:jc w:val="left"/>
-      </w:pPr>
-      <w:r>
-        <w:t xml:space="preserve">Wainerman, C., &amp; Sautu, R. (2011).</w:t>
-      </w:r>
-      <w:r>
-        <w:t xml:space="preserve"> </w:t>
-      </w:r>
-      <w:r>
-        <w:rPr>
-          <w:i/>
-          <w:iCs/>
-        </w:rPr>
         <w:t xml:space="preserve">La trastienda de la investigación</w:t>
       </w:r>
       <w:r>
@@ -3981,9 +4047,9 @@
         <w:t xml:space="preserve">(4.ª ed.). Manantial.</w:t>
       </w:r>
     </w:p>
-    <w:bookmarkEnd w:id="47"/>
     <w:bookmarkEnd w:id="48"/>
     <w:bookmarkEnd w:id="49"/>
+    <w:bookmarkEnd w:id="50"/>
     <w:sectPr>
       <w:footerReference w:type="default" r:id="rId11"/>
       <w:footnotePr>

</xml_diff>

<commit_message>
docs: add TP2 deliverables for Actividad 2
</commit_message>
<xml_diff>
--- a/Entregas/Actividad 2/TP2_Ayarachi_Fuentes.docx
+++ b/Entregas/Actividad 2/TP2_Ayarachi_Fuentes.docx
@@ -1052,17 +1052,7 @@
         <w:t xml:space="preserve"> </w:t>
       </w:r>
       <w:r>
-        <w:t xml:space="preserve">(</w:t>
-      </w:r>
-      <w:r>
-        <w:rPr>
-          <w:b/>
-          <w:bCs/>
-        </w:rPr>
-        <w:t xml:space="preserve">sautu2005?</w:t>
-      </w:r>
-      <w:r>
-        <w:t xml:space="preserve">)</w:t>
+        <w:t xml:space="preserve">(Sautu, 2005)</w:t>
       </w:r>
       <w:r>
         <w:t xml:space="preserve">, transitando desde el macrosistema de gestión pública hasta el análisis empírico de un problema situado en el ámbito universitario regional.</w:t>
@@ -1495,17 +1485,7 @@
         <w:t xml:space="preserve"> </w:t>
       </w:r>
       <w:r>
-        <w:t xml:space="preserve">(</w:t>
-      </w:r>
-      <w:r>
-        <w:rPr>
-          <w:b/>
-          <w:bCs/>
-        </w:rPr>
-        <w:t xml:space="preserve">sautu2005?</w:t>
-      </w:r>
-      <w:r>
-        <w:t xml:space="preserve">)</w:t>
+        <w:t xml:space="preserve">(Sautu, 2005)</w:t>
       </w:r>
       <w:r>
         <w:t xml:space="preserve"> </w:t>
@@ -3690,7 +3670,7 @@
     </w:p>
     <w:bookmarkEnd w:id="33"/>
     <w:bookmarkEnd w:id="34"/>
-    <w:bookmarkStart w:id="50" w:name="referencias"/>
+    <w:bookmarkStart w:id="51" w:name="referencias"/>
     <w:p>
       <w:pPr>
         <w:pStyle w:val="Heading1"/>
@@ -3707,7 +3687,7 @@
         <w:t xml:space="preserve">Referencias</w:t>
       </w:r>
     </w:p>
-    <w:bookmarkStart w:id="49" w:name="refs"/>
+    <w:bookmarkStart w:id="50" w:name="refs"/>
     <w:bookmarkStart w:id="35" w:name="ref-chiavenato2020"/>
     <w:p>
       <w:pPr>
@@ -3891,7 +3871,7 @@
       </w:r>
     </w:p>
     <w:bookmarkEnd w:id="42"/>
-    <w:bookmarkStart w:id="44" w:name="ref-sifuentes2016"/>
+    <w:bookmarkStart w:id="43" w:name="ref-sautu2005"/>
     <w:p>
       <w:pPr>
         <w:pStyle w:val="Bibliography"/>
@@ -3900,7 +3880,7 @@
         <w:jc w:val="left"/>
       </w:pPr>
       <w:r>
-        <w:t xml:space="preserve">Sifuentes Ocegueda, A. T., Suárez Flores, M., &amp; Lara González, L. M. (2016). La evaluación de 360° aplicada al personal docente de nivel superior.</w:t>
+        <w:t xml:space="preserve">Sautu, R. (2005).</w:t>
       </w:r>
       <w:r>
         <w:t xml:space="preserve"> </w:t>
@@ -3910,10 +3890,23 @@
           <w:i/>
           <w:iCs/>
         </w:rPr>
-        <w:t xml:space="preserve">Revista de Investigación en Tecnologías de la Información (RITI)</w:t>
-      </w:r>
-      <w:r>
-        <w:t xml:space="preserve">,</w:t>
+        <w:t xml:space="preserve">Todo es teoría: objetivos y métodos de investigación</w:t>
+      </w:r>
+      <w:r>
+        <w:t xml:space="preserve">. Lumiere.</w:t>
+      </w:r>
+    </w:p>
+    <w:bookmarkEnd w:id="43"/>
+    <w:bookmarkStart w:id="45" w:name="ref-sifuentes2016"/>
+    <w:p>
+      <w:pPr>
+        <w:pStyle w:val="Bibliography"/>
+        <w:spacing w:after="120"/>
+        <w:ind w:left="720" w:hanging="720"/>
+        <w:jc w:val="left"/>
+      </w:pPr>
+      <w:r>
+        <w:t xml:space="preserve">Sifuentes Ocegueda, A. T., Suárez Flores, M., &amp; Lara González, L. M. (2016). La evaluación de 360° aplicada al personal docente de nivel superior.</w:t>
       </w:r>
       <w:r>
         <w:t xml:space="preserve"> </w:t>
@@ -3923,6 +3916,19 @@
           <w:i/>
           <w:iCs/>
         </w:rPr>
+        <w:t xml:space="preserve">Revista de Investigación en Tecnologías de la Información (RITI)</w:t>
+      </w:r>
+      <w:r>
+        <w:t xml:space="preserve">,</w:t>
+      </w:r>
+      <w:r>
+        <w:t xml:space="preserve"> </w:t>
+      </w:r>
+      <w:r>
+        <w:rPr>
+          <w:i/>
+          <w:iCs/>
+        </w:rPr>
         <w:t xml:space="preserve">4</w:t>
       </w:r>
       <w:r>
@@ -3931,7 +3937,7 @@
       <w:r>
         <w:t xml:space="preserve"> </w:t>
       </w:r>
-      <w:hyperlink r:id="rId43">
+      <w:hyperlink r:id="rId44">
         <w:r>
           <w:rPr>
             <w:rStyle w:val="Hyperlink"/>
@@ -3940,8 +3946,8 @@
         </w:r>
       </w:hyperlink>
     </w:p>
-    <w:bookmarkEnd w:id="44"/>
-    <w:bookmarkStart w:id="45" w:name="ref-unco2019"/>
+    <w:bookmarkEnd w:id="45"/>
+    <w:bookmarkStart w:id="46" w:name="ref-unco2019"/>
     <w:p>
       <w:pPr>
         <w:pStyle w:val="Bibliography"/>
@@ -3966,8 +3972,8 @@
         <w:t xml:space="preserve">.</w:t>
       </w:r>
     </w:p>
-    <w:bookmarkEnd w:id="45"/>
-    <w:bookmarkStart w:id="46" w:name="ref-unco2025"/>
+    <w:bookmarkEnd w:id="46"/>
+    <w:bookmarkStart w:id="47" w:name="ref-unco2025"/>
     <w:p>
       <w:pPr>
         <w:pStyle w:val="Bibliography"/>
@@ -3992,8 +3998,8 @@
         <w:t xml:space="preserve">.</w:t>
       </w:r>
     </w:p>
-    <w:bookmarkEnd w:id="46"/>
-    <w:bookmarkStart w:id="47" w:name="ref-uncocurzas2023"/>
+    <w:bookmarkEnd w:id="47"/>
+    <w:bookmarkStart w:id="48" w:name="ref-uncocurzas2023"/>
     <w:p>
       <w:pPr>
         <w:pStyle w:val="Bibliography"/>
@@ -4018,8 +4024,8 @@
         <w:t xml:space="preserve">.</w:t>
       </w:r>
     </w:p>
-    <w:bookmarkEnd w:id="47"/>
-    <w:bookmarkStart w:id="48" w:name="ref-wainerman2011"/>
+    <w:bookmarkEnd w:id="48"/>
+    <w:bookmarkStart w:id="49" w:name="ref-wainerman2011"/>
     <w:p>
       <w:pPr>
         <w:pStyle w:val="Bibliography"/>
@@ -4047,9 +4053,9 @@
         <w:t xml:space="preserve">(4.ª ed.). Manantial.</w:t>
       </w:r>
     </w:p>
-    <w:bookmarkEnd w:id="48"/>
     <w:bookmarkEnd w:id="49"/>
     <w:bookmarkEnd w:id="50"/>
+    <w:bookmarkEnd w:id="51"/>
     <w:sectPr>
       <w:footerReference w:type="default" r:id="rId11"/>
       <w:footnotePr>

</xml_diff>

<commit_message>
feat: add Quarto source and compiled documents for Trabajo Práctico 2 research proposal
</commit_message>
<xml_diff>
--- a/Entregas/Actividad 2/TP2_Ayarachi_Fuentes.docx
+++ b/Entregas/Actividad 2/TP2_Ayarachi_Fuentes.docx
@@ -1679,7 +1679,7 @@
         <w:t xml:space="preserve">diferenciar la evaluación orientada a la mejora pedagógica de aquella vinculada a decisiones laborales sumativas</w:t>
       </w:r>
       <w:r>
-        <w:t xml:space="preserve">. Dado que el Estatuto sanciona que dos evaluaciones cuatrienales consecutivas negativas determinan la vacancia del cargo y llamado a concurso público (Art. 76, inc. c), existe una comprensible prevención docente frente a controles auditadores. Si bien la normativa vigente ya contempla la opinión del Director del Departamento en los informes anuales del legajo académico (Art. 75), la singularidad y valor añadido de este proyecto radica en analizar la factibilidad de un</w:t>
+        <w:t xml:space="preserve">. Dado que el Estatuto sanciona que dos evaluaciones cuatrienales consecutivas negativas determinan la vacancia del cargo y llamado a concurso público (Art. 75, inc. c), existe una comprensible prevención docente frente a controles auditadores. Si bien la normativa vigente ya contempla la opinión del Director del Departamento en los informes anuales del legajo académico (Art. 74), la singularidad y valor añadido de este proyecto radica en analizar la factibilidad de un</w:t>
       </w:r>
       <w:r>
         <w:t xml:space="preserve"> </w:t>
@@ -1700,7 +1700,7 @@
         <w:pStyle w:val="BodyText"/>
       </w:pPr>
       <w:r>
-        <w:t xml:space="preserve">Dicho dispositivo busca articular los insumos de los claustros (docentes y estudiantes) y de la Dirección del Departamento —quien es electa por sus propios pares docentes por un período de dos años (Art. 14)— para alimentar de forma directa el Programa Anual de Formación de Recursos Humanos del Departamento (Art. 77) y el perfeccionamiento continuo de la Carrera Docente (Art. 66). Por ello, la viabilidad de la propuesta descansa en la</w:t>
+        <w:t xml:space="preserve">Dicho dispositivo busca articular los insumos de los claustros (docentes y estudiantes) y de la Dirección del Departamento —quien es electa por sus propios pares docentes por un período de dos años (Art. 14)— para alimentar de forma directa el Programa Anual de Formación de Recursos Humanos del Departamento (Art. 76) y el perfeccionamiento continuo de la Carrera Docente (Art. 65). Por ello, la viabilidad de la propuesta descansa en la</w:t>
       </w:r>
       <w:r>
         <w:t xml:space="preserve"> </w:t>

</xml_diff>

<commit_message>
docs: add Activity 2 deliverable documents and Quarto source for TFG research design
</commit_message>
<xml_diff>
--- a/Entregas/Actividad 2/TP2_Ayarachi_Fuentes.docx
+++ b/Entregas/Actividad 2/TP2_Ayarachi_Fuentes.docx
@@ -738,7 +738,7 @@
           <w:rFonts w:ascii="Arial" w:hAnsi="Arial"/>
           <w:sz w:val="22"/>
         </w:rPr>
-        <w:t>8</w:t>
+        <w:t>9</w:t>
       </w:r>
     </w:p>
     <w:p>
@@ -1431,34 +1431,34 @@
         <w:pStyle w:val="BodyText"/>
       </w:pPr>
       <w:r>
-        <w:t xml:space="preserve">En el plano normativo, la actividad docente en el CURZAS —definido estatutariamente como Complejo Universitario Regional (Art. 17 y Disposición Transitoria Cuarta del nuevo Estatuto)— se encuentra reglada por el Estatuto de la UNCo</w:t>
-      </w:r>
-      <w:r>
-        <w:t xml:space="preserve"> </w:t>
-      </w:r>
-      <w:r>
-        <w:t xml:space="preserve">(Ordenanza CS N° 0988/2025 (texto ordenado), Universidad Nacional del Comahue, 2025)</w:t>
-      </w:r>
-      <w:r>
-        <w:t xml:space="preserve">, el Reglamento de Carrera Docente</w:t>
-      </w:r>
-      <w:r>
-        <w:t xml:space="preserve"> </w:t>
-      </w:r>
-      <w:r>
-        <w:t xml:space="preserve">(Ordenanza CS N° 0920/2019 y sus modificatorias, Universidad Nacional del Comahue, 2019)</w:t>
-      </w:r>
-      <w:r>
-        <w:t xml:space="preserve"> </w:t>
-      </w:r>
-      <w:r>
-        <w:t xml:space="preserve">y el Convenio Colectivo de Trabajo Docente</w:t>
-      </w:r>
-      <w:r>
-        <w:t xml:space="preserve"> </w:t>
-      </w:r>
-      <w:r>
-        <w:t xml:space="preserve">(Decreto N° 1246/2015, Decreto N° 1246/2015. Convenio Colectivo de Trabajo para los Docentes de las Instituciones Universitarias Nacionales, 2015)</w:t>
+        <w:t xml:space="preserve">En el plano normativo, la actividad docente en el CURZAS —definido estatutariamente como Complejo Universitario Regional (Art. 17 y Disposición Transitoria Cuarta del nuevo Estatuto)— se encuentra reglada por el Estatuto de la UNCo (Ordenanza CS N° 0988/2025, texto ordenado)</w:t>
+      </w:r>
+      <w:r>
+        <w:t xml:space="preserve"> </w:t>
+      </w:r>
+      <w:r>
+        <w:t xml:space="preserve">(Universidad Nacional del Comahue, 2025)</w:t>
+      </w:r>
+      <w:r>
+        <w:t xml:space="preserve">, el Reglamento de Carrera Docente (Ordenanza CS N° 0920/2019 y sus modificatorias)</w:t>
+      </w:r>
+      <w:r>
+        <w:t xml:space="preserve"> </w:t>
+      </w:r>
+      <w:r>
+        <w:t xml:space="preserve">(Universidad Nacional del Comahue, 2019)</w:t>
+      </w:r>
+      <w:r>
+        <w:t xml:space="preserve"> </w:t>
+      </w:r>
+      <w:r>
+        <w:t xml:space="preserve">y el Convenio Colectivo de Trabajo Docente (Decreto N° 1246/2015)</w:t>
+      </w:r>
+      <w:r>
+        <w:t xml:space="preserve"> </w:t>
+      </w:r>
+      <w:r>
+        <w:t xml:space="preserve">(Decreto N° 1246/2015. Convenio Colectivo de Trabajo para los Docentes de las Instituciones Universitarias Nacionales, 2015)</w:t>
       </w:r>
       <w:r>
         <w:t xml:space="preserve">. Estos instrumentos fijan el régimen de ingreso y ascenso mediante concursos públicos de antecedentes y oposición (Arts. 66 y 69), así como la evaluación obligatoria de la inserción y permanencia docente (Art. 73) a través de dos mecanismos estatutarios: informes anuales (que incluyen plan de trabajo, avance, opinión de la Dirección del Departamento y encuestas estudiantiles obligatorias, Art. 74) y evaluaciones cuatrienales a cargo de un tribunal integrado por dos evaluadores externos de la disciplina y un integrante del claustro estudiantil (Art. 75, inc. a).</w:t>
@@ -1609,7 +1609,7 @@
         <w:t xml:space="preserve">posible desconexión entre los circuitos de evaluación del rendimiento y las oportunidades reales de desarrollo pedagógico</w:t>
       </w:r>
       <w:r>
-        <w:t xml:space="preserve">. Si bien se aplican periódicamente encuestas a estudiantes,</w:t>
+        <w:t xml:space="preserve">. Se formula como</w:t>
       </w:r>
       <w:r>
         <w:t xml:space="preserve"> </w:t>
@@ -1619,10 +1619,19 @@
           <w:b/>
           <w:bCs/>
         </w:rPr>
-        <w:t xml:space="preserve">se plantea como hipótesis a contrastar si estos instrumentos son percibidos en la práctica como un trámite formal</w:t>
-      </w:r>
-      <w:r>
-        <w:t xml:space="preserve">, con escasa incidencia en la autoevaluación docente, el diálogo entre pares o la planificación del departamento.</w:t>
+        <w:t xml:space="preserve">supuesto orientador de investigación</w:t>
+      </w:r>
+      <w:r>
+        <w:t xml:space="preserve"> </w:t>
+      </w:r>
+      <w:r>
+        <w:t xml:space="preserve">(Sautu, 2005)</w:t>
+      </w:r>
+      <w:r>
+        <w:t xml:space="preserve"> </w:t>
+      </w:r>
+      <w:r>
+        <w:t xml:space="preserve">que estos instrumentos podrían ser percibidos en la práctica como un trámite formal, con escasa incidencia en la autoevaluación docente, el diálogo entre pares o la planificación del departamento.</w:t>
       </w:r>
     </w:p>
     <w:p>
@@ -1679,7 +1688,7 @@
         <w:t xml:space="preserve">diferenciar la evaluación orientada a la mejora pedagógica de aquella vinculada a decisiones laborales sumativas</w:t>
       </w:r>
       <w:r>
-        <w:t xml:space="preserve">. Dado que el Estatuto sanciona que dos evaluaciones cuatrienales consecutivas negativas determinan la vacancia del cargo y llamado a concurso público (Art. 75, inc. c), existe una comprensible prevención docente frente a controles auditadores. Si bien la normativa vigente ya contempla la opinión del Director del Departamento en los informes anuales del legajo académico (Art. 74), la singularidad y valor añadido de este proyecto radica en analizar la factibilidad de un</w:t>
+        <w:t xml:space="preserve">. Dado que el Estatuto sanciona que dos evaluaciones cuatrienales consecutivas negativas determinan la vacancia del cargo y llamado a concurso público —continuando el o la docente en funciones hasta la cobertura por concurso— (Art. 75, inc. c), existe una comprensible prevención docente frente a controles auditadores. Si bien la normativa vigente ya contempla la opinión del Director del Departamento en los informes anuales del legajo académico (Art. 74), la singularidad y valor añadido de este proyecto radica en analizar la factibilidad de un</w:t>
       </w:r>
       <w:r>
         <w:t xml:space="preserve"> </w:t>
@@ -1700,7 +1709,7 @@
         <w:pStyle w:val="BodyText"/>
       </w:pPr>
       <w:r>
-        <w:t xml:space="preserve">Dicho dispositivo busca articular los insumos de los claustros (docentes y estudiantes) y de la Dirección del Departamento —quien es electa por sus propios pares docentes por un período de dos años (Art. 14)— para alimentar de forma directa el Programa Anual de Formación de Recursos Humanos del Departamento (Art. 76) y el perfeccionamiento continuo de la Carrera Docente (Art. 65). Por ello, la viabilidad de la propuesta descansa en la</w:t>
+        <w:t xml:space="preserve">Dicho dispositivo busca articular los insumos de los claustros (docentes y estudiantes) y de la Dirección del Departamento —elegida por quienes integran el departamento por un período de dos años (Art. 14)— para alimentar de forma directa el Programa Anual de Formación de Recursos Humanos del Departamento (Art. 76) y el perfeccionamiento continuo de la Carrera Docente (Art. 65). Por ello, la viabilidad de la propuesta descansa en la</w:t>
       </w:r>
       <w:r>
         <w:t xml:space="preserve"> </w:t>
@@ -1934,13 +1943,13 @@
           <w:b/>
           <w:bCs/>
         </w:rPr>
-        <w:t xml:space="preserve">Fase preliminar y documental (2025):</w:t>
-      </w:r>
-      <w:r>
-        <w:t xml:space="preserve"> </w:t>
-      </w:r>
-      <w:r>
-        <w:t xml:space="preserve">Formulación del problema, revisión bibliográfica sistemática sobre evaluación 360°, análisis normativo institucional (Estatuto UNCo, Ordenanza CS N° 0988/2025; Carrera Docente, Ordenanza CS N° 0920/2019 con sus modificatorias; y CCT Docente, Decreto N° 1246/2015) y diseño metodológico.</w:t>
+        <w:t xml:space="preserve">Fase preliminar y documental (2025–primer semestre 2026):</w:t>
+      </w:r>
+      <w:r>
+        <w:t xml:space="preserve"> </w:t>
+      </w:r>
+      <w:r>
+        <w:t xml:space="preserve">Formulación del problema, revisión bibliográfica sistemática sobre evaluación 360°, análisis normativo institucional (Estatuto UNCo, Ordenanza CS N° 0988/2025; Carrera Docente, Ordenanza CS N° 0920/2019 con sus modificatorias; CCT Docente, Decreto N° 1246/2015) y diseño metodológico.</w:t>
       </w:r>
     </w:p>
     <w:p>
@@ -2562,7 +2571,7 @@
         <w:t xml:space="preserve"> </w:t>
       </w:r>
       <w:r>
-        <w:t xml:space="preserve">Se determina cuando no existen barreras jurídicas insuperables ni rechazo institucional de fondo, pero una o más dimensiones (técnica, procedimental, actitudinal o de gobernanza) requieren instancias previas de gestión institucional: acuerdos paritarios específicos sobre confidencialidad, adecuación de plataformas digitales, talleres de sensibilización, aprobación en el Consejo Directivo de la Unidad Académica o el Consejo Superior, o implementación mediante pruebas piloto graduadas</w:t>
+        <w:t xml:space="preserve">Se determina cuando no existen barreras jurídicas insuperables ni rechazo institucional de fondo, pero una o más dimensiones requieren gestión previa: acuerdos paritarios sobre confidencialidad, adecuación de plataformas digitales, talleres de sensibilización, aprobación de órganos colegiados o implementación mediante pruebas piloto graduadas</w:t>
       </w:r>
       <w:r>
         <w:t xml:space="preserve"> </w:t>
@@ -2571,20 +2580,7 @@
         <w:t xml:space="preserve">(Sifuentes Ocegueda et al., 2016)</w:t>
       </w:r>
       <w:r>
-        <w:t xml:space="preserve">. En caso de que tres o más dimensiones requieran adecuaciones o si la viabilidad exige una modificación estatutaria o reglamentaria expresa del Consejo Superior, el proyecto se categoriza como</w:t>
-      </w:r>
-      <w:r>
-        <w:t xml:space="preserve"> </w:t>
-      </w:r>
-      <w:r>
-        <w:rPr>
-          <w:i/>
-          <w:iCs/>
-        </w:rPr>
-        <w:t xml:space="preserve">Factibilidad Condicionada de Nivel Superior</w:t>
-      </w:r>
-      <w:r>
-        <w:t xml:space="preserve">.</w:t>
+        <w:t xml:space="preserve">. En todos los casos se registrará el nivel de decisión requerido (Departamento, Consejo Directivo del CURZAS o Consejo Superior); cuando la implementación exija una modificación reglamentaria expresa del Consejo Superior, esa condición se consignará de forma explícita.</w:t>
       </w:r>
     </w:p>
     <w:p>
@@ -2758,139 +2754,6 @@
       <w:r>
         <w:t xml:space="preserve">Asimismo, la investigación considera las expectativas y percepciones de los distintos claustros:</w:t>
       </w:r>
-      <w:r>
-        <w:t xml:space="preserve"> </w:t>
-      </w:r>
-      <w:r>
-        <w:t xml:space="preserve">-</w:t>
-      </w:r>
-      <w:r>
-        <w:t xml:space="preserve"> </w:t>
-      </w:r>
-      <w:r>
-        <w:rPr>
-          <w:b/>
-          <w:bCs/>
-        </w:rPr>
-        <w:t xml:space="preserve">Cuerpo docente:</w:t>
-      </w:r>
-      <w:r>
-        <w:t xml:space="preserve"> </w:t>
-      </w:r>
-      <w:r>
-        <w:t xml:space="preserve">Permite conocer si la autoevaluación y el intercambio reflexivo entre pares son valorados como un apoyo formativo para la Carrera Docente (Ord. N° 0920/2019 y modificatorias; CCT Docente, Decreto N° 1246/2015), o si generan reparos frente a sobrecargas de tareas o al uso de la información.</w:t>
-      </w:r>
-      <w:r>
-        <w:t xml:space="preserve"> </w:t>
-      </w:r>
-      <w:r>
-        <w:t xml:space="preserve">-</w:t>
-      </w:r>
-      <w:r>
-        <w:t xml:space="preserve"> </w:t>
-      </w:r>
-      <w:r>
-        <w:rPr>
-          <w:b/>
-          <w:bCs/>
-        </w:rPr>
-        <w:t xml:space="preserve">Claustro estudiantil:</w:t>
-      </w:r>
-      <w:r>
-        <w:t xml:space="preserve"> </w:t>
-      </w:r>
-      <w:r>
-        <w:t xml:space="preserve">Indaga la disposición de los estudiantes para que su opinión trascienda la encuesta administrativa de cierre lectivo y se convierta en un insumo constructivo para mejorar la enseñanza.</w:t>
-      </w:r>
-      <w:r>
-        <w:t xml:space="preserve"> </w:t>
-      </w:r>
-      <w:r>
-        <w:t xml:space="preserve">-</w:t>
-      </w:r>
-      <w:r>
-        <w:t xml:space="preserve"> </w:t>
-      </w:r>
-      <w:r>
-        <w:rPr>
-          <w:b/>
-          <w:bCs/>
-        </w:rPr>
-        <w:t xml:space="preserve">Autoridades departamentales:</w:t>
-      </w:r>
-      <w:r>
-        <w:t xml:space="preserve"> </w:t>
-      </w:r>
-      <w:r>
-        <w:t xml:space="preserve">Posibilita diagnosticar las capacidades técnicas y de gestión necesarias para procesar juicios evaluativos múltiples e integrarlos a la planificación académica y a los planes de capacitación.</w:t>
-      </w:r>
-    </w:p>
-    <w:bookmarkEnd w:id="28"/>
-    <w:bookmarkStart w:id="29" w:name="plano-personal-y-profesional"/>
-    <w:p>
-      <w:pPr>
-        <w:pStyle w:val="Heading2"/>
-        <w:keepNext/>
-        <w:spacing w:before="200" w:after="80" w:line="300" w:lineRule="auto"/>
-      </w:pPr>
-      <w:r>
-        <w:rPr>
-          <w:rFonts w:ascii="Arial" w:hAnsi="Arial"/>
-          <w:b/>
-          <w:sz w:val="24"/>
-        </w:rPr>
-        <w:t xml:space="preserve">3.3 Plano Personal y Profesional</w:t>
-      </w:r>
-    </w:p>
-    <w:p>
-      <w:pPr>
-        <w:pStyle w:val="FirstParagraph"/>
-      </w:pPr>
-      <w:r>
-        <w:t xml:space="preserve">En el orden formativo, el proyecto articula la Licenciatura en Gestión de Recursos Humanos con la formación previa como Técnico Superior en Recursos Humanos y los marcos de la Administración Pública. Permite consolidar habilidades de diagnóstico organizacional e investigación aplicada en el ámbito universitario regional, reafirmando el compromiso ético con el fortalecimiento de la universidad pública en la Patagonia.</w:t>
-      </w:r>
-    </w:p>
-    <w:bookmarkEnd w:id="29"/>
-    <w:bookmarkEnd w:id="30"/>
-    <w:bookmarkStart w:id="34" w:name="definición-de-objetivos-del-tfg"/>
-    <w:p>
-      <w:pPr>
-        <w:pStyle w:val="Heading1"/>
-        <w:keepNext/>
-        <w:spacing w:before="240" w:after="120" w:line="300" w:lineRule="auto"/>
-      </w:pPr>
-      <w:r>
-        <w:rPr>
-          <w:rFonts w:ascii="Arial" w:hAnsi="Arial"/>
-          <w:b/>
-          <w:sz w:val="28"/>
-        </w:rPr>
-        <w:t xml:space="preserve">4. Definición de Objetivos del TFG</w:t>
-      </w:r>
-    </w:p>
-    <w:p>
-      <w:pPr>
-        <w:pStyle w:val="FirstParagraph"/>
-      </w:pPr>
-      <w:r>
-        <w:t xml:space="preserve">En este apartado se formulan las metas analíticas del proyecto en congruencia directa con la pregunta general de investigación y las dimensiones metodológicas planteadas:</w:t>
-      </w:r>
-    </w:p>
-    <w:bookmarkStart w:id="31" w:name="objetivo-general"/>
-    <w:p>
-      <w:pPr>
-        <w:pStyle w:val="Heading2"/>
-        <w:keepNext/>
-        <w:spacing w:before="200" w:after="80" w:line="300" w:lineRule="auto"/>
-      </w:pPr>
-      <w:r>
-        <w:rPr>
-          <w:rFonts w:ascii="Arial" w:hAnsi="Arial"/>
-          <w:b/>
-          <w:sz w:val="24"/>
-        </w:rPr>
-        <w:t xml:space="preserve">4.1 Objetivo General</w:t>
-      </w:r>
     </w:p>
     <w:p>
       <w:pPr>
@@ -2905,17 +2768,61 @@
           <w:b/>
           <w:bCs/>
         </w:rPr>
-        <w:t xml:space="preserve">Analizar</w:t>
-      </w:r>
-      <w:r>
-        <w:t xml:space="preserve"> </w:t>
-      </w:r>
-      <w:r>
-        <w:t xml:space="preserve">los mecanismos de estructuración de la evaluación del desempeño docente y determinar las condiciones de factibilidad organizacional, técnica, normativa y de gobernanza para la eventual implementación de un modelo de retroalimentación multiactoral (360°) en el Departamento de Administración Pública del CURZAS-UNCo (2025–2026).</w:t>
-      </w:r>
-    </w:p>
-    <w:bookmarkEnd w:id="31"/>
-    <w:bookmarkStart w:id="32" w:name="objetivos-específicos"/>
+        <w:t xml:space="preserve">Cuerpo docente:</w:t>
+      </w:r>
+      <w:r>
+        <w:t xml:space="preserve"> </w:t>
+      </w:r>
+      <w:r>
+        <w:t xml:space="preserve">Permite conocer si la autoevaluación y el intercambio reflexivo entre pares son valorados como un apoyo formativo para la Carrera Docente (Ord. N° 0920/2019 y modificatorias; CCT Docente, Decreto N° 1246/2015), o si generan reparos frente a sobrecargas de tareas o al uso de la información.</w:t>
+      </w:r>
+    </w:p>
+    <w:p>
+      <w:pPr>
+        <w:pStyle w:val="Compact"/>
+        <w:numPr>
+          <w:ilvl w:val="0"/>
+          <w:numId w:val="1004"/>
+        </w:numPr>
+      </w:pPr>
+      <w:r>
+        <w:rPr>
+          <w:b/>
+          <w:bCs/>
+        </w:rPr>
+        <w:t xml:space="preserve">Claustro estudiantil:</w:t>
+      </w:r>
+      <w:r>
+        <w:t xml:space="preserve"> </w:t>
+      </w:r>
+      <w:r>
+        <w:t xml:space="preserve">Indaga la disposición de los estudiantes para que su opinión trascienda la encuesta administrativa de cierre lectivo y se convierta en un insumo constructivo para mejorar la enseñanza.</w:t>
+      </w:r>
+    </w:p>
+    <w:p>
+      <w:pPr>
+        <w:pStyle w:val="Compact"/>
+        <w:numPr>
+          <w:ilvl w:val="0"/>
+          <w:numId w:val="1004"/>
+        </w:numPr>
+      </w:pPr>
+      <w:r>
+        <w:rPr>
+          <w:b/>
+          <w:bCs/>
+        </w:rPr>
+        <w:t xml:space="preserve">Autoridades departamentales:</w:t>
+      </w:r>
+      <w:r>
+        <w:t xml:space="preserve"> </w:t>
+      </w:r>
+      <w:r>
+        <w:t xml:space="preserve">Posibilita diagnosticar las capacidades técnicas y de gestión necesarias para procesar juicios evaluativos múltiples e integrarlos a la planificación académica y a los planes de capacitación.</w:t>
+      </w:r>
+    </w:p>
+    <w:bookmarkEnd w:id="28"/>
+    <w:bookmarkStart w:id="29" w:name="plano-personal-y-profesional"/>
     <w:p>
       <w:pPr>
         <w:pStyle w:val="Heading2"/>
@@ -2928,7 +2835,57 @@
           <w:b/>
           <w:sz w:val="24"/>
         </w:rPr>
-        <w:t xml:space="preserve">4.2 Objetivos Específicos</w:t>
+        <w:t xml:space="preserve">3.3 Plano Personal y Profesional</w:t>
+      </w:r>
+    </w:p>
+    <w:p>
+      <w:pPr>
+        <w:pStyle w:val="FirstParagraph"/>
+      </w:pPr>
+      <w:r>
+        <w:t xml:space="preserve">En el orden formativo, el proyecto articula la Licenciatura en Gestión de Recursos Humanos con la formación previa como Técnico Superior en Recursos Humanos y los marcos de la Administración Pública. Permite consolidar habilidades de diagnóstico organizacional e investigación aplicada en el ámbito universitario regional, reafirmando el compromiso ético con el fortalecimiento de la universidad pública en la Patagonia.</w:t>
+      </w:r>
+    </w:p>
+    <w:bookmarkEnd w:id="29"/>
+    <w:bookmarkEnd w:id="30"/>
+    <w:bookmarkStart w:id="34" w:name="definición-de-objetivos-del-tfg"/>
+    <w:p>
+      <w:pPr>
+        <w:pStyle w:val="Heading1"/>
+        <w:keepNext/>
+        <w:spacing w:before="240" w:after="120" w:line="300" w:lineRule="auto"/>
+      </w:pPr>
+      <w:r>
+        <w:rPr>
+          <w:rFonts w:ascii="Arial" w:hAnsi="Arial"/>
+          <w:b/>
+          <w:sz w:val="28"/>
+        </w:rPr>
+        <w:t xml:space="preserve">4. Definición de Objetivos del TFG</w:t>
+      </w:r>
+    </w:p>
+    <w:p>
+      <w:pPr>
+        <w:pStyle w:val="FirstParagraph"/>
+      </w:pPr>
+      <w:r>
+        <w:t xml:space="preserve">En este apartado se formulan las metas analíticas del proyecto en congruencia directa con la pregunta general de investigación y las dimensiones metodológicas planteadas:</w:t>
+      </w:r>
+    </w:p>
+    <w:bookmarkStart w:id="31" w:name="objetivo-general"/>
+    <w:p>
+      <w:pPr>
+        <w:pStyle w:val="Heading2"/>
+        <w:keepNext/>
+        <w:spacing w:before="200" w:after="80" w:line="300" w:lineRule="auto"/>
+      </w:pPr>
+      <w:r>
+        <w:rPr>
+          <w:rFonts w:ascii="Arial" w:hAnsi="Arial"/>
+          <w:b/>
+          <w:sz w:val="24"/>
+        </w:rPr>
+        <w:t xml:space="preserve">4.1 Objetivo General</w:t>
       </w:r>
     </w:p>
     <w:p>
@@ -2944,13 +2901,30 @@
           <w:b/>
           <w:bCs/>
         </w:rPr>
-        <w:t xml:space="preserve">Relevar y caracterizar</w:t>
-      </w:r>
-      <w:r>
-        <w:t xml:space="preserve"> </w:t>
-      </w:r>
-      <w:r>
-        <w:t xml:space="preserve">los instrumentos normativos, procedimientos y prácticas vigentes aplicadas a la evaluación del desempeño docente en el Departamento de Administración Pública del CURZAS-UNCo, distinguiendo las prescripciones estatutarias de su implementación efectiva.</w:t>
+        <w:t xml:space="preserve">Analizar</w:t>
+      </w:r>
+      <w:r>
+        <w:t xml:space="preserve"> </w:t>
+      </w:r>
+      <w:r>
+        <w:t xml:space="preserve">los mecanismos de estructuración de la evaluación del desempeño docente y determinar las condiciones de factibilidad organizacional, técnica, normativa y de gobernanza para la eventual implementación de un modelo de retroalimentación multiactoral (360°) en el Departamento de Administración Pública del CURZAS-UNCo (2025–2026).</w:t>
+      </w:r>
+    </w:p>
+    <w:bookmarkEnd w:id="31"/>
+    <w:bookmarkStart w:id="32" w:name="objetivos-específicos"/>
+    <w:p>
+      <w:pPr>
+        <w:pStyle w:val="Heading2"/>
+        <w:keepNext/>
+        <w:spacing w:before="200" w:after="80" w:line="300" w:lineRule="auto"/>
+      </w:pPr>
+      <w:r>
+        <w:rPr>
+          <w:rFonts w:ascii="Arial" w:hAnsi="Arial"/>
+          <w:b/>
+          <w:sz w:val="24"/>
+        </w:rPr>
+        <w:t xml:space="preserve">4.2 Objetivos Específicos</w:t>
       </w:r>
     </w:p>
     <w:p>
@@ -2958,7 +2932,7 @@
         <w:pStyle w:val="Compact"/>
         <w:numPr>
           <w:ilvl w:val="0"/>
-          <w:numId w:val="1005"/>
+          <w:numId w:val="1006"/>
         </w:numPr>
       </w:pPr>
       <w:r>
@@ -2966,13 +2940,13 @@
           <w:b/>
           <w:bCs/>
         </w:rPr>
-        <w:t xml:space="preserve">Explorar las percepciones, disposiciones y expectativas</w:t>
-      </w:r>
-      <w:r>
-        <w:t xml:space="preserve"> </w:t>
-      </w:r>
-      <w:r>
-        <w:t xml:space="preserve">de los distintos claustros involucrados (docentes y estudiantes) y de las autoridades departamentales respecto a la retroalimentación multiactoral (360°) y las condiciones de confianza institucional requeridas.</w:t>
+        <w:t xml:space="preserve">Relevar y caracterizar</w:t>
+      </w:r>
+      <w:r>
+        <w:t xml:space="preserve"> </w:t>
+      </w:r>
+      <w:r>
+        <w:t xml:space="preserve">los instrumentos normativos, procedimientos y prácticas vigentes aplicadas a la evaluación del desempeño docente en el Departamento de Administración Pública del CURZAS-UNCo, distinguiendo las prescripciones estatutarias de su implementación efectiva.</w:t>
       </w:r>
     </w:p>
     <w:p>
@@ -2980,7 +2954,7 @@
         <w:pStyle w:val="Compact"/>
         <w:numPr>
           <w:ilvl w:val="0"/>
-          <w:numId w:val="1005"/>
+          <w:numId w:val="1006"/>
         </w:numPr>
       </w:pPr>
       <w:r>
@@ -2988,13 +2962,13 @@
           <w:b/>
           <w:bCs/>
         </w:rPr>
-        <w:t xml:space="preserve">Identificar los condicionantes técnico-organizacionales, normativos y de gobernanza</w:t>
-      </w:r>
-      <w:r>
-        <w:t xml:space="preserve"> </w:t>
-      </w:r>
-      <w:r>
-        <w:t xml:space="preserve">(acuerdos paritarios, normativa vigente de carrera docente y evaluación, confidencialidad y cogobierno) que inciden en la factibilidad del modelo.</w:t>
+        <w:t xml:space="preserve">Explorar las percepciones, disposiciones y expectativas</w:t>
+      </w:r>
+      <w:r>
+        <w:t xml:space="preserve"> </w:t>
+      </w:r>
+      <w:r>
+        <w:t xml:space="preserve">de los distintos claustros involucrados (docentes y estudiantes) y de las autoridades departamentales respecto a la retroalimentación multiactoral (360°) y las condiciones de confianza institucional requeridas.</w:t>
       </w:r>
     </w:p>
     <w:p>
@@ -3002,7 +2976,29 @@
         <w:pStyle w:val="Compact"/>
         <w:numPr>
           <w:ilvl w:val="0"/>
-          <w:numId w:val="1005"/>
+          <w:numId w:val="1006"/>
+        </w:numPr>
+      </w:pPr>
+      <w:r>
+        <w:rPr>
+          <w:b/>
+          <w:bCs/>
+        </w:rPr>
+        <w:t xml:space="preserve">Identificar los condicionantes técnico-organizacionales, normativos y de gobernanza</w:t>
+      </w:r>
+      <w:r>
+        <w:t xml:space="preserve"> </w:t>
+      </w:r>
+      <w:r>
+        <w:t xml:space="preserve">(acuerdos paritarios, normativa vigente de carrera docente y evaluación, confidencialidad y cogobierno) que inciden en la factibilidad del modelo.</w:t>
+      </w:r>
+    </w:p>
+    <w:p>
+      <w:pPr>
+        <w:pStyle w:val="Compact"/>
+        <w:numPr>
+          <w:ilvl w:val="0"/>
+          <w:numId w:val="1006"/>
         </w:numPr>
       </w:pPr>
       <w:r>
@@ -3055,15 +3051,15 @@
       <w:r>
         <w:t xml:space="preserve">aporta una clave interpretativa específica al problema planteado:</w:t>
       </w:r>
-      <w:r>
-        <w:t xml:space="preserve"> </w:t>
-      </w:r>
-      <w:r>
-        <w:t xml:space="preserve">*</w:t>
-      </w:r>
-      <w:r>
-        <w:t xml:space="preserve"> </w:t>
-      </w:r>
+    </w:p>
+    <w:p>
+      <w:pPr>
+        <w:pStyle w:val="Compact"/>
+        <w:numPr>
+          <w:ilvl w:val="0"/>
+          <w:numId w:val="1007"/>
+        </w:numPr>
+      </w:pPr>
       <w:r>
         <w:rPr>
           <w:b/>
@@ -3077,15 +3073,15 @@
       <w:r>
         <w:t xml:space="preserve">actúa como eje estructurante para examinar los mecanismos evaluativos vigentes y explorar su potencial transformación hacia una lógica formativa e integral.</w:t>
       </w:r>
-      <w:r>
-        <w:t xml:space="preserve"> </w:t>
-      </w:r>
-      <w:r>
-        <w:t xml:space="preserve">*</w:t>
-      </w:r>
-      <w:r>
-        <w:t xml:space="preserve"> </w:t>
-      </w:r>
+    </w:p>
+    <w:p>
+      <w:pPr>
+        <w:pStyle w:val="Compact"/>
+        <w:numPr>
+          <w:ilvl w:val="0"/>
+          <w:numId w:val="1007"/>
+        </w:numPr>
+      </w:pPr>
       <w:r>
         <w:rPr>
           <w:b/>
@@ -3099,15 +3095,15 @@
       <w:r>
         <w:t xml:space="preserve">permite contrastar los perfiles, funciones docentes y exigencias pedagógicas (presenciales e híbridas en los nodos territoriales) con los criterios reales de evaluación.</w:t>
       </w:r>
-      <w:r>
-        <w:t xml:space="preserve"> </w:t>
-      </w:r>
-      <w:r>
-        <w:t xml:space="preserve">*</w:t>
-      </w:r>
-      <w:r>
-        <w:t xml:space="preserve"> </w:t>
-      </w:r>
+    </w:p>
+    <w:p>
+      <w:pPr>
+        <w:pStyle w:val="Compact"/>
+        <w:numPr>
+          <w:ilvl w:val="0"/>
+          <w:numId w:val="1007"/>
+        </w:numPr>
+      </w:pPr>
       <w:r>
         <w:rPr>
           <w:b/>
@@ -3121,15 +3117,15 @@
       <w:r>
         <w:t xml:space="preserve">analiza la articulación efectiva entre los resultados evaluativos y los planes de capacitación continua, perfeccionamiento didáctico y carrera docente.</w:t>
       </w:r>
-      <w:r>
-        <w:t xml:space="preserve"> </w:t>
-      </w:r>
-      <w:r>
-        <w:t xml:space="preserve">*</w:t>
-      </w:r>
-      <w:r>
-        <w:t xml:space="preserve"> </w:t>
-      </w:r>
+    </w:p>
+    <w:p>
+      <w:pPr>
+        <w:pStyle w:val="Compact"/>
+        <w:numPr>
+          <w:ilvl w:val="0"/>
+          <w:numId w:val="1007"/>
+        </w:numPr>
+      </w:pPr>
       <w:r>
         <w:rPr>
           <w:b/>
@@ -3146,7 +3142,7 @@
     </w:p>
     <w:p>
       <w:pPr>
-        <w:pStyle w:val="BodyText"/>
+        <w:pStyle w:val="FirstParagraph"/>
       </w:pPr>
       <w:r>
         <w:t xml:space="preserve">En consecuencia, el modelo de Longo no se utiliza únicamente como encuadre teórico, sino como criterio de lectura para analizar la articulación entre evaluación del desempeño, desarrollo de capacidades docentes, organización del trabajo y relaciones institucionales, permitiendo identificar condiciones que favorecen o limitan la factibilidad de una retroalimentación 360°.</w:t>
@@ -3523,13 +3519,13 @@
                 <w:b/>
                 <w:bCs/>
               </w:rPr>
-              <w:t xml:space="preserve">Dimensión técnico-viabilidad:</w:t>
+              <w:t xml:space="preserve">Dimensión normativa y de gobernanza:</w:t>
             </w:r>
             <w:r>
               <w:t xml:space="preserve"> </w:t>
             </w:r>
             <w:r>
-              <w:t xml:space="preserve">Identificación de condicionantes paritarios, procedimentales, gremiales y de confidencialidad</w:t>
+              <w:t xml:space="preserve">Identificación de condicionantes paritarios, normativos, gremiales y de confidencialidad</w:t>
             </w:r>
           </w:p>
         </w:tc>
@@ -3558,7 +3554,7 @@
                 <w:i/>
                 <w:iCs/>
               </w:rPr>
-              <w:t xml:space="preserve">Condiciones de trabajo, estabilidad y Carrera Docente - Dec. N° 1246/2015 y Ord. N° 0920/2019 y modif.</w:t>
+              <w:t xml:space="preserve">Condiciones de trabajo, estabilidad y normativa vigente de carrera docente</w:t>
             </w:r>
             <w:r>
               <w:t xml:space="preserve">)</w:t>
@@ -4424,6 +4420,9 @@
     <w:abstractNumId w:val="991"/>
   </w:num>
   <w:num w:numId="1005">
+    <w:abstractNumId w:val="991"/>
+  </w:num>
+  <w:num w:numId="1006">
     <w:abstractNumId w:val="99411"/>
     <w:lvlOverride w:ilvl="0">
       <w:startOverride w:val="1"/>
@@ -4452,6 +4451,9 @@
     <w:lvlOverride w:ilvl="8">
       <w:startOverride w:val="1"/>
     </w:lvlOverride>
+  </w:num>
+  <w:num w:numId="1007">
+    <w:abstractNumId w:val="991"/>
   </w:num>
 </w:numbering>
 </file>

</xml_diff>

<commit_message>
feat: add Actividad 2 research project document and bibliography for TFG proposal
</commit_message>
<xml_diff>
--- a/Entregas/Actividad 2/TP2_Ayarachi_Fuentes.docx
+++ b/Entregas/Actividad 2/TP2_Ayarachi_Fuentes.docx
@@ -836,7 +836,7 @@
           <w:rFonts w:ascii="Arial" w:hAnsi="Arial"/>
           <w:sz w:val="22"/>
         </w:rPr>
-        <w:t>4.3 Matriz de Consistencia Metodológica y Articulación con Longo (2004)</w:t>
+        <w:t>4.3 Matriz de Consistencia Metodológica y Articulación con Longo (2006)</w:t>
       </w:r>
       <w:r>
         <w:tab/>
@@ -873,7 +873,7 @@
           <w:rFonts w:ascii="Arial" w:hAnsi="Arial"/>
           <w:sz w:val="22"/>
         </w:rPr>
-        <w:t>11</w:t>
+        <w:t>12</w:t>
       </w:r>
     </w:p>
     <w:p>
@@ -900,7 +900,7 @@
           <w:rFonts w:ascii="Arial" w:hAnsi="Arial"/>
           <w:sz w:val="22"/>
         </w:rPr>
-        <w:t>11</w:t>
+        <w:t>12</w:t>
       </w:r>
     </w:p>
     <w:p>
@@ -993,36 +993,7 @@
         <w:pStyle w:val="FirstParagraph"/>
       </w:pPr>
       <w:r>
-        <w:t xml:space="preserve">Este proyecto de investigación se ubica en el cruce disciplinar entre la</w:t>
-      </w:r>
-      <w:r>
-        <w:t xml:space="preserve"> </w:t>
-      </w:r>
-      <w:r>
-        <w:rPr>
-          <w:b/>
-          <w:bCs/>
-        </w:rPr>
-        <w:t xml:space="preserve">Administración Pública</w:t>
-      </w:r>
-      <w:r>
-        <w:t xml:space="preserve"> </w:t>
-      </w:r>
-      <w:r>
-        <w:t xml:space="preserve">y la</w:t>
-      </w:r>
-      <w:r>
-        <w:t xml:space="preserve"> </w:t>
-      </w:r>
-      <w:r>
-        <w:rPr>
-          <w:b/>
-          <w:bCs/>
-        </w:rPr>
-        <w:t xml:space="preserve">Gestión de Recursos Humanos</w:t>
-      </w:r>
-      <w:r>
-        <w:t xml:space="preserve">. Su abordaje responde a los desafíos actuales de modernización institucional y desarrollo de capacidades estatales en el sector público</w:t>
+        <w:t xml:space="preserve">Este proyecto de investigación se ubica en el cruce disciplinar entre la Administración Pública y la Gestión de Recursos Humanos. Su abordaje responde a los desafíos actuales de modernización institucional y desarrollo de capacidades estatales en el sector público</w:t>
       </w:r>
       <w:r>
         <w:t xml:space="preserve"> </w:t>
@@ -1031,16 +1002,16 @@
         <w:t xml:space="preserve">(Oszlak, 2020)</w:t>
       </w:r>
       <w:r>
-        <w:t xml:space="preserve">. Conforme a las pautas del Seminario de Integración y Aplicación (SIA) y a los criterios del Reglamento de Trabajo Final de Graduación</w:t>
-      </w:r>
-      <w:r>
-        <w:t xml:space="preserve"> </w:t>
-      </w:r>
-      <w:r>
-        <w:t xml:space="preserve">(Universidad Nacional del Comahue - CURZAS, 2023)</w:t>
-      </w:r>
-      <w:r>
-        <w:t xml:space="preserve">, el tema se delimita mediante el criterio de</w:t>
+        <w:t xml:space="preserve">. Conforme a las pautas del Seminario de Integración y Aplicación (SIA) y a los criterios del Reglamento de Trabajo Final de Graduación [Resolución CD-CURZAS N° 266/23;</w:t>
+      </w:r>
+      <w:r>
+        <w:t xml:space="preserve"> </w:t>
+      </w:r>
+      <w:r>
+        <w:t xml:space="preserve">Consejo Directivo del CURZAS (2023)</w:t>
+      </w:r>
+      <w:r>
+        <w:t xml:space="preserve">], el tema se delimita mediante el criterio de</w:t>
       </w:r>
       <w:r>
         <w:t xml:space="preserve"> </w:t>
@@ -1063,47 +1034,13 @@
         <w:pStyle w:val="BodyText"/>
       </w:pPr>
       <w:r>
-        <w:t xml:space="preserve">A nivel teórico, la investigación adopta como marco analítico el</w:t>
-      </w:r>
-      <w:r>
-        <w:t xml:space="preserve"> </w:t>
-      </w:r>
-      <w:r>
-        <w:rPr>
-          <w:b/>
-          <w:bCs/>
-        </w:rPr>
-        <w:t xml:space="preserve">Modelo de Gestión del Empleo Público y Recursos Humanos</w:t>
-      </w:r>
-      <w:r>
-        <w:t xml:space="preserve"> </w:t>
-      </w:r>
-      <w:r>
-        <w:t xml:space="preserve">de</w:t>
-      </w:r>
-      <w:r>
-        <w:t xml:space="preserve"> </w:t>
-      </w:r>
-      <w:r>
-        <w:rPr>
-          <w:b/>
-          <w:bCs/>
-        </w:rPr>
-        <w:t xml:space="preserve">Francisco</w:t>
-      </w:r>
-      <w:r>
-        <w:rPr>
-          <w:b/>
-          <w:bCs/>
-        </w:rPr>
-        <w:t xml:space="preserve"> </w:t>
-      </w:r>
-      <w:r>
-        <w:rPr>
-          <w:b/>
-          <w:bCs/>
-        </w:rPr>
-        <w:t xml:space="preserve">Longo (2004)</w:t>
+        <w:t xml:space="preserve">A nivel teórico, la investigación adopta como marco analítico el modelo de gestión del empleo público y recursos humanos de Francisco</w:t>
+      </w:r>
+      <w:r>
+        <w:t xml:space="preserve"> </w:t>
+      </w:r>
+      <w:r>
+        <w:t xml:space="preserve">Longo (2006)</w:t>
       </w:r>
       <w:r>
         <w:t xml:space="preserve">. Este modelo concibe la administración de personas como un sistema articulado con la estrategia institucional y compuesto por subsistemas interdependientes:</w:t>
@@ -1118,7 +1055,7 @@
           <wp:inline>
             <wp:extent cx="3733800" cy="2893695"/>
             <wp:effectExtent b="0" l="0" r="0" t="0"/>
-            <wp:docPr descr="Subsistemas de la Gestión de Recursos Humanos en el Sector Público (Longo, 2004)." title="" id="14" name="Picture"/>
+            <wp:docPr descr="Subsistemas de la Gestión de Recursos Humanos en el Sector Público (Longo, 2006)." title="" id="14" name="Picture"/>
             <a:graphic>
               <a:graphicData uri="http://schemas.openxmlformats.org/drawingml/2006/picture">
                 <pic:pic>
@@ -1188,7 +1125,7 @@
           <w:i/>
           <w:iCs/>
         </w:rPr>
-        <w:t xml:space="preserve">(Longo, 2004)</w:t>
+        <w:t xml:space="preserve">(Longo, 2006)</w:t>
       </w:r>
       <w:r>
         <w:rPr>
@@ -1203,68 +1140,16 @@
         <w:pStyle w:val="BodyText"/>
       </w:pPr>
       <w:r>
-        <w:t xml:space="preserve">Dentro de este esquema, el trabajo hace foco en el</w:t>
-      </w:r>
-      <w:r>
-        <w:t xml:space="preserve"> </w:t>
-      </w:r>
-      <w:r>
-        <w:rPr>
-          <w:b/>
-          <w:bCs/>
-        </w:rPr>
-        <w:t xml:space="preserve">Subsistema de Gestión del Rendimiento (Evaluación del Desempeño)</w:t>
-      </w:r>
-      <w:r>
-        <w:t xml:space="preserve">, articulado con tres subsistemas clave:</w:t>
-      </w:r>
-      <w:r>
-        <w:t xml:space="preserve"> </w:t>
-      </w:r>
-      <w:r>
-        <w:rPr>
-          <w:b/>
-          <w:bCs/>
-        </w:rPr>
-        <w:t xml:space="preserve">Gestión del Desarrollo</w:t>
-      </w:r>
-      <w:r>
-        <w:t xml:space="preserve"> </w:t>
-      </w:r>
-      <w:r>
-        <w:t xml:space="preserve">(capacitación y carrera docente),</w:t>
-      </w:r>
-      <w:r>
-        <w:t xml:space="preserve"> </w:t>
-      </w:r>
-      <w:r>
-        <w:rPr>
-          <w:b/>
-          <w:bCs/>
-        </w:rPr>
-        <w:t xml:space="preserve">Organización del Trabajo</w:t>
-      </w:r>
-      <w:r>
-        <w:t xml:space="preserve"> </w:t>
-      </w:r>
-      <w:r>
-        <w:t xml:space="preserve">(perfiles y funciones académicas) y</w:t>
-      </w:r>
-      <w:r>
-        <w:t xml:space="preserve"> </w:t>
-      </w:r>
-      <w:r>
-        <w:rPr>
-          <w:b/>
-          <w:bCs/>
-        </w:rPr>
-        <w:t xml:space="preserve">Gestión de las Relaciones Humanas</w:t>
-      </w:r>
-      <w:r>
-        <w:t xml:space="preserve"> </w:t>
-      </w:r>
-      <w:r>
-        <w:t xml:space="preserve">(clima laboral y cultura participativa).</w:t>
+        <w:t xml:space="preserve">En el modelo propuesto por</w:t>
+      </w:r>
+      <w:r>
+        <w:t xml:space="preserve"> </w:t>
+      </w:r>
+      <w:r>
+        <w:t xml:space="preserve">Longo (2006)</w:t>
+      </w:r>
+      <w:r>
+        <w:t xml:space="preserve">, la presente investigación focaliza en el subsistema de gestión del rendimiento (evaluación del desempeño), articulado con tres subsistemas clave: gestión del desarrollo (capacitación y carrera docente), organización del trabajo (perfiles y funciones académicas) y gestión de las relaciones humanas y sociales (clima laboral y cultura participativa).</w:t>
       </w:r>
     </w:p>
     <w:p>
@@ -1284,23 +1169,7 @@
         <w:t xml:space="preserve"> </w:t>
       </w:r>
       <w:r>
-        <w:t xml:space="preserve">para orientarse hacia un enfoque formativo de aprendizaje continuo. Para lograrlo, la investigación examina la factibilidad de un modelo de</w:t>
-      </w:r>
-      <w:r>
-        <w:t xml:space="preserve"> </w:t>
-      </w:r>
-      <w:r>
-        <w:rPr>
-          <w:b/>
-          <w:bCs/>
-        </w:rPr>
-        <w:t xml:space="preserve">retroalimentación 360 grados</w:t>
-      </w:r>
-      <w:r>
-        <w:t xml:space="preserve"> </w:t>
-      </w:r>
-      <w:r>
-        <w:t xml:space="preserve">adaptado al ámbito de la educación superior</w:t>
+        <w:t xml:space="preserve">para orientarse hacia un enfoque formativo de aprendizaje continuo. Para lograrlo, la investigación examina la factibilidad de un modelo de retroalimentación 360 grados adaptado al ámbito de la educación superior</w:t>
       </w:r>
       <w:r>
         <w:t xml:space="preserve"> </w:t>
@@ -1334,36 +1203,7 @@
         <w:pStyle w:val="FirstParagraph"/>
       </w:pPr>
       <w:r>
-        <w:t xml:space="preserve">El estudio se sitúa en el</w:t>
-      </w:r>
-      <w:r>
-        <w:t xml:space="preserve"> </w:t>
-      </w:r>
-      <w:r>
-        <w:rPr>
-          <w:b/>
-          <w:bCs/>
-        </w:rPr>
-        <w:t xml:space="preserve">Complejo Universitario Regional Zona Atlántica y Sur (CURZAS)</w:t>
-      </w:r>
-      <w:r>
-        <w:t xml:space="preserve">, unidad académica descentralizada de la</w:t>
-      </w:r>
-      <w:r>
-        <w:t xml:space="preserve"> </w:t>
-      </w:r>
-      <w:r>
-        <w:rPr>
-          <w:b/>
-          <w:bCs/>
-        </w:rPr>
-        <w:t xml:space="preserve">Universidad Nacional del Comahue (UNCo)</w:t>
-      </w:r>
-      <w:r>
-        <w:t xml:space="preserve"> </w:t>
-      </w:r>
-      <w:r>
-        <w:t xml:space="preserve">en la ciudad de Viedma, capital de Río Negro. A nivel histórico y regulatorio, la Ley N° 24.521 de Educación Superior</w:t>
+        <w:t xml:space="preserve">El estudio se sitúa en el Complejo Universitario Regional Zona Atlántica y Sur (CURZAS), unidad académica descentralizada de la Universidad Nacional del Comahue (UNCo) en la ciudad de Viedma, capital de la Provincia de Río Negro. A nivel histórico y regulatorio, la Ley N° 24.521 de Educación Superior</w:t>
       </w:r>
       <w:r>
         <w:t xml:space="preserve"> </w:t>
@@ -1383,23 +1223,7 @@
         <w:pStyle w:val="BodyText"/>
       </w:pPr>
       <w:r>
-        <w:t xml:space="preserve">En este marco, el</w:t>
-      </w:r>
-      <w:r>
-        <w:t xml:space="preserve"> </w:t>
-      </w:r>
-      <w:r>
-        <w:rPr>
-          <w:b/>
-          <w:bCs/>
-        </w:rPr>
-        <w:t xml:space="preserve">Departamento de Administración Pública</w:t>
-      </w:r>
-      <w:r>
-        <w:t xml:space="preserve"> </w:t>
-      </w:r>
-      <w:r>
-        <w:t xml:space="preserve">cumple una función estratégica en el desarrollo comarcal y provincial. Tiene a su cargo las carreras de Licenciatura en Administración Pública, Licenciatura en Gestión de Recursos Humanos y ciclos de complementación curricular para agentes públicos. Su comunidad estudiantil está conformada tanto por jóvenes de la comarca Viedma-Carmen de Patagones como por trabajadores insertos en organismos públicos de diversa índole.</w:t>
+        <w:t xml:space="preserve">En este marco, el Departamento de Administración Pública cumple una función estratégica en el desarrollo regional y provincial. Tiene a su cargo las carreras de Licenciatura en Administración Pública, Licenciatura en Gestión de Recursos Humanos y ciclos de complementación curricular para agentes públicos. Su comunidad estudiantil está conformada tanto por jóvenes y personas provenientes de las ciudades de Viedma (Provincia de Río Negro) y Carmen de Patagones (Provincia de Buenos Aires), como por trabajadores insertos en organismos públicos de diversa índole.</w:t>
       </w:r>
     </w:p>
     <w:p>
@@ -1407,23 +1231,7 @@
         <w:pStyle w:val="BodyText"/>
       </w:pPr>
       <w:r>
-        <w:t xml:space="preserve">A esta realidad se suma la consolidación de la</w:t>
-      </w:r>
-      <w:r>
-        <w:t xml:space="preserve"> </w:t>
-      </w:r>
-      <w:r>
-        <w:rPr>
-          <w:b/>
-          <w:bCs/>
-        </w:rPr>
-        <w:t xml:space="preserve">Red de Nodos Universitarios</w:t>
-      </w:r>
-      <w:r>
-        <w:t xml:space="preserve"> </w:t>
-      </w:r>
-      <w:r>
-        <w:t xml:space="preserve">en localidades de la Línea Sur y la Costa Atlántica rionegrina (tales como Sierra Grande, Valcheta, Los Menucos y Ramos Mexía, entre otras localidades). Esta expansión territorial impone modalidades pedagógicas híbridas que combinan entornos virtuales y encuentros presenciales, lo que demanda de los equipos docentes competencias específicas de tutoría y acompañamiento digital.</w:t>
+        <w:t xml:space="preserve">A esta realidad se suma la consolidación de la Red de Nodos Universitarios en localidades de la Línea Sur y la Costa Atlántica rionegrina (tales como Sierra Grande, Valcheta, Los Menucos y Ramos Mexía, entre otras localidades). Esta expansión territorial impone modalidades pedagógicas híbridas que combinan entornos virtuales y encuentros presenciales, lo que demanda de los equipos docentes competencias específicas de tutoría y acompañamiento digital.</w:t>
       </w:r>
     </w:p>
     <w:p>
@@ -1469,17 +1277,7 @@
         <w:pStyle w:val="BodyText"/>
       </w:pPr>
       <w:r>
-        <w:t xml:space="preserve">A partir de este marco, el proyecto plantea como</w:t>
-      </w:r>
-      <w:r>
-        <w:t xml:space="preserve"> </w:t>
-      </w:r>
-      <w:r>
-        <w:rPr>
-          <w:b/>
-          <w:bCs/>
-        </w:rPr>
-        <w:t xml:space="preserve">supuesto orientador de investigación</w:t>
+        <w:t xml:space="preserve">A partir de este marco, el proyecto plantea como supuesto orientador de investigación</w:t>
       </w:r>
       <w:r>
         <w:t xml:space="preserve"> </w:t>
@@ -1491,36 +1289,7 @@
         <w:t xml:space="preserve"> </w:t>
       </w:r>
       <w:r>
-        <w:t xml:space="preserve">que, en la dinámica cotidiana, dichos dispositivos estatutarios podrían estar funcionando prioritariamente con un sentido administrativo y sumativo, enfocado en la acreditación reglamentaria de permanencia. No obstante, lejos de asumir una conclusión anticipada,</w:t>
-      </w:r>
-      <w:r>
-        <w:t xml:space="preserve"> </w:t>
-      </w:r>
-      <w:r>
-        <w:rPr>
-          <w:b/>
-          <w:bCs/>
-        </w:rPr>
-        <w:t xml:space="preserve">será necesario indagar empíricamente si</w:t>
-      </w:r>
-      <w:r>
-        <w:t xml:space="preserve"> </w:t>
-      </w:r>
-      <w:r>
-        <w:t xml:space="preserve">estas herramientas generan instancias efectivas de retroalimentación pedagógica y si sus resultados se vinculan efectivamente con planes de formación docente para el período</w:t>
-      </w:r>
-      <w:r>
-        <w:t xml:space="preserve"> </w:t>
-      </w:r>
-      <w:r>
-        <w:rPr>
-          <w:b/>
-          <w:bCs/>
-        </w:rPr>
-        <w:t xml:space="preserve">2025–2026</w:t>
-      </w:r>
-      <w:r>
-        <w:t xml:space="preserve">.</w:t>
+        <w:t xml:space="preserve">que, en la dinámica cotidiana, dichos dispositivos estatutarios podrían estar funcionando prioritariamente con un sentido administrativo y sumativo, enfocado en la acreditación reglamentaria de permanencia. No obstante, lejos de asumir una conclusión anticipada, será necesario indagar empíricamente si estas herramientas generan instancias efectivas de retroalimentación pedagógica y si sus resultados se vinculan efectivamente con planes de formación docente para el período 2025–2026.</w:t>
       </w:r>
     </w:p>
     <w:bookmarkEnd w:id="17"/>
@@ -1585,7 +1354,7 @@
         <w:t xml:space="preserve"> </w:t>
       </w:r>
       <w:r>
-        <w:t xml:space="preserve">(Longo, 2004)</w:t>
+        <w:t xml:space="preserve">(Longo, 2006)</w:t>
       </w:r>
       <w:r>
         <w:t xml:space="preserve">.</w:t>
@@ -1596,30 +1365,7 @@
         <w:pStyle w:val="BodyText"/>
       </w:pPr>
       <w:r>
-        <w:t xml:space="preserve">En este sentido, la investigación no parte de suponer una falta de mecanismos de evaluación —ya que existen normas y procedimientos vigentes—, sino de indagar la</w:t>
-      </w:r>
-      <w:r>
-        <w:t xml:space="preserve"> </w:t>
-      </w:r>
-      <w:r>
-        <w:rPr>
-          <w:b/>
-          <w:bCs/>
-        </w:rPr>
-        <w:t xml:space="preserve">posible desconexión entre los circuitos de evaluación del rendimiento y las oportunidades reales de desarrollo pedagógico</w:t>
-      </w:r>
-      <w:r>
-        <w:t xml:space="preserve">. Se formula como</w:t>
-      </w:r>
-      <w:r>
-        <w:t xml:space="preserve"> </w:t>
-      </w:r>
-      <w:r>
-        <w:rPr>
-          <w:b/>
-          <w:bCs/>
-        </w:rPr>
-        <w:t xml:space="preserve">supuesto orientador de investigación</w:t>
+        <w:t xml:space="preserve">En este sentido, la investigación no parte de suponer la inexistencia de mecanismos de evaluación —ya que existen normas y procedimientos vigentes—, sino de indagar la posible desconexión entre los circuitos de evaluación del rendimiento y las oportunidades reales de desarrollo pedagógico. Se formula como supuesto orientador de investigación</w:t>
       </w:r>
       <w:r>
         <w:t xml:space="preserve"> </w:t>
@@ -1651,23 +1397,7 @@
         <w:t xml:space="preserve"> </w:t>
       </w:r>
       <w:r>
-        <w:t xml:space="preserve">destaca el modelo de</w:t>
-      </w:r>
-      <w:r>
-        <w:t xml:space="preserve"> </w:t>
-      </w:r>
-      <w:r>
-        <w:rPr>
-          <w:b/>
-          <w:bCs/>
-        </w:rPr>
-        <w:t xml:space="preserve">retroalimentación multiactoral o 360 grados</w:t>
-      </w:r>
-      <w:r>
-        <w:t xml:space="preserve"> </w:t>
-      </w:r>
-      <w:r>
-        <w:t xml:space="preserve">como un dispositivo valioso para articular la autoevaluación reflexiva del profesorado, el juicio de valor entre pares, la apreciación estudiantil y la valoración de las autoridades académicas.</w:t>
+        <w:t xml:space="preserve">destaca el modelo de retroalimentación multiactoral o 360 grados como un dispositivo valioso para articular la autoevaluación reflexiva del profesorado, el juicio de valor entre pares, la apreciación estudiantil y la valoración de las autoridades académicas.</w:t>
       </w:r>
     </w:p>
     <w:p>
@@ -1675,33 +1405,7 @@
         <w:pStyle w:val="BodyText"/>
       </w:pPr>
       <w:r>
-        <w:t xml:space="preserve">En una universidad pública cogobernada, es indispensable</w:t>
-      </w:r>
-      <w:r>
-        <w:t xml:space="preserve"> </w:t>
-      </w:r>
-      <w:r>
-        <w:rPr>
-          <w:b/>
-          <w:bCs/>
-        </w:rPr>
-        <w:t xml:space="preserve">diferenciar la evaluación orientada a la mejora pedagógica de aquella vinculada a decisiones laborales sumativas</w:t>
-      </w:r>
-      <w:r>
-        <w:t xml:space="preserve">. Dado que el Estatuto sanciona que dos evaluaciones cuatrienales consecutivas negativas determinan la vacancia del cargo y llamado a concurso público —continuando el o la docente en funciones hasta la cobertura por concurso— (Art. 75, inc. c), existe una comprensible prevención docente frente a controles auditadores. Si bien la normativa vigente ya contempla la opinión del Director del Departamento en los informes anuales del legajo académico (Art. 74), la singularidad y valor añadido de este proyecto radica en analizar la factibilidad de un</w:t>
-      </w:r>
-      <w:r>
-        <w:t xml:space="preserve"> </w:t>
-      </w:r>
-      <w:r>
-        <w:rPr>
-          <w:b/>
-          <w:bCs/>
-        </w:rPr>
-        <w:t xml:space="preserve">circuito de retroalimentación 360° estrictamente formativo, confidencial e independiente del legajo sumativo</w:t>
-      </w:r>
-      <w:r>
-        <w:t xml:space="preserve">.</w:t>
+        <w:t xml:space="preserve">En una universidad pública cogobernada, es indispensable diferenciar la evaluación orientada a la mejora pedagógica de aquella vinculada a decisiones laborales sumativas. Dado que el Estatuto sanciona que dos evaluaciones cuatrienales consecutivas negativas determinan la vacancia del cargo y llamado a concurso público —continuando el o la docente en funciones hasta la cobertura por concurso— (Art. 75, inc. c), existe una comprensible prevención docente frente a controles auditadores. Si bien la normativa vigente ya contempla la opinión del Director del Departamento en los informes anuales del legajo académico (Art. 74), la singularidad y valor añadido de este proyecto radica en analizar la factibilidad de un circuito de retroalimentación 360° estrictamente formativo, confidencial e independiente del legajo sumativo.</w:t>
       </w:r>
     </w:p>
     <w:p>
@@ -1709,20 +1413,7 @@
         <w:pStyle w:val="BodyText"/>
       </w:pPr>
       <w:r>
-        <w:t xml:space="preserve">Dicho dispositivo busca articular los insumos de los claustros (docentes y estudiantes) y de la Dirección del Departamento —elegida por quienes integran el departamento por un período de dos años (Art. 14)— para alimentar de forma directa el Programa Anual de Formación de Recursos Humanos del Departamento (Art. 76) y el perfeccionamiento continuo de la Carrera Docente (Art. 65). Por ello, la viabilidad de la propuesta descansa en la</w:t>
-      </w:r>
-      <w:r>
-        <w:t xml:space="preserve"> </w:t>
-      </w:r>
-      <w:r>
-        <w:rPr>
-          <w:b/>
-          <w:bCs/>
-        </w:rPr>
-        <w:t xml:space="preserve">gobernanza universitaria</w:t>
-      </w:r>
-      <w:r>
-        <w:t xml:space="preserve">: un espacio colegiado donde las políticas de gestión de personas se construyen sobre</w:t>
+        <w:t xml:space="preserve">Dicho dispositivo busca articular los insumos de los claustros (docentes y estudiantes) y de la Dirección del Departamento —elegida por quienes integran el departamento por un período de dos años (Art. 14)— para alimentar de forma directa el Programa Anual de Formación de Recursos Humanos del Departamento (Art. 76) y el perfeccionamiento continuo de la Carrera Docente (Art. 65). Por ello, la viabilidad de la propuesta descansa en la gobernanza universitaria: un espacio colegiado donde las políticas de gestión de personas se construyen sobre</w:t>
       </w:r>
       <w:r>
         <w:t xml:space="preserve"> </w:t>
@@ -1738,7 +1429,7 @@
         <w:t xml:space="preserve"> </w:t>
       </w:r>
       <w:r>
-        <w:t xml:space="preserve">(Longo, 2004; Matus, 1993)</w:t>
+        <w:t xml:space="preserve">(Longo, 2006; Matus, 1993)</w:t>
       </w:r>
       <w:r>
         <w:t xml:space="preserve">.</w:t>
@@ -1788,7 +1479,7 @@
         <w:t xml:space="preserve"> </w:t>
       </w:r>
       <w:r>
-        <w:t xml:space="preserve">Mecanismos de estructuración de la evaluación del desempeño docente y análisis de factibilidad para implementar un modelo de retroalimentación multiactoral (360°), articulando autoevaluación, valoración de pares, opinión de estudiantes y seguimiento departamental.</w:t>
+        <w:t xml:space="preserve">Condiciones de factibilidad organizacional, técnica, normativa y de gobernanza para la implementación de un modelo de retroalimentación multiactoral (360°) en la evaluación del desempeño docente en el Departamento de Administración Pública del CURZAS-UNCo.</w:t>
       </w:r>
     </w:p>
     <w:p>
@@ -1889,7 +1580,7 @@
         <w:t xml:space="preserve"> </w:t>
       </w:r>
       <w:r>
-        <w:t xml:space="preserve">Longo (2004)</w:t>
+        <w:t xml:space="preserve">Longo (2006)</w:t>
       </w:r>
       <w:r>
         <w:t xml:space="preserve">].</w:t>
@@ -1914,20 +1605,7 @@
         <w:t xml:space="preserve"> </w:t>
       </w:r>
       <w:r>
-        <w:t xml:space="preserve">Período de investigación</w:t>
-      </w:r>
-      <w:r>
-        <w:t xml:space="preserve"> </w:t>
-      </w:r>
-      <w:r>
-        <w:rPr>
-          <w:b/>
-          <w:bCs/>
-        </w:rPr>
-        <w:t xml:space="preserve">2025–2026</w:t>
-      </w:r>
-      <w:r>
-        <w:t xml:space="preserve">, organizado en dos etapas:</w:t>
+        <w:t xml:space="preserve">Período de investigación 2025–2026, organizado en dos etapas:</w:t>
       </w:r>
     </w:p>
     <w:p>
@@ -1993,7 +1671,7 @@
         <w:t xml:space="preserve"> </w:t>
       </w:r>
       <w:r>
-        <w:t xml:space="preserve">Departamento de Administración Pública, Complejo Universitario Regional Zona Atlántica y Sur (CURZAS), Universidad Nacional del Comahue, ciudad de Viedma, Río Negro.</w:t>
+        <w:t xml:space="preserve">Departamento de Administración Pública, Complejo Universitario Regional Zona Atlántica y Sur (CURZAS), Universidad Nacional del Comahue, ciudad de Viedma (Provincia de Río Negro).</w:t>
       </w:r>
     </w:p>
     <w:bookmarkEnd w:id="20"/>
@@ -2035,7 +1713,21 @@
         <w:pStyle w:val="FirstParagraph"/>
       </w:pPr>
       <w:r>
-        <w:t xml:space="preserve">En el marco de la gestión pública universitaria, la</w:t>
+        <w:t xml:space="preserve">En el marco de la gestión pública universitaria, la factibilidad en esta investigación no se concibe como una viabilidad técnica abstracta ni como una imposición gerencial vertical. Se define operativamente como la convergencia de condiciones normativas, organizacionales, técnicas y de legitimidad institucional que permitan implementar un modelo de retroalimentación 360° con sentido formativo y sin vulnerar derechos laborales adquiridos.</w:t>
+      </w:r>
+    </w:p>
+    <w:p>
+      <w:pPr>
+        <w:pStyle w:val="BodyText"/>
+      </w:pPr>
+      <w:r>
+        <w:t xml:space="preserve">En términos prácticos, determinar si el modelo es factible en el Departamento de Administración Pública del CURZAS exige responder a cinco interrogantes centrales, correspondientes punto por punto con sus dimensiones analíticas:</w:t>
+      </w:r>
+      <w:r>
+        <w:t xml:space="preserve"> </w:t>
+      </w:r>
+      <w:r>
+        <w:t xml:space="preserve">1.</w:t>
       </w:r>
       <w:r>
         <w:t xml:space="preserve"> </w:t>
@@ -2045,13 +1737,19 @@
           <w:b/>
           <w:bCs/>
         </w:rPr>
-        <w:t xml:space="preserve">factibilidad</w:t>
-      </w:r>
-      <w:r>
-        <w:t xml:space="preserve"> </w:t>
-      </w:r>
-      <w:r>
-        <w:t xml:space="preserve">en esta investigación no se concibe como una viabilidad técnica abstracta ni como una imposición gerencial vertical. Se define operativamente como la</w:t>
+        <w:t xml:space="preserve">Factibilidad Normativa y Estatutaria:</w:t>
+      </w:r>
+      <w:r>
+        <w:t xml:space="preserve"> </w:t>
+      </w:r>
+      <w:r>
+        <w:t xml:space="preserve">¿Puede aplicarse con fines formativos sin colisionar con la estabilidad laboral regulada por el Estatuto UNCo (Ord. N° 0988/2025), la Carrera Docente (Ord. N° 0920/2019 y modificatorias) y el CCT Docente (Decreto N° 1246/2015)?</w:t>
+      </w:r>
+      <w:r>
+        <w:t xml:space="preserve"> </w:t>
+      </w:r>
+      <w:r>
+        <w:t xml:space="preserve">2.</w:t>
       </w:r>
       <w:r>
         <w:t xml:space="preserve"> </w:t>
@@ -2061,24 +1759,19 @@
           <w:b/>
           <w:bCs/>
         </w:rPr>
-        <w:t xml:space="preserve">convergencia de condiciones normativas, organizacionales, técnicas y de legitimidad institucional que permitan implementar un modelo de retroalimentación 360° con sentido formativo y sin vulnerar derechos laborales adquiridos</w:t>
-      </w:r>
-      <w:r>
-        <w:t xml:space="preserve">.</w:t>
-      </w:r>
-    </w:p>
-    <w:p>
-      <w:pPr>
-        <w:pStyle w:val="BodyText"/>
-      </w:pPr>
-      <w:r>
-        <w:t xml:space="preserve">En términos prácticos, determinar si el modelo es factible en el Departamento de Administración Pública del CURZAS exige responder a cinco interrogantes centrales, correspondientes punto por punto con sus dimensiones analíticas:</w:t>
-      </w:r>
-      <w:r>
-        <w:t xml:space="preserve"> </w:t>
-      </w:r>
-      <w:r>
-        <w:t xml:space="preserve">1.</w:t>
+        <w:t xml:space="preserve">Factibilidad Técnica e Instrumental:</w:t>
+      </w:r>
+      <w:r>
+        <w:t xml:space="preserve"> </w:t>
+      </w:r>
+      <w:r>
+        <w:t xml:space="preserve">¿Existen plataformas informáticas (SIU-Guaraní, campus virtual) e instrumentos pedagógicamente válidos capaces de resguardar el anonimato?</w:t>
+      </w:r>
+      <w:r>
+        <w:t xml:space="preserve"> </w:t>
+      </w:r>
+      <w:r>
+        <w:t xml:space="preserve">3.</w:t>
       </w:r>
       <w:r>
         <w:t xml:space="preserve"> </w:t>
@@ -2088,19 +1781,19 @@
           <w:b/>
           <w:bCs/>
         </w:rPr>
-        <w:t xml:space="preserve">Factibilidad Normativa y Estatutaria:</w:t>
-      </w:r>
-      <w:r>
-        <w:t xml:space="preserve"> </w:t>
-      </w:r>
-      <w:r>
-        <w:t xml:space="preserve">¿Puede aplicarse con fines formativos sin colisionar con la estabilidad laboral regulada por el Estatuto UNCo (Ord. N° 0988/2025), la Carrera Docente (Ord. N° 0920/2019 y modificatorias) y el CCT Docente (Decreto N° 1246/2015)?</w:t>
-      </w:r>
-      <w:r>
-        <w:t xml:space="preserve"> </w:t>
-      </w:r>
-      <w:r>
-        <w:t xml:space="preserve">2.</w:t>
+        <w:t xml:space="preserve">Factibilidad Organizacional y Procedimental:</w:t>
+      </w:r>
+      <w:r>
+        <w:t xml:space="preserve"> </w:t>
+      </w:r>
+      <w:r>
+        <w:t xml:space="preserve">¿Cuenta el departamento con circuitos administrativos, roles institucionales y tiempos de gestión idóneos para procesar devoluciones oportunas?</w:t>
+      </w:r>
+      <w:r>
+        <w:t xml:space="preserve"> </w:t>
+      </w:r>
+      <w:r>
+        <w:t xml:space="preserve">4.</w:t>
       </w:r>
       <w:r>
         <w:t xml:space="preserve"> </w:t>
@@ -2110,19 +1803,19 @@
           <w:b/>
           <w:bCs/>
         </w:rPr>
-        <w:t xml:space="preserve">Factibilidad Técnica e Instrumental:</w:t>
-      </w:r>
-      <w:r>
-        <w:t xml:space="preserve"> </w:t>
-      </w:r>
-      <w:r>
-        <w:t xml:space="preserve">¿Existen plataformas informáticas (SIU-Guaraní, campus virtual) e instrumentos pedagógicamente válidos capaces de resguardar el anonimato?</w:t>
-      </w:r>
-      <w:r>
-        <w:t xml:space="preserve"> </w:t>
-      </w:r>
-      <w:r>
-        <w:t xml:space="preserve">3.</w:t>
+        <w:t xml:space="preserve">Factibilidad Cultural y Actitudinal:</w:t>
+      </w:r>
+      <w:r>
+        <w:t xml:space="preserve"> </w:t>
+      </w:r>
+      <w:r>
+        <w:t xml:space="preserve">¿Existe disposición favorable en los claustros involucrados (docentes y estudiantes) y en las autoridades departamentales para participar en una evaluación multiactoral, atenuando prevenciones frente al control jerárquico?</w:t>
+      </w:r>
+      <w:r>
+        <w:t xml:space="preserve"> </w:t>
+      </w:r>
+      <w:r>
+        <w:t xml:space="preserve">5.</w:t>
       </w:r>
       <w:r>
         <w:t xml:space="preserve"> </w:t>
@@ -2132,50 +1825,6 @@
           <w:b/>
           <w:bCs/>
         </w:rPr>
-        <w:t xml:space="preserve">Factibilidad Organizacional y Procedimental:</w:t>
-      </w:r>
-      <w:r>
-        <w:t xml:space="preserve"> </w:t>
-      </w:r>
-      <w:r>
-        <w:t xml:space="preserve">¿Cuenta el departamento con circuitos administrativos, roles institucionales y tiempos de gestión idóneos para procesar devoluciones oportunas?</w:t>
-      </w:r>
-      <w:r>
-        <w:t xml:space="preserve"> </w:t>
-      </w:r>
-      <w:r>
-        <w:t xml:space="preserve">4.</w:t>
-      </w:r>
-      <w:r>
-        <w:t xml:space="preserve"> </w:t>
-      </w:r>
-      <w:r>
-        <w:rPr>
-          <w:b/>
-          <w:bCs/>
-        </w:rPr>
-        <w:t xml:space="preserve">Factibilidad Cultural y Actitudinal:</w:t>
-      </w:r>
-      <w:r>
-        <w:t xml:space="preserve"> </w:t>
-      </w:r>
-      <w:r>
-        <w:t xml:space="preserve">¿Existe disposición favorable en los claustros involucrados (docentes y estudiantes) y en las autoridades departamentales para participar en una evaluación multiactoral, atenuando prevenciones frente al control jerárquico?</w:t>
-      </w:r>
-      <w:r>
-        <w:t xml:space="preserve"> </w:t>
-      </w:r>
-      <w:r>
-        <w:t xml:space="preserve">5.</w:t>
-      </w:r>
-      <w:r>
-        <w:t xml:space="preserve"> </w:t>
-      </w:r>
-      <w:r>
-        <w:rPr>
-          <w:b/>
-          <w:bCs/>
-        </w:rPr>
         <w:t xml:space="preserve">Factibilidad de Gobernanza y Política Institucional:</w:t>
       </w:r>
       <w:r>
@@ -2188,7 +1837,7 @@
         <w:t xml:space="preserve"> </w:t>
       </w:r>
       <w:r>
-        <w:t xml:space="preserve">(Longo, 2004; Matus, 1993)</w:t>
+        <w:t xml:space="preserve">(Longo, 2006; Matus, 1993)</w:t>
       </w:r>
       <w:r>
         <w:t xml:space="preserve">?</w:t>
@@ -2504,6 +2153,24 @@
         </w:tc>
       </w:tr>
     </w:tbl>
+    <w:p>
+      <w:pPr>
+        <w:pStyle w:val="BodyText"/>
+      </w:pPr>
+      <w:r>
+        <w:rPr>
+          <w:i/>
+          <w:iCs/>
+        </w:rPr>
+        <w:t xml:space="preserve">Nota.</w:t>
+      </w:r>
+      <w:r>
+        <w:t xml:space="preserve"> </w:t>
+      </w:r>
+      <w:r>
+        <w:t xml:space="preserve">Elaboración propia en base a las dimensiones de factibilidad analítica y el marco normativo de la Universidad Nacional del Comahue.</w:t>
+      </w:r>
+    </w:p>
     <w:bookmarkEnd w:id="22"/>
     <w:bookmarkStart w:id="23" w:name="X8f4da2a33d80423d494a47dd434126cfe1b5efc"/>
     <w:p>
@@ -2640,7 +2307,7 @@
           <w:b/>
           <w:bCs/>
         </w:rPr>
-        <w:t xml:space="preserve">¿De qué manera se estructuran los mecanismos de evaluación del desempeño docente y qué factibilidad presenta la implementación de un modelo de retroalimentación 360° en el Departamento de Administración Pública del CURZAS-UNCo (2025–2026)?</w:t>
+        <w:t xml:space="preserve">¿Cuáles son las condiciones de factibilidad organizacional, técnica, normativa y de gobernanza para la implementación de un modelo de retroalimentación de 360 grados en la evaluación del desempeño docente en el Departamento de Administración Pública del CURZAS-UNCo (2025–2026)?</w:t>
       </w:r>
     </w:p>
     <w:bookmarkEnd w:id="25"/>
@@ -2707,13 +2374,13 @@
         <w:pStyle w:val="BodyText"/>
       </w:pPr>
       <w:r>
-        <w:t xml:space="preserve">Asimismo, la investigación operacionaliza el Subsistema de Gestión del Rendimiento de</w:t>
-      </w:r>
-      <w:r>
-        <w:t xml:space="preserve"> </w:t>
-      </w:r>
-      <w:r>
-        <w:t xml:space="preserve">Longo (2004)</w:t>
+        <w:t xml:space="preserve">Asimismo, la investigación operacionaliza el subsistema de gestión del rendimiento de</w:t>
+      </w:r>
+      <w:r>
+        <w:t xml:space="preserve"> </w:t>
+      </w:r>
+      <w:r>
+        <w:t xml:space="preserve">Longo (2006)</w:t>
       </w:r>
       <w:r>
         <w:t xml:space="preserve"> </w:t>
@@ -2765,8 +2432,8 @@
       </w:pPr>
       <w:r>
         <w:rPr>
-          <w:b/>
-          <w:bCs/>
+          <w:i/>
+          <w:iCs/>
         </w:rPr>
         <w:t xml:space="preserve">Cuerpo docente:</w:t>
       </w:r>
@@ -2787,8 +2454,8 @@
       </w:pPr>
       <w:r>
         <w:rPr>
-          <w:b/>
-          <w:bCs/>
+          <w:i/>
+          <w:iCs/>
         </w:rPr>
         <w:t xml:space="preserve">Claustro estudiantil:</w:t>
       </w:r>
@@ -2809,8 +2476,8 @@
       </w:pPr>
       <w:r>
         <w:rPr>
-          <w:b/>
-          <w:bCs/>
+          <w:i/>
+          <w:iCs/>
         </w:rPr>
         <w:t xml:space="preserve">Autoridades departamentales:</w:t>
       </w:r>
@@ -2862,14 +2529,6 @@
           <w:sz w:val="28"/>
         </w:rPr>
         <w:t xml:space="preserve">4. Definición de Objetivos del TFG</w:t>
-      </w:r>
-    </w:p>
-    <w:p>
-      <w:pPr>
-        <w:pStyle w:val="FirstParagraph"/>
-      </w:pPr>
-      <w:r>
-        <w:t xml:space="preserve">En este apartado se formulan las metas analíticas del proyecto en congruencia directa con la pregunta general de investigación y las dimensiones metodológicas planteadas:</w:t>
       </w:r>
     </w:p>
     <w:bookmarkStart w:id="31" w:name="objetivo-general"/>
@@ -2897,17 +2556,7 @@
         </w:numPr>
       </w:pPr>
       <w:r>
-        <w:rPr>
-          <w:b/>
-          <w:bCs/>
-        </w:rPr>
-        <w:t xml:space="preserve">Analizar</w:t>
-      </w:r>
-      <w:r>
-        <w:t xml:space="preserve"> </w:t>
-      </w:r>
-      <w:r>
-        <w:t xml:space="preserve">los mecanismos de estructuración de la evaluación del desempeño docente y determinar las condiciones de factibilidad organizacional, técnica, normativa y de gobernanza para la eventual implementación de un modelo de retroalimentación multiactoral (360°) en el Departamento de Administración Pública del CURZAS-UNCo (2025–2026).</w:t>
+        <w:t xml:space="preserve">Determinar las condiciones de factibilidad organizacional, técnica, normativa y de gobernanza para la implementación de un modelo de retroalimentación multiactoral (360°) en la evaluación del desempeño docente en el Departamento de Administración Pública del CURZAS-UNCo (2025–2026).</w:t>
       </w:r>
     </w:p>
     <w:bookmarkEnd w:id="31"/>
@@ -2936,17 +2585,7 @@
         </w:numPr>
       </w:pPr>
       <w:r>
-        <w:rPr>
-          <w:b/>
-          <w:bCs/>
-        </w:rPr>
-        <w:t xml:space="preserve">Relevar y caracterizar</w:t>
-      </w:r>
-      <w:r>
-        <w:t xml:space="preserve"> </w:t>
-      </w:r>
-      <w:r>
-        <w:t xml:space="preserve">los instrumentos normativos, procedimientos y prácticas vigentes aplicadas a la evaluación del desempeño docente en el Departamento de Administración Pública del CURZAS-UNCo, distinguiendo las prescripciones estatutarias de su implementación efectiva.</w:t>
+        <w:t xml:space="preserve">Relevar y caracterizar los instrumentos normativos, procedimientos y prácticas vigentes aplicadas a la evaluación del desempeño docente en el Departamento de Administración Pública del CURZAS-UNCo, distinguiendo las prescripciones estatutarias de su implementación efectiva.</w:t>
       </w:r>
     </w:p>
     <w:p>
@@ -2958,17 +2597,7 @@
         </w:numPr>
       </w:pPr>
       <w:r>
-        <w:rPr>
-          <w:b/>
-          <w:bCs/>
-        </w:rPr>
-        <w:t xml:space="preserve">Explorar las percepciones, disposiciones y expectativas</w:t>
-      </w:r>
-      <w:r>
-        <w:t xml:space="preserve"> </w:t>
-      </w:r>
-      <w:r>
-        <w:t xml:space="preserve">de los distintos claustros involucrados (docentes y estudiantes) y de las autoridades departamentales respecto a la retroalimentación multiactoral (360°) y las condiciones de confianza institucional requeridas.</w:t>
+        <w:t xml:space="preserve">Explorar las percepciones, disposiciones y expectativas de los distintos claustros involucrados (docentes y estudiantes) y de las autoridades departamentales respecto a la retroalimentación multiactoral (360°) y las condiciones de confianza institucional requeridas.</w:t>
       </w:r>
     </w:p>
     <w:p>
@@ -2980,17 +2609,7 @@
         </w:numPr>
       </w:pPr>
       <w:r>
-        <w:rPr>
-          <w:b/>
-          <w:bCs/>
-        </w:rPr>
-        <w:t xml:space="preserve">Identificar los condicionantes técnico-organizacionales, normativos y de gobernanza</w:t>
-      </w:r>
-      <w:r>
-        <w:t xml:space="preserve"> </w:t>
-      </w:r>
-      <w:r>
-        <w:t xml:space="preserve">(acuerdos paritarios, normativa vigente de carrera docente y evaluación, confidencialidad y cogobierno) que inciden en la factibilidad del modelo.</w:t>
+        <w:t xml:space="preserve">Identificar los condicionantes técnico-organizacionales, normativos y de gobernanza (acuerdos paritarios, normativa vigente de carrera docente y evaluación, confidencialidad y cogobierno) que inciden en la factibilidad del modelo.</w:t>
       </w:r>
     </w:p>
     <w:p>
@@ -3002,21 +2621,11 @@
         </w:numPr>
       </w:pPr>
       <w:r>
-        <w:rPr>
-          <w:b/>
-          <w:bCs/>
-        </w:rPr>
-        <w:t xml:space="preserve">Proponer lineamientos orientativos</w:t>
-      </w:r>
-      <w:r>
-        <w:t xml:space="preserve"> </w:t>
-      </w:r>
-      <w:r>
-        <w:t xml:space="preserve">para una eventual implementación de un modelo de retroalimentación multiactoral (360°), en función de las condiciones y límites de factibilidad identificados en la investigación empírica.</w:t>
+        <w:t xml:space="preserve">Proponer lineamientos orientativos para una eventual implementación de un modelo de retroalimentación multiactoral (360°), en función de las condiciones y límites de factibilidad identificados en la investigación empírica.</w:t>
       </w:r>
     </w:p>
     <w:bookmarkEnd w:id="32"/>
-    <w:bookmarkStart w:id="33" w:name="X3e337276daa19207d7cf7464738fde0007e6794"/>
+    <w:bookmarkStart w:id="33" w:name="X296c76344d338238a09b1d3109b3b1ec06ec08f"/>
     <w:p>
       <w:pPr>
         <w:pStyle w:val="Heading2"/>
@@ -3029,7 +2638,7 @@
           <w:b/>
           <w:sz w:val="24"/>
         </w:rPr>
-        <w:t xml:space="preserve">4.3 Matriz de Consistencia Metodológica y Articulación con Longo (2004)</w:t>
+        <w:t xml:space="preserve">4.3 Matriz de Consistencia Metodológica y Articulación con Longo (2006)</w:t>
       </w:r>
     </w:p>
     <w:p>
@@ -3037,13 +2646,13 @@
         <w:pStyle w:val="FirstParagraph"/>
       </w:pPr>
       <w:r>
-        <w:t xml:space="preserve">Para dotar de consistencia analítica a la investigación, cada subsistema del modelo de</w:t>
-      </w:r>
-      <w:r>
-        <w:t xml:space="preserve"> </w:t>
-      </w:r>
-      <w:r>
-        <w:t xml:space="preserve">Longo (2004)</w:t>
+        <w:t xml:space="preserve">Con el propósito de asegurar la consistencia analítica de la investigación, cada subsistema del modelo propuesto por Longo</w:t>
+      </w:r>
+      <w:r>
+        <w:t xml:space="preserve"> </w:t>
+      </w:r>
+      <w:r>
+        <w:t xml:space="preserve">(2006)</w:t>
       </w:r>
       <w:r>
         <w:t xml:space="preserve"> </w:t>
@@ -3217,7 +2826,7 @@
               <w:jc w:val="left"/>
             </w:pPr>
             <w:r>
-              <w:t xml:space="preserve">Subsistema de RR.HH. (Longo, 2004)</w:t>
+              <w:t xml:space="preserve">Subsistema de RR.HH. (Longo, 2006)</w:t>
             </w:r>
           </w:p>
         </w:tc>
@@ -3273,7 +2882,7 @@
               <w:t xml:space="preserve"> </w:t>
             </w:r>
             <w:r>
-              <w:t xml:space="preserve">Análisis multidimensional de mecanismos actuales y viabilidad de retroalimentación 360°</w:t>
+              <w:t xml:space="preserve">Determinación de condiciones de factibilidad organizacional, técnica, normativa y de gobernanza para la retroalimentación 360°</w:t>
             </w:r>
           </w:p>
         </w:tc>
@@ -3660,6 +3269,24 @@
       </w:tr>
     </w:tbl>
     <w:p>
+      <w:pPr>
+        <w:pStyle w:val="BodyText"/>
+      </w:pPr>
+      <w:r>
+        <w:rPr>
+          <w:i/>
+          <w:iCs/>
+        </w:rPr>
+        <w:t xml:space="preserve">Nota.</w:t>
+      </w:r>
+      <w:r>
+        <w:t xml:space="preserve"> </w:t>
+      </w:r>
+      <w:r>
+        <w:t xml:space="preserve">Elaboración propia a partir del marco conceptual de Longo (2006) y la normativa institucional del CURZAS-UNCo.</w:t>
+      </w:r>
+    </w:p>
+    <w:p>
       <w:r>
         <w:br w:type="page"/>
       </w:r>
@@ -3713,7 +3340,7 @@
       </w:r>
     </w:p>
     <w:bookmarkEnd w:id="35"/>
-    <w:bookmarkStart w:id="36" w:name="ref-pen2015"/>
+    <w:bookmarkStart w:id="36" w:name="ref-uncocurzas2023"/>
     <w:p>
       <w:pPr>
         <w:pStyle w:val="Bibliography"/>
@@ -3722,11 +3349,24 @@
         <w:jc w:val="left"/>
       </w:pPr>
       <w:r>
-        <w:t xml:space="preserve">Decreto N° 1246/2015. Convenio Colectivo de Trabajo para los Docentes de las Instituciones Universitarias Nacionales (2015).</w:t>
+        <w:t xml:space="preserve">Consejo Directivo del CURZAS. (2023).</w:t>
+      </w:r>
+      <w:r>
+        <w:t xml:space="preserve"> </w:t>
+      </w:r>
+      <w:r>
+        <w:rPr>
+          <w:i/>
+          <w:iCs/>
+        </w:rPr>
+        <w:t xml:space="preserve">Resolución CD-CURZAS N° 266/23: Reglamento de Trabajo Final de Graduación (TFG) para las carreras del Departamento de Administración Pública</w:t>
+      </w:r>
+      <w:r>
+        <w:t xml:space="preserve">. Universidad Nacional del Comahue.</w:t>
       </w:r>
     </w:p>
     <w:bookmarkEnd w:id="36"/>
-    <w:bookmarkStart w:id="37" w:name="ref-ministerio1995"/>
+    <w:bookmarkStart w:id="37" w:name="ref-pen2015"/>
     <w:p>
       <w:pPr>
         <w:pStyle w:val="Bibliography"/>
@@ -3735,11 +3375,11 @@
         <w:jc w:val="left"/>
       </w:pPr>
       <w:r>
-        <w:t xml:space="preserve">Ley N° 24.521 de Educación Superior (1995).</w:t>
+        <w:t xml:space="preserve">Decreto N° 1246/2015. Convenio Colectivo de Trabajo para los Docentes de las Instituciones Universitarias Nacionales (2015).</w:t>
       </w:r>
     </w:p>
     <w:bookmarkEnd w:id="37"/>
-    <w:bookmarkStart w:id="38" w:name="ref-longo2004"/>
+    <w:bookmarkStart w:id="38" w:name="ref-ministerio1995"/>
     <w:p>
       <w:pPr>
         <w:pStyle w:val="Bibliography"/>
@@ -3748,24 +3388,11 @@
         <w:jc w:val="left"/>
       </w:pPr>
       <w:r>
-        <w:t xml:space="preserve">Longo, F. (2004).</w:t>
-      </w:r>
-      <w:r>
-        <w:t xml:space="preserve"> </w:t>
-      </w:r>
-      <w:r>
-        <w:rPr>
-          <w:i/>
-          <w:iCs/>
-        </w:rPr>
-        <w:t xml:space="preserve">Mérito y flexibilidad: La gestión de las personas en las organizaciones del sector público</w:t>
-      </w:r>
-      <w:r>
-        <w:t xml:space="preserve">. Paidós.</w:t>
+        <w:t xml:space="preserve">Ley N° 24.521 de Educación Superior (1995).</w:t>
       </w:r>
     </w:p>
     <w:bookmarkEnd w:id="38"/>
-    <w:bookmarkStart w:id="39" w:name="ref-matus1993"/>
+    <w:bookmarkStart w:id="39" w:name="ref-longo2006"/>
     <w:p>
       <w:pPr>
         <w:pStyle w:val="Bibliography"/>
@@ -3774,7 +3401,7 @@
         <w:jc w:val="left"/>
       </w:pPr>
       <w:r>
-        <w:t xml:space="preserve">Matus, C. (1993).</w:t>
+        <w:t xml:space="preserve">Longo, F. (2006).</w:t>
       </w:r>
       <w:r>
         <w:t xml:space="preserve"> </w:t>
@@ -3784,14 +3411,14 @@
           <w:i/>
           <w:iCs/>
         </w:rPr>
-        <w:t xml:space="preserve">Política, planificación y gobierno</w:t>
-      </w:r>
-      <w:r>
-        <w:t xml:space="preserve">. Fundación ALTIDIR.</w:t>
+        <w:t xml:space="preserve">Mérito y flexibilidad: La gestión de las personas en las organizaciones del sector público</w:t>
+      </w:r>
+      <w:r>
+        <w:t xml:space="preserve">. Paidós.</w:t>
       </w:r>
     </w:p>
     <w:bookmarkEnd w:id="39"/>
-    <w:bookmarkStart w:id="41" w:name="ref-obando2014"/>
+    <w:bookmarkStart w:id="40" w:name="ref-matus1993"/>
     <w:p>
       <w:pPr>
         <w:pStyle w:val="Bibliography"/>
@@ -3800,7 +3427,7 @@
         <w:jc w:val="left"/>
       </w:pPr>
       <w:r>
-        <w:t xml:space="preserve">Obando Freire, F., López Fernández, R., Luna Álvarez, D., Luna Álvarez, E., Luna Álvarez, W., &amp; Alpizar Fernández, R. (2014). Sistema de evaluación docente mediante el modelo 360 grados y el portafolio electrónico.</w:t>
+        <w:t xml:space="preserve">Matus, C. (1993).</w:t>
       </w:r>
       <w:r>
         <w:t xml:space="preserve"> </w:t>
@@ -3810,10 +3437,23 @@
           <w:i/>
           <w:iCs/>
         </w:rPr>
-        <w:t xml:space="preserve">Medisur</w:t>
-      </w:r>
-      <w:r>
-        <w:t xml:space="preserve">,</w:t>
+        <w:t xml:space="preserve">Política, planificación y gobierno</w:t>
+      </w:r>
+      <w:r>
+        <w:t xml:space="preserve">. Fundación ALTIDIR.</w:t>
+      </w:r>
+    </w:p>
+    <w:bookmarkEnd w:id="40"/>
+    <w:bookmarkStart w:id="42" w:name="ref-obando2014"/>
+    <w:p>
+      <w:pPr>
+        <w:pStyle w:val="Bibliography"/>
+        <w:spacing w:after="120"/>
+        <w:ind w:left="720" w:hanging="720"/>
+        <w:jc w:val="left"/>
+      </w:pPr>
+      <w:r>
+        <w:t xml:space="preserve">Obando Freire, F., López Fernández, R., Luna Álvarez, D., Luna Álvarez, E., Luna Álvarez, W., &amp; Alpizar Fernández, R. (2014). Sistema de evaluación docente mediante el modelo 360 grados y el portafolio electrónico.</w:t>
       </w:r>
       <w:r>
         <w:t xml:space="preserve"> </w:t>
@@ -3823,6 +3463,19 @@
           <w:i/>
           <w:iCs/>
         </w:rPr>
+        <w:t xml:space="preserve">Medisur</w:t>
+      </w:r>
+      <w:r>
+        <w:t xml:space="preserve">,</w:t>
+      </w:r>
+      <w:r>
+        <w:t xml:space="preserve"> </w:t>
+      </w:r>
+      <w:r>
+        <w:rPr>
+          <w:i/>
+          <w:iCs/>
+        </w:rPr>
         <w:t xml:space="preserve">12</w:t>
       </w:r>
       <w:r>
@@ -3831,7 +3484,7 @@
       <w:r>
         <w:t xml:space="preserve"> </w:t>
       </w:r>
-      <w:hyperlink r:id="rId40">
+      <w:hyperlink r:id="rId41">
         <w:r>
           <w:rPr>
             <w:rStyle w:val="Hyperlink"/>
@@ -3840,8 +3493,8 @@
         </w:r>
       </w:hyperlink>
     </w:p>
-    <w:bookmarkEnd w:id="41"/>
-    <w:bookmarkStart w:id="42" w:name="ref-oszlak2020"/>
+    <w:bookmarkEnd w:id="42"/>
+    <w:bookmarkStart w:id="43" w:name="ref-oszlak2020"/>
     <w:p>
       <w:pPr>
         <w:pStyle w:val="Bibliography"/>
@@ -3866,8 +3519,8 @@
         <w:t xml:space="preserve">. Instituto Nacional de la Administración Pública.</w:t>
       </w:r>
     </w:p>
-    <w:bookmarkEnd w:id="42"/>
-    <w:bookmarkStart w:id="43" w:name="ref-sautu2005"/>
+    <w:bookmarkEnd w:id="43"/>
+    <w:bookmarkStart w:id="44" w:name="ref-sautu2005"/>
     <w:p>
       <w:pPr>
         <w:pStyle w:val="Bibliography"/>
@@ -3892,8 +3545,8 @@
         <w:t xml:space="preserve">. Lumiere.</w:t>
       </w:r>
     </w:p>
-    <w:bookmarkEnd w:id="43"/>
-    <w:bookmarkStart w:id="45" w:name="ref-sifuentes2016"/>
+    <w:bookmarkEnd w:id="44"/>
+    <w:bookmarkStart w:id="46" w:name="ref-sifuentes2016"/>
     <w:p>
       <w:pPr>
         <w:pStyle w:val="Bibliography"/>
@@ -3933,7 +3586,7 @@
       <w:r>
         <w:t xml:space="preserve"> </w:t>
       </w:r>
-      <w:hyperlink r:id="rId44">
+      <w:hyperlink r:id="rId45">
         <w:r>
           <w:rPr>
             <w:rStyle w:val="Hyperlink"/>
@@ -3942,8 +3595,8 @@
         </w:r>
       </w:hyperlink>
     </w:p>
-    <w:bookmarkEnd w:id="45"/>
-    <w:bookmarkStart w:id="46" w:name="ref-unco2019"/>
+    <w:bookmarkEnd w:id="46"/>
+    <w:bookmarkStart w:id="47" w:name="ref-unco2019"/>
     <w:p>
       <w:pPr>
         <w:pStyle w:val="Bibliography"/>
@@ -3968,8 +3621,8 @@
         <w:t xml:space="preserve">.</w:t>
       </w:r>
     </w:p>
-    <w:bookmarkEnd w:id="46"/>
-    <w:bookmarkStart w:id="47" w:name="ref-unco2025"/>
+    <w:bookmarkEnd w:id="47"/>
+    <w:bookmarkStart w:id="48" w:name="ref-unco2025"/>
     <w:p>
       <w:pPr>
         <w:pStyle w:val="Bibliography"/>
@@ -3989,32 +3642,6 @@
           <w:iCs/>
         </w:rPr>
         <w:t xml:space="preserve">Ordenanza N° 0988/2025: Texto ordenado del Estatuto de la Universidad Nacional del Comahue</w:t>
-      </w:r>
-      <w:r>
-        <w:t xml:space="preserve">.</w:t>
-      </w:r>
-    </w:p>
-    <w:bookmarkEnd w:id="47"/>
-    <w:bookmarkStart w:id="48" w:name="ref-uncocurzas2023"/>
-    <w:p>
-      <w:pPr>
-        <w:pStyle w:val="Bibliography"/>
-        <w:spacing w:after="120"/>
-        <w:ind w:left="720" w:hanging="720"/>
-        <w:jc w:val="left"/>
-      </w:pPr>
-      <w:r>
-        <w:t xml:space="preserve">Universidad Nacional del Comahue - CURZAS. (2023).</w:t>
-      </w:r>
-      <w:r>
-        <w:t xml:space="preserve"> </w:t>
-      </w:r>
-      <w:r>
-        <w:rPr>
-          <w:i/>
-          <w:iCs/>
-        </w:rPr>
-        <w:t xml:space="preserve">Resolución CD-CURZAS N° 266/2023: Reglamento de Trabajo Final de Graduación (TFG) para las carreras del Departamento de Administración Pública</w:t>
       </w:r>
       <w:r>
         <w:t xml:space="preserve">.</w:t>

</xml_diff>